<commit_message>
Canada socioeconomics + regional market access; local/regional coverage bonus; CA proximity geocoder; Ontario backfill
</commit_message>
<xml_diff>
--- a/FastLocations_Technical_and_Scoring_Guide.docx
+++ b/FastLocations_Technical_and_Scoring_Guide.docx
@@ -12,7 +12,7 @@
           <wp:inline distT="0" distB="0" distL="0" distR="0">
             <wp:extent cx="4953000" cy="714375"/>
             <wp:effectExtent t="0" r="0" b="0" l="0"/>
-            <wp:docPr id="1" name="logo" descr="FastLocations logo" title="FastLocations.ai"/>
+            <wp:docPr id="1" name="logo" descr="logo" title="FastLocations.ai"/>
             <wp:cNvGraphicFramePr>
               <a:graphicFrameLocks xmlns:a="http://schemas.openxmlformats.org/drawingml/2006/main" noChangeAspect="1"/>
             </wp:cNvGraphicFramePr>
@@ -114,7 +114,7 @@
         <w:t xml:space="preserve">Scope: </w:t>
       </w:r>
       <w:r>
-        <w:t xml:space="preserve">How to manage and update the page and data, and how the deterministic scoring engine works.</w:t>
+        <w:t xml:space="preserve">How to manage and update the page and data, and how the deterministic scoring engine produces the FastLocations Score.</w:t>
       </w:r>
     </w:p>
     <w:p>
@@ -125,13 +125,13 @@
         <w:rPr>
           <w:color w:val="6B7787"/>
         </w:rPr>
-        <w:t xml:space="preserve">Version 1.0  </w:t>
+        <w:t xml:space="preserve">Version 1.1  </w:t>
       </w:r>
       <w:r>
         <w:rPr>
           <w:color w:val="6B7787"/>
         </w:rPr>
-        <w:t xml:space="preserve">· Generated 2026-06-29</w:t>
+        <w:t xml:space="preserve">· Generated 2026-06-30</w:t>
       </w:r>
     </w:p>
     <w:p>
@@ -153,7 +153,7 @@
         <w:spacing w:after="120" w:line="276"/>
       </w:pPr>
       <w:r>
-        <w:t xml:space="preserve">FastLocations turns a site consultant's project requirements into a ranked shortlist of locations, each paired with the economic-development organization (EDO) customer that serves it. A consultant fills out an intake form; the system compares those requirements against demographic, workforce, infrastructure, real-estate, cost, safety, and incentive data; and returns the strongest matches with a written rationale and an optional emailed summary.</w:t>
+        <w:t xml:space="preserve">FastLocations turns a site consultant's project requirements into a ranked shortlist of locations, each paired with the economic-development organization (EDO) that serves it. A consultant fills out an intake form; the engine compares those requirements against ten weighted data dimensions and returns the strongest matches, each with a FastLocations Score, a written rationale, a locator map, and an optional emailed summary.</w:t>
       </w:r>
     </w:p>
     <w:p>
@@ -168,7 +168,7 @@
         <w:t xml:space="preserve">Core principle: </w:t>
       </w:r>
       <w:r>
-        <w:t xml:space="preserve">scoring is deterministic. Facts come from data, never from a model. AI is used only to phrase the rationale after ranking is complete. Where data is missing for a candidate, that dimension scores </w:t>
+        <w:t xml:space="preserve">scoring is deterministic. Facts come from data, never from a model. AI is used only to phrase the rationale after ranking. Where data is missing for a candidate, that dimension scores </w:t>
       </w:r>
       <w:r>
         <w:rPr>
@@ -242,7 +242,7 @@
         <w:t xml:space="preserve">scorer.py</w:t>
       </w:r>
       <w:r>
-        <w:t xml:space="preserve">  →  ranked results + serving EDO + rationale, returned to the page and emailed.</w:t>
+        <w:t xml:space="preserve">  →  ranked results + FastLocations Score + serving EDO + rationale, returned to the page (with a Leaflet map) and emailed on submit.</w:t>
       </w:r>
     </w:p>
     <w:tbl>
@@ -410,7 +410,7 @@
                 <w:sz w:val="19"/>
                 <w:szCs w:val="19"/>
               </w:rPr>
-              <w:t xml:space="preserve">HTML + CSS + JavaScript</w:t>
+              <w:t xml:space="preserve">HTML + external JS (intake.js) + Leaflet map</w:t>
             </w:r>
           </w:p>
         </w:tc>
@@ -438,7 +438,7 @@
                 <w:sz w:val="19"/>
                 <w:szCs w:val="19"/>
               </w:rPr>
-              <w:t xml:space="preserve">fastlocations.ai web server (site_selection_intake.html + intake.js)</w:t>
+              <w:t xml:space="preserve">fastlocations.ai web server</w:t>
             </w:r>
           </w:p>
         </w:tc>
@@ -582,7 +582,7 @@
                 <w:sz w:val="19"/>
                 <w:szCs w:val="19"/>
               </w:rPr>
-              <w:t xml:space="preserve">scorer.py (deterministic)</w:t>
+              <w:t xml:space="preserve">scorer.py (deterministic, 10 dimensions)</w:t>
             </w:r>
           </w:p>
         </w:tc>
@@ -610,7 +610,7 @@
                 <w:sz w:val="19"/>
                 <w:szCs w:val="19"/>
               </w:rPr>
-              <w:t xml:space="preserve">Loads precomputed JSON data files at startup</w:t>
+              <w:t xml:space="preserve">Loads precomputed JSON at startup</w:t>
             </w:r>
           </w:p>
         </w:tc>
@@ -668,7 +668,7 @@
                 <w:sz w:val="19"/>
                 <w:szCs w:val="19"/>
               </w:rPr>
-              <w:t xml:space="preserve">Precomputed JSON (counties, EDOs, incentives, places)</w:t>
+              <w:t xml:space="preserve">Precomputed JSON (counties, EDOs, incentives, places, grades)</w:t>
             </w:r>
           </w:p>
         </w:tc>
@@ -782,7 +782,7 @@
                 <w:sz w:val="19"/>
                 <w:szCs w:val="19"/>
               </w:rPr>
-              <w:t xml:space="preserve">Triggered by the API after scoring</w:t>
+              <w:t xml:space="preserve">Triggered on Submit-to-FastLocations</w:t>
             </w:r>
           </w:p>
         </w:tc>
@@ -808,7 +808,7 @@
         <w:spacing w:after="100" w:before="220"/>
       </w:pPr>
       <w:r>
-        <w:t xml:space="preserve">2.1 Hosting &amp; Infrastructure</w:t>
+        <w:t xml:space="preserve">2.1 Hosting</w:t>
       </w:r>
     </w:p>
     <w:p>
@@ -828,7 +828,7 @@
         <w:t xml:space="preserve">Form (frontend): </w:t>
       </w:r>
       <w:r>
-        <w:t xml:space="preserve">hosted on the fastlocations.ai web server. Two files, uploaded together: </w:t>
+        <w:t xml:space="preserve">hosted on fastlocations.ai. Two files uploaded together: </w:t>
       </w:r>
       <w:r>
         <w:rPr>
@@ -852,7 +852,7 @@
         <w:t xml:space="preserve">intake.js</w:t>
       </w:r>
       <w:r>
-        <w:t xml:space="preserve">.</w:t>
+        <w:t xml:space="preserve">. Leaflet loads from its CDN.</w:t>
       </w:r>
     </w:p>
     <w:p>
@@ -872,7 +872,7 @@
         <w:t xml:space="preserve">API (backend): </w:t>
       </w:r>
       <w:r>
-        <w:t xml:space="preserve">hosted on Railway as a Python web service started with </w:t>
+        <w:t xml:space="preserve">Railway, started with </w:t>
       </w:r>
       <w:r>
         <w:rPr>
@@ -884,51 +884,7 @@
         <w:t xml:space="preserve">gunicorn app:app</w:t>
       </w:r>
       <w:r>
-        <w:t xml:space="preserve">. It serves the form at </w:t>
-      </w:r>
-      <w:r>
-        <w:rPr>
-          <w:rFonts w:ascii="Consolas" w:cs="Consolas" w:eastAsia="Consolas" w:hAnsi="Consolas"/>
-          <w:color w:val="39455A"/>
-          <w:sz w:val="19"/>
-          <w:szCs w:val="19"/>
-        </w:rPr>
-        <w:t xml:space="preserve">/</w:t>
-      </w:r>
-      <w:r>
-        <w:t xml:space="preserve"> and scores at </w:t>
-      </w:r>
-      <w:r>
-        <w:rPr>
-          <w:rFonts w:ascii="Consolas" w:cs="Consolas" w:eastAsia="Consolas" w:hAnsi="Consolas"/>
-          <w:color w:val="39455A"/>
-          <w:sz w:val="19"/>
-          <w:szCs w:val="19"/>
-        </w:rPr>
-        <w:t xml:space="preserve">/match</w:t>
-      </w:r>
-      <w:r>
-        <w:t xml:space="preserve">.</w:t>
-      </w:r>
-    </w:p>
-    <w:p>
-      <w:pPr>
-        <w:pStyle w:val="ListParagraph"/>
-        <w:numPr>
-          <w:ilvl w:val="0"/>
-          <w:numId w:val="2"/>
-        </w:numPr>
-        <w:spacing w:after="60"/>
-      </w:pPr>
-      <w:r>
-        <w:rPr>
-          <w:b/>
-          <w:bCs/>
-        </w:rPr>
-        <w:t xml:space="preserve">Source of truth: </w:t>
-      </w:r>
-      <w:r>
-        <w:t xml:space="preserve">a GitHub repository (</w:t>
+        <w:t xml:space="preserve">. Auto-redeploys from the </w:t>
       </w:r>
       <w:r>
         <w:rPr>
@@ -940,7 +896,7 @@
         <w:t xml:space="preserve">fastlocations-scoring-api</w:t>
       </w:r>
       <w:r>
-        <w:t xml:space="preserve">). Railway watches it and redeploys automatically on every push.</w:t>
+        <w:t xml:space="preserve"> GitHub repo on every push.</w:t>
       </w:r>
     </w:p>
     <w:p>
@@ -965,8 +921,8 @@
         </w:tblBorders>
       </w:tblPr>
       <w:tblGrid>
-        <w:gridCol w:w="2600"/>
-        <w:gridCol w:w="4360"/>
+        <w:gridCol w:w="2700"/>
+        <w:gridCol w:w="4260"/>
         <w:gridCol w:w="2400"/>
       </w:tblGrid>
       <w:tr>
@@ -975,7 +931,7 @@
         </w:trPr>
         <w:tc>
           <w:tcPr>
-            <w:tcW w:type="dxa" w:w="2600"/>
+            <w:tcW w:type="dxa" w:w="2700"/>
             <w:tcBorders>
               <w:top w:val="single" w:color="D5DCE6" w:sz="1"/>
               <w:left w:val="single" w:color="D5DCE6" w:sz="1"/>
@@ -1005,7 +961,7 @@
         </w:tc>
         <w:tc>
           <w:tcPr>
-            <w:tcW w:type="dxa" w:w="4360"/>
+            <w:tcW w:type="dxa" w:w="4260"/>
             <w:tcBorders>
               <w:top w:val="single" w:color="D5DCE6" w:sz="1"/>
               <w:left w:val="single" w:color="D5DCE6" w:sz="1"/>
@@ -1067,7 +1023,7 @@
       <w:tr>
         <w:tc>
           <w:tcPr>
-            <w:tcW w:type="dxa" w:w="2600"/>
+            <w:tcW w:type="dxa" w:w="2700"/>
             <w:tcBorders>
               <w:top w:val="single" w:color="D5DCE6" w:sz="1"/>
               <w:left w:val="single" w:color="D5DCE6" w:sz="1"/>
@@ -1095,29 +1051,29 @@
         </w:tc>
         <w:tc>
           <w:tcPr>
-            <w:tcW w:type="dxa" w:w="4360"/>
-            <w:tcBorders>
-              <w:top w:val="single" w:color="D5DCE6" w:sz="1"/>
-              <w:left w:val="single" w:color="D5DCE6" w:sz="1"/>
-              <w:bottom w:val="single" w:color="D5DCE6" w:sz="1"/>
-              <w:right w:val="single" w:color="D5DCE6" w:sz="1"/>
-            </w:tcBorders>
-            <w:shd w:fill="FFFFFF" w:val="clear"/>
-            <w:tcMar>
-              <w:top w:type="dxa" w:w="50"/>
-              <w:left w:type="dxa" w:w="110"/>
-              <w:bottom w:type="dxa" w:w="50"/>
-              <w:right w:type="dxa" w:w="110"/>
-            </w:tcMar>
-            <w:vAlign w:val="center"/>
-          </w:tcPr>
-          <w:p>
-            <w:r>
-              <w:rPr>
-                <w:sz w:val="19"/>
-                <w:szCs w:val="19"/>
-              </w:rPr>
-              <w:t xml:space="preserve">The intake form (markup + styling). Loads intake.js.</w:t>
+            <w:tcW w:type="dxa" w:w="4260"/>
+            <w:tcBorders>
+              <w:top w:val="single" w:color="D5DCE6" w:sz="1"/>
+              <w:left w:val="single" w:color="D5DCE6" w:sz="1"/>
+              <w:bottom w:val="single" w:color="D5DCE6" w:sz="1"/>
+              <w:right w:val="single" w:color="D5DCE6" w:sz="1"/>
+            </w:tcBorders>
+            <w:shd w:fill="FFFFFF" w:val="clear"/>
+            <w:tcMar>
+              <w:top w:type="dxa" w:w="50"/>
+              <w:left w:type="dxa" w:w="110"/>
+              <w:bottom w:type="dxa" w:w="50"/>
+              <w:right w:type="dxa" w:w="110"/>
+            </w:tcMar>
+            <w:vAlign w:val="center"/>
+          </w:tcPr>
+          <w:p>
+            <w:r>
+              <w:rPr>
+                <w:sz w:val="19"/>
+                <w:szCs w:val="19"/>
+              </w:rPr>
+              <w:t xml:space="preserve">Intake form markup + styling; loads intake.js + Leaflet.</w:t>
             </w:r>
           </w:p>
         </w:tc>
@@ -1145,7 +1101,7 @@
                 <w:sz w:val="19"/>
                 <w:szCs w:val="19"/>
               </w:rPr>
-              <w:t xml:space="preserve">Form fields, labels, branding change</w:t>
+              <w:t xml:space="preserve">Form fields / branding change</w:t>
             </w:r>
           </w:p>
         </w:tc>
@@ -1153,7 +1109,7 @@
       <w:tr>
         <w:tc>
           <w:tcPr>
-            <w:tcW w:type="dxa" w:w="2600"/>
+            <w:tcW w:type="dxa" w:w="2700"/>
             <w:tcBorders>
               <w:top w:val="single" w:color="D5DCE6" w:sz="1"/>
               <w:left w:val="single" w:color="D5DCE6" w:sz="1"/>
@@ -1181,29 +1137,29 @@
         </w:tc>
         <w:tc>
           <w:tcPr>
-            <w:tcW w:type="dxa" w:w="4360"/>
-            <w:tcBorders>
-              <w:top w:val="single" w:color="D5DCE6" w:sz="1"/>
-              <w:left w:val="single" w:color="D5DCE6" w:sz="1"/>
-              <w:bottom w:val="single" w:color="D5DCE6" w:sz="1"/>
-              <w:right w:val="single" w:color="D5DCE6" w:sz="1"/>
-            </w:tcBorders>
-            <w:shd w:fill="F4F7FB" w:val="clear"/>
-            <w:tcMar>
-              <w:top w:type="dxa" w:w="50"/>
-              <w:left w:type="dxa" w:w="110"/>
-              <w:bottom w:type="dxa" w:w="50"/>
-              <w:right w:type="dxa" w:w="110"/>
-            </w:tcMar>
-            <w:vAlign w:val="center"/>
-          </w:tcPr>
-          <w:p>
-            <w:r>
-              <w:rPr>
-                <w:sz w:val="19"/>
-                <w:szCs w:val="19"/>
-              </w:rPr>
-              <w:t xml:space="preserve">Form logic: builds criteria, calls the API, renders results, print/Word export.</w:t>
+            <w:tcW w:type="dxa" w:w="4260"/>
+            <w:tcBorders>
+              <w:top w:val="single" w:color="D5DCE6" w:sz="1"/>
+              <w:left w:val="single" w:color="D5DCE6" w:sz="1"/>
+              <w:bottom w:val="single" w:color="D5DCE6" w:sz="1"/>
+              <w:right w:val="single" w:color="D5DCE6" w:sz="1"/>
+            </w:tcBorders>
+            <w:shd w:fill="F4F7FB" w:val="clear"/>
+            <w:tcMar>
+              <w:top w:type="dxa" w:w="50"/>
+              <w:left w:type="dxa" w:w="110"/>
+              <w:bottom w:type="dxa" w:w="50"/>
+              <w:right w:type="dxa" w:w="110"/>
+            </w:tcMar>
+            <w:vAlign w:val="center"/>
+          </w:tcPr>
+          <w:p>
+            <w:r>
+              <w:rPr>
+                <w:sz w:val="19"/>
+                <w:szCs w:val="19"/>
+              </w:rPr>
+              <w:t xml:space="preserve">Form logic: builds criteria, calls API, renders results + map, autocomplete, export, submit.</w:t>
             </w:r>
           </w:p>
         </w:tc>
@@ -1231,7 +1187,7 @@
                 <w:sz w:val="19"/>
                 <w:szCs w:val="19"/>
               </w:rPr>
-              <w:t xml:space="preserve">Form behavior or API URL change</w:t>
+              <w:t xml:space="preserve">Form behavior / API URL change</w:t>
             </w:r>
           </w:p>
         </w:tc>
@@ -1239,7 +1195,7 @@
       <w:tr>
         <w:tc>
           <w:tcPr>
-            <w:tcW w:type="dxa" w:w="2600"/>
+            <w:tcW w:type="dxa" w:w="2700"/>
             <w:tcBorders>
               <w:top w:val="single" w:color="D5DCE6" w:sz="1"/>
               <w:left w:val="single" w:color="D5DCE6" w:sz="1"/>
@@ -1267,29 +1223,29 @@
         </w:tc>
         <w:tc>
           <w:tcPr>
-            <w:tcW w:type="dxa" w:w="4360"/>
-            <w:tcBorders>
-              <w:top w:val="single" w:color="D5DCE6" w:sz="1"/>
-              <w:left w:val="single" w:color="D5DCE6" w:sz="1"/>
-              <w:bottom w:val="single" w:color="D5DCE6" w:sz="1"/>
-              <w:right w:val="single" w:color="D5DCE6" w:sz="1"/>
-            </w:tcBorders>
-            <w:shd w:fill="FFFFFF" w:val="clear"/>
-            <w:tcMar>
-              <w:top w:type="dxa" w:w="50"/>
-              <w:left w:type="dxa" w:w="110"/>
-              <w:bottom w:type="dxa" w:w="50"/>
-              <w:right w:type="dxa" w:w="110"/>
-            </w:tcMar>
-            <w:vAlign w:val="center"/>
-          </w:tcPr>
-          <w:p>
-            <w:r>
-              <w:rPr>
-                <w:sz w:val="19"/>
-                <w:szCs w:val="19"/>
-              </w:rPr>
-              <w:t xml:space="preserve">Flask API: routes (/, /match, /health, /email-status), email send.</w:t>
+            <w:tcW w:type="dxa" w:w="4260"/>
+            <w:tcBorders>
+              <w:top w:val="single" w:color="D5DCE6" w:sz="1"/>
+              <w:left w:val="single" w:color="D5DCE6" w:sz="1"/>
+              <w:bottom w:val="single" w:color="D5DCE6" w:sz="1"/>
+              <w:right w:val="single" w:color="D5DCE6" w:sz="1"/>
+            </w:tcBorders>
+            <w:shd w:fill="FFFFFF" w:val="clear"/>
+            <w:tcMar>
+              <w:top w:type="dxa" w:w="50"/>
+              <w:left w:type="dxa" w:w="110"/>
+              <w:bottom w:type="dxa" w:w="50"/>
+              <w:right w:type="dxa" w:w="110"/>
+            </w:tcMar>
+            <w:vAlign w:val="center"/>
+          </w:tcPr>
+          <w:p>
+            <w:r>
+              <w:rPr>
+                <w:sz w:val="19"/>
+                <w:szCs w:val="19"/>
+              </w:rPr>
+              <w:t xml:space="preserve">Flask API: /, /match, /submit, /places, /health, /email-status; Resend email.</w:t>
             </w:r>
           </w:p>
         </w:tc>
@@ -1317,7 +1273,7 @@
                 <w:sz w:val="19"/>
                 <w:szCs w:val="19"/>
               </w:rPr>
-              <w:t xml:space="preserve">API behavior or email logic change</w:t>
+              <w:t xml:space="preserve">API behavior / email change</w:t>
             </w:r>
           </w:p>
         </w:tc>
@@ -1325,7 +1281,7 @@
       <w:tr>
         <w:tc>
           <w:tcPr>
-            <w:tcW w:type="dxa" w:w="2600"/>
+            <w:tcW w:type="dxa" w:w="2700"/>
             <w:tcBorders>
               <w:top w:val="single" w:color="D5DCE6" w:sz="1"/>
               <w:left w:val="single" w:color="D5DCE6" w:sz="1"/>
@@ -1353,29 +1309,29 @@
         </w:tc>
         <w:tc>
           <w:tcPr>
-            <w:tcW w:type="dxa" w:w="4360"/>
-            <w:tcBorders>
-              <w:top w:val="single" w:color="D5DCE6" w:sz="1"/>
-              <w:left w:val="single" w:color="D5DCE6" w:sz="1"/>
-              <w:bottom w:val="single" w:color="D5DCE6" w:sz="1"/>
-              <w:right w:val="single" w:color="D5DCE6" w:sz="1"/>
-            </w:tcBorders>
-            <w:shd w:fill="F4F7FB" w:val="clear"/>
-            <w:tcMar>
-              <w:top w:type="dxa" w:w="50"/>
-              <w:left w:type="dxa" w:w="110"/>
-              <w:bottom w:type="dxa" w:w="50"/>
-              <w:right w:type="dxa" w:w="110"/>
-            </w:tcMar>
-            <w:vAlign w:val="center"/>
-          </w:tcPr>
-          <w:p>
-            <w:r>
-              <w:rPr>
-                <w:sz w:val="19"/>
-                <w:szCs w:val="19"/>
-              </w:rPr>
-              <w:t xml:space="preserve">Deterministic scorer: dimensions, filters, weighting, rationale, geocoding.</w:t>
+            <w:tcW w:type="dxa" w:w="4260"/>
+            <w:tcBorders>
+              <w:top w:val="single" w:color="D5DCE6" w:sz="1"/>
+              <w:left w:val="single" w:color="D5DCE6" w:sz="1"/>
+              <w:bottom w:val="single" w:color="D5DCE6" w:sz="1"/>
+              <w:right w:val="single" w:color="D5DCE6" w:sz="1"/>
+            </w:tcBorders>
+            <w:shd w:fill="F4F7FB" w:val="clear"/>
+            <w:tcMar>
+              <w:top w:type="dxa" w:w="50"/>
+              <w:left w:type="dxa" w:w="110"/>
+              <w:bottom w:type="dxa" w:w="50"/>
+              <w:right w:type="dxa" w:w="110"/>
+            </w:tcMar>
+            <w:vAlign w:val="center"/>
+          </w:tcPr>
+          <w:p>
+            <w:r>
+              <w:rPr>
+                <w:sz w:val="19"/>
+                <w:szCs w:val="19"/>
+              </w:rPr>
+              <w:t xml:space="preserve">Deterministic scorer: 10 dimensions, filters, weighting, rationale, geocoding.</w:t>
             </w:r>
           </w:p>
         </w:tc>
@@ -1411,7 +1367,7 @@
       <w:tr>
         <w:tc>
           <w:tcPr>
-            <w:tcW w:type="dxa" w:w="2600"/>
+            <w:tcW w:type="dxa" w:w="2700"/>
             <w:tcBorders>
               <w:top w:val="single" w:color="D5DCE6" w:sz="1"/>
               <w:left w:val="single" w:color="D5DCE6" w:sz="1"/>
@@ -1439,7 +1395,7 @@
         </w:tc>
         <w:tc>
           <w:tcPr>
-            <w:tcW w:type="dxa" w:w="4360"/>
+            <w:tcW w:type="dxa" w:w="4260"/>
             <w:tcBorders>
               <w:top w:val="single" w:color="D5DCE6" w:sz="1"/>
               <w:left w:val="single" w:color="D5DCE6" w:sz="1"/>
@@ -1489,7 +1445,7 @@
                 <w:sz w:val="19"/>
                 <w:szCs w:val="19"/>
               </w:rPr>
-              <w:t xml:space="preserve">Any US metric is added/refreshed</w:t>
+              <w:t xml:space="preserve">Any US metric refreshed</w:t>
             </w:r>
           </w:p>
         </w:tc>
@@ -1497,7 +1453,7 @@
       <w:tr>
         <w:tc>
           <w:tcPr>
-            <w:tcW w:type="dxa" w:w="2600"/>
+            <w:tcW w:type="dxa" w:w="2700"/>
             <w:tcBorders>
               <w:top w:val="single" w:color="D5DCE6" w:sz="1"/>
               <w:left w:val="single" w:color="D5DCE6" w:sz="1"/>
@@ -1525,29 +1481,29 @@
         </w:tc>
         <w:tc>
           <w:tcPr>
-            <w:tcW w:type="dxa" w:w="4360"/>
-            <w:tcBorders>
-              <w:top w:val="single" w:color="D5DCE6" w:sz="1"/>
-              <w:left w:val="single" w:color="D5DCE6" w:sz="1"/>
-              <w:bottom w:val="single" w:color="D5DCE6" w:sz="1"/>
-              <w:right w:val="single" w:color="D5DCE6" w:sz="1"/>
-            </w:tcBorders>
-            <w:shd w:fill="F4F7FB" w:val="clear"/>
-            <w:tcMar>
-              <w:top w:type="dxa" w:w="50"/>
-              <w:left w:type="dxa" w:w="110"/>
-              <w:bottom w:type="dxa" w:w="50"/>
-              <w:right w:type="dxa" w:w="110"/>
-            </w:tcMar>
-            <w:vAlign w:val="center"/>
-          </w:tcPr>
-          <w:p>
-            <w:r>
-              <w:rPr>
-                <w:sz w:val="19"/>
-                <w:szCs w:val="19"/>
-              </w:rPr>
-              <w:t xml:space="preserve">Canadian Census Division data spine.</w:t>
+            <w:tcW w:type="dxa" w:w="4260"/>
+            <w:tcBorders>
+              <w:top w:val="single" w:color="D5DCE6" w:sz="1"/>
+              <w:left w:val="single" w:color="D5DCE6" w:sz="1"/>
+              <w:bottom w:val="single" w:color="D5DCE6" w:sz="1"/>
+              <w:right w:val="single" w:color="D5DCE6" w:sz="1"/>
+            </w:tcBorders>
+            <w:shd w:fill="F4F7FB" w:val="clear"/>
+            <w:tcMar>
+              <w:top w:type="dxa" w:w="50"/>
+              <w:left w:type="dxa" w:w="110"/>
+              <w:bottom w:type="dxa" w:w="50"/>
+              <w:right w:type="dxa" w:w="110"/>
+            </w:tcMar>
+            <w:vAlign w:val="center"/>
+          </w:tcPr>
+          <w:p>
+            <w:r>
+              <w:rPr>
+                <w:sz w:val="19"/>
+                <w:szCs w:val="19"/>
+              </w:rPr>
+              <w:t xml:space="preserve">Canadian Census Division spine.</w:t>
             </w:r>
           </w:p>
         </w:tc>
@@ -1583,57 +1539,57 @@
       <w:tr>
         <w:tc>
           <w:tcPr>
-            <w:tcW w:type="dxa" w:w="2600"/>
-            <w:tcBorders>
-              <w:top w:val="single" w:color="D5DCE6" w:sz="1"/>
-              <w:left w:val="single" w:color="D5DCE6" w:sz="1"/>
-              <w:bottom w:val="single" w:color="D5DCE6" w:sz="1"/>
-              <w:right w:val="single" w:color="D5DCE6" w:sz="1"/>
-            </w:tcBorders>
-            <w:shd w:fill="FFFFFF" w:val="clear"/>
-            <w:tcMar>
-              <w:top w:type="dxa" w:w="50"/>
-              <w:left w:type="dxa" w:w="110"/>
-              <w:bottom w:type="dxa" w:w="50"/>
-              <w:right w:type="dxa" w:w="110"/>
-            </w:tcMar>
-            <w:vAlign w:val="center"/>
-          </w:tcPr>
-          <w:p>
-            <w:r>
-              <w:rPr>
-                <w:sz w:val="19"/>
-                <w:szCs w:val="19"/>
-              </w:rPr>
-              <w:t xml:space="preserve">edo_master_table_dual.json</w:t>
-            </w:r>
-          </w:p>
-        </w:tc>
-        <w:tc>
-          <w:tcPr>
-            <w:tcW w:type="dxa" w:w="4360"/>
-            <w:tcBorders>
-              <w:top w:val="single" w:color="D5DCE6" w:sz="1"/>
-              <w:left w:val="single" w:color="D5DCE6" w:sz="1"/>
-              <w:bottom w:val="single" w:color="D5DCE6" w:sz="1"/>
-              <w:right w:val="single" w:color="D5DCE6" w:sz="1"/>
-            </w:tcBorders>
-            <w:shd w:fill="FFFFFF" w:val="clear"/>
-            <w:tcMar>
-              <w:top w:type="dxa" w:w="50"/>
-              <w:left w:type="dxa" w:w="110"/>
-              <w:bottom w:type="dxa" w:w="50"/>
-              <w:right w:type="dxa" w:w="110"/>
-            </w:tcMar>
-            <w:vAlign w:val="center"/>
-          </w:tcPr>
-          <w:p>
-            <w:r>
-              <w:rPr>
-                <w:sz w:val="19"/>
-                <w:szCs w:val="19"/>
-              </w:rPr>
-              <w:t xml:space="preserve">EDO customers tagged to FIPS / CDUID + links.</w:t>
+            <w:tcW w:type="dxa" w:w="2700"/>
+            <w:tcBorders>
+              <w:top w:val="single" w:color="D5DCE6" w:sz="1"/>
+              <w:left w:val="single" w:color="D5DCE6" w:sz="1"/>
+              <w:bottom w:val="single" w:color="D5DCE6" w:sz="1"/>
+              <w:right w:val="single" w:color="D5DCE6" w:sz="1"/>
+            </w:tcBorders>
+            <w:shd w:fill="FFFFFF" w:val="clear"/>
+            <w:tcMar>
+              <w:top w:type="dxa" w:w="50"/>
+              <w:left w:type="dxa" w:w="110"/>
+              <w:bottom w:type="dxa" w:w="50"/>
+              <w:right w:type="dxa" w:w="110"/>
+            </w:tcMar>
+            <w:vAlign w:val="center"/>
+          </w:tcPr>
+          <w:p>
+            <w:r>
+              <w:rPr>
+                <w:sz w:val="19"/>
+                <w:szCs w:val="19"/>
+              </w:rPr>
+              <w:t xml:space="preserve">state_infrastructure_grades.json</w:t>
+            </w:r>
+          </w:p>
+        </w:tc>
+        <w:tc>
+          <w:tcPr>
+            <w:tcW w:type="dxa" w:w="4260"/>
+            <w:tcBorders>
+              <w:top w:val="single" w:color="D5DCE6" w:sz="1"/>
+              <w:left w:val="single" w:color="D5DCE6" w:sz="1"/>
+              <w:bottom w:val="single" w:color="D5DCE6" w:sz="1"/>
+              <w:right w:val="single" w:color="D5DCE6" w:sz="1"/>
+            </w:tcBorders>
+            <w:shd w:fill="FFFFFF" w:val="clear"/>
+            <w:tcMar>
+              <w:top w:type="dxa" w:w="50"/>
+              <w:left w:type="dxa" w:w="110"/>
+              <w:bottom w:type="dxa" w:w="50"/>
+              <w:right w:type="dxa" w:w="110"/>
+            </w:tcMar>
+            <w:vAlign w:val="center"/>
+          </w:tcPr>
+          <w:p>
+            <w:r>
+              <w:rPr>
+                <w:sz w:val="19"/>
+                <w:szCs w:val="19"/>
+              </w:rPr>
+              <w:t xml:space="preserve">ASCE state GPA -&gt; Infrastructure dimension (editable).</w:t>
             </w:r>
           </w:p>
         </w:tc>
@@ -1661,7 +1617,7 @@
                 <w:sz w:val="19"/>
                 <w:szCs w:val="19"/>
               </w:rPr>
-              <w:t xml:space="preserve">organizations.json changes</w:t>
+              <w:t xml:space="preserve">Infrastructure grades updated</w:t>
             </w:r>
           </w:p>
         </w:tc>
@@ -1669,57 +1625,57 @@
       <w:tr>
         <w:tc>
           <w:tcPr>
-            <w:tcW w:type="dxa" w:w="2600"/>
-            <w:tcBorders>
-              <w:top w:val="single" w:color="D5DCE6" w:sz="1"/>
-              <w:left w:val="single" w:color="D5DCE6" w:sz="1"/>
-              <w:bottom w:val="single" w:color="D5DCE6" w:sz="1"/>
-              <w:right w:val="single" w:color="D5DCE6" w:sz="1"/>
-            </w:tcBorders>
-            <w:shd w:fill="F4F7FB" w:val="clear"/>
-            <w:tcMar>
-              <w:top w:type="dxa" w:w="50"/>
-              <w:left w:type="dxa" w:w="110"/>
-              <w:bottom w:type="dxa" w:w="50"/>
-              <w:right w:type="dxa" w:w="110"/>
-            </w:tcMar>
-            <w:vAlign w:val="center"/>
-          </w:tcPr>
-          <w:p>
-            <w:r>
-              <w:rPr>
-                <w:sz w:val="19"/>
-                <w:szCs w:val="19"/>
-              </w:rPr>
-              <w:t xml:space="preserve">edo_fips_index.json / edo_ca_cd_index.json</w:t>
-            </w:r>
-          </w:p>
-        </w:tc>
-        <w:tc>
-          <w:tcPr>
-            <w:tcW w:type="dxa" w:w="4360"/>
-            <w:tcBorders>
-              <w:top w:val="single" w:color="D5DCE6" w:sz="1"/>
-              <w:left w:val="single" w:color="D5DCE6" w:sz="1"/>
-              <w:bottom w:val="single" w:color="D5DCE6" w:sz="1"/>
-              <w:right w:val="single" w:color="D5DCE6" w:sz="1"/>
-            </w:tcBorders>
-            <w:shd w:fill="F4F7FB" w:val="clear"/>
-            <w:tcMar>
-              <w:top w:type="dxa" w:w="50"/>
-              <w:left w:type="dxa" w:w="110"/>
-              <w:bottom w:type="dxa" w:w="50"/>
-              <w:right w:type="dxa" w:w="110"/>
-            </w:tcMar>
-            <w:vAlign w:val="center"/>
-          </w:tcPr>
-          <w:p>
-            <w:r>
-              <w:rPr>
-                <w:sz w:val="19"/>
-                <w:szCs w:val="19"/>
-              </w:rPr>
-              <w:t xml:space="preserve">Reverse index: county/CD → serving EDOs.</w:t>
+            <w:tcW w:type="dxa" w:w="2700"/>
+            <w:tcBorders>
+              <w:top w:val="single" w:color="D5DCE6" w:sz="1"/>
+              <w:left w:val="single" w:color="D5DCE6" w:sz="1"/>
+              <w:bottom w:val="single" w:color="D5DCE6" w:sz="1"/>
+              <w:right w:val="single" w:color="D5DCE6" w:sz="1"/>
+            </w:tcBorders>
+            <w:shd w:fill="F4F7FB" w:val="clear"/>
+            <w:tcMar>
+              <w:top w:type="dxa" w:w="50"/>
+              <w:left w:type="dxa" w:w="110"/>
+              <w:bottom w:type="dxa" w:w="50"/>
+              <w:right w:type="dxa" w:w="110"/>
+            </w:tcMar>
+            <w:vAlign w:val="center"/>
+          </w:tcPr>
+          <w:p>
+            <w:r>
+              <w:rPr>
+                <w:sz w:val="19"/>
+                <w:szCs w:val="19"/>
+              </w:rPr>
+              <w:t xml:space="preserve">incentives_index.json</w:t>
+            </w:r>
+          </w:p>
+        </w:tc>
+        <w:tc>
+          <w:tcPr>
+            <w:tcW w:type="dxa" w:w="4260"/>
+            <w:tcBorders>
+              <w:top w:val="single" w:color="D5DCE6" w:sz="1"/>
+              <w:left w:val="single" w:color="D5DCE6" w:sz="1"/>
+              <w:bottom w:val="single" w:color="D5DCE6" w:sz="1"/>
+              <w:right w:val="single" w:color="D5DCE6" w:sz="1"/>
+            </w:tcBorders>
+            <w:shd w:fill="F4F7FB" w:val="clear"/>
+            <w:tcMar>
+              <w:top w:type="dxa" w:w="50"/>
+              <w:left w:type="dxa" w:w="110"/>
+              <w:bottom w:type="dxa" w:w="50"/>
+              <w:right w:type="dxa" w:w="110"/>
+            </w:tcMar>
+            <w:vAlign w:val="center"/>
+          </w:tcPr>
+          <w:p>
+            <w:r>
+              <w:rPr>
+                <w:sz w:val="19"/>
+                <w:szCs w:val="19"/>
+              </w:rPr>
+              <w:t xml:space="preserve">Per-state/province incentive program summary.</w:t>
             </w:r>
           </w:p>
         </w:tc>
@@ -1747,7 +1703,7 @@
                 <w:sz w:val="19"/>
                 <w:szCs w:val="19"/>
               </w:rPr>
-              <w:t xml:space="preserve">Territories change</w:t>
+              <w:t xml:space="preserve">Incentive data refreshed</w:t>
             </w:r>
           </w:p>
         </w:tc>
@@ -1755,57 +1711,57 @@
       <w:tr>
         <w:tc>
           <w:tcPr>
-            <w:tcW w:type="dxa" w:w="2600"/>
-            <w:tcBorders>
-              <w:top w:val="single" w:color="D5DCE6" w:sz="1"/>
-              <w:left w:val="single" w:color="D5DCE6" w:sz="1"/>
-              <w:bottom w:val="single" w:color="D5DCE6" w:sz="1"/>
-              <w:right w:val="single" w:color="D5DCE6" w:sz="1"/>
-            </w:tcBorders>
-            <w:shd w:fill="FFFFFF" w:val="clear"/>
-            <w:tcMar>
-              <w:top w:type="dxa" w:w="50"/>
-              <w:left w:type="dxa" w:w="110"/>
-              <w:bottom w:type="dxa" w:w="50"/>
-              <w:right w:type="dxa" w:w="110"/>
-            </w:tcMar>
-            <w:vAlign w:val="center"/>
-          </w:tcPr>
-          <w:p>
-            <w:r>
-              <w:rPr>
-                <w:sz w:val="19"/>
-                <w:szCs w:val="19"/>
-              </w:rPr>
-              <w:t xml:space="preserve">incentives_index.json</w:t>
-            </w:r>
-          </w:p>
-        </w:tc>
-        <w:tc>
-          <w:tcPr>
-            <w:tcW w:type="dxa" w:w="4360"/>
-            <w:tcBorders>
-              <w:top w:val="single" w:color="D5DCE6" w:sz="1"/>
-              <w:left w:val="single" w:color="D5DCE6" w:sz="1"/>
-              <w:bottom w:val="single" w:color="D5DCE6" w:sz="1"/>
-              <w:right w:val="single" w:color="D5DCE6" w:sz="1"/>
-            </w:tcBorders>
-            <w:shd w:fill="FFFFFF" w:val="clear"/>
-            <w:tcMar>
-              <w:top w:type="dxa" w:w="50"/>
-              <w:left w:type="dxa" w:w="110"/>
-              <w:bottom w:type="dxa" w:w="50"/>
-              <w:right w:type="dxa" w:w="110"/>
-            </w:tcMar>
-            <w:vAlign w:val="center"/>
-          </w:tcPr>
-          <w:p>
-            <w:r>
-              <w:rPr>
-                <w:sz w:val="19"/>
-                <w:szCs w:val="19"/>
-              </w:rPr>
-              <w:t xml:space="preserve">Per-state/province incentive program summary.</w:t>
+            <w:tcW w:type="dxa" w:w="2700"/>
+            <w:tcBorders>
+              <w:top w:val="single" w:color="D5DCE6" w:sz="1"/>
+              <w:left w:val="single" w:color="D5DCE6" w:sz="1"/>
+              <w:bottom w:val="single" w:color="D5DCE6" w:sz="1"/>
+              <w:right w:val="single" w:color="D5DCE6" w:sz="1"/>
+            </w:tcBorders>
+            <w:shd w:fill="FFFFFF" w:val="clear"/>
+            <w:tcMar>
+              <w:top w:type="dxa" w:w="50"/>
+              <w:left w:type="dxa" w:w="110"/>
+              <w:bottom w:type="dxa" w:w="50"/>
+              <w:right w:type="dxa" w:w="110"/>
+            </w:tcMar>
+            <w:vAlign w:val="center"/>
+          </w:tcPr>
+          <w:p>
+            <w:r>
+              <w:rPr>
+                <w:sz w:val="19"/>
+                <w:szCs w:val="19"/>
+              </w:rPr>
+              <w:t xml:space="preserve">us_places.json</w:t>
+            </w:r>
+          </w:p>
+        </w:tc>
+        <w:tc>
+          <w:tcPr>
+            <w:tcW w:type="dxa" w:w="4260"/>
+            <w:tcBorders>
+              <w:top w:val="single" w:color="D5DCE6" w:sz="1"/>
+              <w:left w:val="single" w:color="D5DCE6" w:sz="1"/>
+              <w:bottom w:val="single" w:color="D5DCE6" w:sz="1"/>
+              <w:right w:val="single" w:color="D5DCE6" w:sz="1"/>
+            </w:tcBorders>
+            <w:shd w:fill="FFFFFF" w:val="clear"/>
+            <w:tcMar>
+              <w:top w:type="dxa" w:w="50"/>
+              <w:left w:type="dxa" w:w="110"/>
+              <w:bottom w:type="dxa" w:w="50"/>
+              <w:right w:type="dxa" w:w="110"/>
+            </w:tcMar>
+            <w:vAlign w:val="center"/>
+          </w:tcPr>
+          <w:p>
+            <w:r>
+              <w:rPr>
+                <w:sz w:val="19"/>
+                <w:szCs w:val="19"/>
+              </w:rPr>
+              <w:t xml:space="preserve">64k US places -&gt; coordinates (proximity geocoder + autocomplete).</w:t>
             </w:r>
           </w:p>
         </w:tc>
@@ -1833,7 +1789,7 @@
                 <w:sz w:val="19"/>
                 <w:szCs w:val="19"/>
               </w:rPr>
-              <w:t xml:space="preserve">Incentive data refreshed</w:t>
+              <w:t xml:space="preserve">Rarely (Census places update)</w:t>
             </w:r>
           </w:p>
         </w:tc>
@@ -1841,57 +1797,57 @@
       <w:tr>
         <w:tc>
           <w:tcPr>
-            <w:tcW w:type="dxa" w:w="2600"/>
-            <w:tcBorders>
-              <w:top w:val="single" w:color="D5DCE6" w:sz="1"/>
-              <w:left w:val="single" w:color="D5DCE6" w:sz="1"/>
-              <w:bottom w:val="single" w:color="D5DCE6" w:sz="1"/>
-              <w:right w:val="single" w:color="D5DCE6" w:sz="1"/>
-            </w:tcBorders>
-            <w:shd w:fill="F4F7FB" w:val="clear"/>
-            <w:tcMar>
-              <w:top w:type="dxa" w:w="50"/>
-              <w:left w:type="dxa" w:w="110"/>
-              <w:bottom w:type="dxa" w:w="50"/>
-              <w:right w:type="dxa" w:w="110"/>
-            </w:tcMar>
-            <w:vAlign w:val="center"/>
-          </w:tcPr>
-          <w:p>
-            <w:r>
-              <w:rPr>
-                <w:sz w:val="19"/>
-                <w:szCs w:val="19"/>
-              </w:rPr>
-              <w:t xml:space="preserve">us_places.json</w:t>
-            </w:r>
-          </w:p>
-        </w:tc>
-        <w:tc>
-          <w:tcPr>
-            <w:tcW w:type="dxa" w:w="4360"/>
-            <w:tcBorders>
-              <w:top w:val="single" w:color="D5DCE6" w:sz="1"/>
-              <w:left w:val="single" w:color="D5DCE6" w:sz="1"/>
-              <w:bottom w:val="single" w:color="D5DCE6" w:sz="1"/>
-              <w:right w:val="single" w:color="D5DCE6" w:sz="1"/>
-            </w:tcBorders>
-            <w:shd w:fill="F4F7FB" w:val="clear"/>
-            <w:tcMar>
-              <w:top w:type="dxa" w:w="50"/>
-              <w:left w:type="dxa" w:w="110"/>
-              <w:bottom w:type="dxa" w:w="50"/>
-              <w:right w:type="dxa" w:w="110"/>
-            </w:tcMar>
-            <w:vAlign w:val="center"/>
-          </w:tcPr>
-          <w:p>
-            <w:r>
-              <w:rPr>
-                <w:sz w:val="19"/>
-                <w:szCs w:val="19"/>
-              </w:rPr>
-              <w:t xml:space="preserve">64k US place → coordinates (market-proximity geocoder).</w:t>
+            <w:tcW w:type="dxa" w:w="2700"/>
+            <w:tcBorders>
+              <w:top w:val="single" w:color="D5DCE6" w:sz="1"/>
+              <w:left w:val="single" w:color="D5DCE6" w:sz="1"/>
+              <w:bottom w:val="single" w:color="D5DCE6" w:sz="1"/>
+              <w:right w:val="single" w:color="D5DCE6" w:sz="1"/>
+            </w:tcBorders>
+            <w:shd w:fill="F4F7FB" w:val="clear"/>
+            <w:tcMar>
+              <w:top w:type="dxa" w:w="50"/>
+              <w:left w:type="dxa" w:w="110"/>
+              <w:bottom w:type="dxa" w:w="50"/>
+              <w:right w:type="dxa" w:w="110"/>
+            </w:tcMar>
+            <w:vAlign w:val="center"/>
+          </w:tcPr>
+          <w:p>
+            <w:r>
+              <w:rPr>
+                <w:sz w:val="19"/>
+                <w:szCs w:val="19"/>
+              </w:rPr>
+              <w:t xml:space="preserve">edo_master_table_dual.json / edo_*_index.json</w:t>
+            </w:r>
+          </w:p>
+        </w:tc>
+        <w:tc>
+          <w:tcPr>
+            <w:tcW w:type="dxa" w:w="4260"/>
+            <w:tcBorders>
+              <w:top w:val="single" w:color="D5DCE6" w:sz="1"/>
+              <w:left w:val="single" w:color="D5DCE6" w:sz="1"/>
+              <w:bottom w:val="single" w:color="D5DCE6" w:sz="1"/>
+              <w:right w:val="single" w:color="D5DCE6" w:sz="1"/>
+            </w:tcBorders>
+            <w:shd w:fill="F4F7FB" w:val="clear"/>
+            <w:tcMar>
+              <w:top w:type="dxa" w:w="50"/>
+              <w:left w:type="dxa" w:w="110"/>
+              <w:bottom w:type="dxa" w:w="50"/>
+              <w:right w:type="dxa" w:w="110"/>
+            </w:tcMar>
+            <w:vAlign w:val="center"/>
+          </w:tcPr>
+          <w:p>
+            <w:r>
+              <w:rPr>
+                <w:sz w:val="19"/>
+                <w:szCs w:val="19"/>
+              </w:rPr>
+              <w:t xml:space="preserve">EDO customers tagged to FIPS/CDUID + reverse index.</w:t>
             </w:r>
           </w:p>
         </w:tc>
@@ -1919,7 +1875,7 @@
                 <w:sz w:val="19"/>
                 <w:szCs w:val="19"/>
               </w:rPr>
-              <w:t xml:space="preserve">Rarely (Census places update)</w:t>
+              <w:t xml:space="preserve">organizations.json / territories change</w:t>
             </w:r>
           </w:p>
         </w:tc>
@@ -1931,15 +1887,7 @@
         <w:spacing w:after="100" w:before="220"/>
       </w:pPr>
       <w:r>
-        <w:t xml:space="preserve">2.3 Updating the Form (frontend)</w:t>
-      </w:r>
-    </w:p>
-    <w:p>
-      <w:pPr>
-        <w:spacing w:after="120" w:line="276"/>
-      </w:pPr>
-      <w:r>
-        <w:t xml:space="preserve">Edit site_selection_intake.html and/or intake.js, then upload BOTH to the same folder on the web server. Two rules prevent the recurring breakage seen during build-out:</w:t>
+        <w:t xml:space="preserve">2.3 Updating the Form</w:t>
       </w:r>
     </w:p>
     <w:p>
@@ -1956,22 +1904,10 @@
           <w:b/>
           <w:bCs/>
         </w:rPr>
-        <w:t xml:space="preserve">Keep the files ASCII-only. </w:t>
-      </w:r>
-      <w:r>
-        <w:t xml:space="preserve">The host's page processor corrupts non-ASCII characters (smart quotes, em-dashes, byte-order marks) in inline code; this is why the JavaScript lives in an external </w:t>
-      </w:r>
-      <w:r>
-        <w:rPr>
-          <w:rFonts w:ascii="Consolas" w:cs="Consolas" w:eastAsia="Consolas" w:hAnsi="Consolas"/>
-          <w:color w:val="39455A"/>
-          <w:sz w:val="19"/>
-          <w:szCs w:val="19"/>
-        </w:rPr>
-        <w:t xml:space="preserve">intake.js</w:t>
-      </w:r>
-      <w:r>
-        <w:t xml:space="preserve"> file rather than inline.</w:t>
+        <w:t xml:space="preserve">Keep files ASCII-only </w:t>
+      </w:r>
+      <w:r>
+        <w:t xml:space="preserve">and JS external (intake.js). The host's page processor corrupts non-ASCII characters and inline scripts — that is why the JavaScript is a separate file.</w:t>
       </w:r>
     </w:p>
     <w:p>
@@ -1991,27 +1927,7 @@
         <w:t xml:space="preserve">Upload in Binary mode </w:t>
       </w:r>
       <w:r>
-        <w:t xml:space="preserve">if using FTP (ASCII-mode FTP mangles files), and confirm OneDrive shows the file fully synced before uploading.</w:t>
-      </w:r>
-    </w:p>
-    <w:p>
-      <w:pPr>
-        <w:spacing w:after="120" w:line="276"/>
-      </w:pPr>
-      <w:r>
-        <w:t xml:space="preserve">The form calls the API via the </w:t>
-      </w:r>
-      <w:r>
-        <w:rPr>
-          <w:rFonts w:ascii="Consolas" w:cs="Consolas" w:eastAsia="Consolas" w:hAnsi="Consolas"/>
-          <w:color w:val="39455A"/>
-          <w:sz w:val="19"/>
-          <w:szCs w:val="19"/>
-        </w:rPr>
-        <w:t xml:space="preserve">API_BASE</w:t>
-      </w:r>
-      <w:r>
-        <w:t xml:space="preserve"> constant near the top of intake.js. It is set to the Railway URL so the form works from any domain.</w:t>
+        <w:t xml:space="preserve">(FTP), and confirm OneDrive is fully synced before uploading.</w:t>
       </w:r>
     </w:p>
     <w:p>
@@ -2028,7 +1944,7 @@
         <w:spacing w:after="120" w:line="276"/>
       </w:pPr>
       <w:r>
-        <w:t xml:space="preserve">All scored metrics live in </w:t>
+        <w:t xml:space="preserve">All scored US metrics live in </w:t>
       </w:r>
       <w:r>
         <w:rPr>
@@ -2040,57 +1956,7 @@
         <w:t xml:space="preserve">county_features.json</w:t>
       </w:r>
       <w:r>
-        <w:t xml:space="preserve"> (US) and </w:t>
-      </w:r>
-      <w:r>
-        <w:rPr>
-          <w:rFonts w:ascii="Consolas" w:cs="Consolas" w:eastAsia="Consolas" w:hAnsi="Consolas"/>
-          <w:color w:val="39455A"/>
-          <w:sz w:val="19"/>
-          <w:szCs w:val="19"/>
-        </w:rPr>
-        <w:t xml:space="preserve">ca_features.json</w:t>
-      </w:r>
-      <w:r>
-        <w:t xml:space="preserve"> (Canada) — these are the join spine. Raw source files (Census/ArcGIS exports, CSVs, spreadsheets) are processed once by build scripts into these precomputed files; the raw files are NOT deployed. To add or refresh a metric:</w:t>
-      </w:r>
-    </w:p>
-    <w:p>
-      <w:pPr>
-        <w:pStyle w:val="ListParagraph"/>
-        <w:numPr>
-          <w:ilvl w:val="0"/>
-          <w:numId w:val="2"/>
-        </w:numPr>
-        <w:spacing w:after="60"/>
-      </w:pPr>
-      <w:r>
-        <w:t xml:space="preserve">Place the raw source file in the working folder.</w:t>
-      </w:r>
-    </w:p>
-    <w:p>
-      <w:pPr>
-        <w:pStyle w:val="ListParagraph"/>
-        <w:numPr>
-          <w:ilvl w:val="0"/>
-          <w:numId w:val="2"/>
-        </w:numPr>
-        <w:spacing w:after="60"/>
-      </w:pPr>
-      <w:r>
-        <w:t xml:space="preserve">Run the relevant build/merge script to extract the metric (keyed by 5-digit county FIPS) into </w:t>
-      </w:r>
-      <w:r>
-        <w:rPr>
-          <w:rFonts w:ascii="Consolas" w:cs="Consolas" w:eastAsia="Consolas" w:hAnsi="Consolas"/>
-          <w:color w:val="39455A"/>
-          <w:sz w:val="19"/>
-          <w:szCs w:val="19"/>
-        </w:rPr>
-        <w:t xml:space="preserve">metrics_extra.json</w:t>
-      </w:r>
-      <w:r>
-        <w:t xml:space="preserve"> and merge into </w:t>
+        <w:t xml:space="preserve">. Raw sources (Census/ArcGIS exports, CSVs, the County Health Rankings file) are processed once into it and are NOT deployed. To add a metric: extract it keyed by 5-digit FIPS, merge into </w:t>
       </w:r>
       <w:r>
         <w:rPr>
@@ -2102,20 +1968,7 @@
         <w:t xml:space="preserve">county_features.json</w:t>
       </w:r>
       <w:r>
-        <w:t xml:space="preserve">.</w:t>
-      </w:r>
-    </w:p>
-    <w:p>
-      <w:pPr>
-        <w:pStyle w:val="ListParagraph"/>
-        <w:numPr>
-          <w:ilvl w:val="0"/>
-          <w:numId w:val="2"/>
-        </w:numPr>
-        <w:spacing w:after="60"/>
-      </w:pPr>
-      <w:r>
-        <w:t xml:space="preserve">Add the metric to the appropriate dimension extractor in </w:t>
+        <w:t xml:space="preserve">, add it to the matching dimension extractor in </w:t>
       </w:r>
       <w:r>
         <w:rPr>
@@ -2127,20 +1980,7 @@
         <w:t xml:space="preserve">scorer.py</w:t>
       </w:r>
       <w:r>
-        <w:t xml:space="preserve"> (see Section 3.4).</w:t>
-      </w:r>
-    </w:p>
-    <w:p>
-      <w:pPr>
-        <w:pStyle w:val="ListParagraph"/>
-        <w:numPr>
-          <w:ilvl w:val="0"/>
-          <w:numId w:val="2"/>
-        </w:numPr>
-        <w:spacing w:after="60"/>
-      </w:pPr>
-      <w:r>
-        <w:t xml:space="preserve">Commit and push — Railway redeploys with the new data.</w:t>
+        <w:t xml:space="preserve">, commit and push.</w:t>
       </w:r>
     </w:p>
     <w:p>
@@ -2149,15 +1989,7 @@
         <w:spacing w:after="100" w:before="220"/>
       </w:pPr>
       <w:r>
-        <w:t xml:space="preserve">2.5 Deployment Workflow</w:t>
-      </w:r>
-    </w:p>
-    <w:p>
-      <w:pPr>
-        <w:spacing w:after="120" w:line="276"/>
-      </w:pPr>
-      <w:r>
-        <w:t xml:space="preserve">The backend (API + data) deploys through git. The frontend (form) is uploaded to the web server separately.</w:t>
+        <w:t xml:space="preserve">2.5 Deployment</w:t>
       </w:r>
     </w:p>
     <w:p>
@@ -2174,7 +2006,7 @@
         <w:t xml:space="preserve">git add -A   →   git commit -m "..."   →   git push</w:t>
       </w:r>
       <w:r>
-        <w:t xml:space="preserve">   (Railway redeploys in ~1–2 min)</w:t>
+        <w:t xml:space="preserve">  (Railway redeploys in ~1–2 min). The frontend is uploaded to the web server separately.</w:t>
       </w:r>
     </w:p>
     <w:p>
@@ -2182,7 +2014,7 @@
         <w:spacing w:after="120" w:line="276"/>
       </w:pPr>
       <w:r>
-        <w:t xml:space="preserve">Critical: GitHub rejects files over 100 MB. The raw source layers (some over 1 GB) must stay out of the repo. The </w:t>
+        <w:t xml:space="preserve">GitHub rejects files over 100 MB. The </w:t>
       </w:r>
       <w:r>
         <w:rPr>
@@ -2194,7 +2026,7 @@
         <w:t xml:space="preserve">.gitignore</w:t>
       </w:r>
       <w:r>
-        <w:t xml:space="preserve"> uses a whitelist — it ignores all data by default and explicitly keeps only the small runtime files (county_features, ca_features, the EDO/incentive indexes, us_places). Never remove that whitelist.</w:t>
+        <w:t xml:space="preserve"> is a whitelist — it ignores all data and keeps only the small runtime JSON. Never remove the whitelist; raw source files (some over 1 GB) must stay out of the repo.</w:t>
       </w:r>
     </w:p>
     <w:p>
@@ -2203,493 +2035,7 @@
         <w:spacing w:after="100" w:before="220"/>
       </w:pPr>
       <w:r>
-        <w:t xml:space="preserve">2.6 Environment Variables (Railway)</w:t>
-      </w:r>
-    </w:p>
-    <w:tbl>
-      <w:tblPr>
-        <w:tblW w:type="dxa" w:w="9360"/>
-        <w:tblBorders>
-          <w:top w:val="single" w:color="auto" w:sz="4"/>
-          <w:left w:val="single" w:color="auto" w:sz="4"/>
-          <w:bottom w:val="single" w:color="auto" w:sz="4"/>
-          <w:right w:val="single" w:color="auto" w:sz="4"/>
-          <w:insideH w:val="single" w:color="auto" w:sz="4"/>
-          <w:insideV w:val="single" w:color="auto" w:sz="4"/>
-        </w:tblBorders>
-      </w:tblPr>
-      <w:tblGrid>
-        <w:gridCol w:w="3000"/>
-        <w:gridCol w:w="4200"/>
-        <w:gridCol w:w="2160"/>
-      </w:tblGrid>
-      <w:tr>
-        <w:trPr>
-          <w:tblHeader/>
-        </w:trPr>
-        <w:tc>
-          <w:tcPr>
-            <w:tcW w:type="dxa" w:w="3000"/>
-            <w:tcBorders>
-              <w:top w:val="single" w:color="D5DCE6" w:sz="1"/>
-              <w:left w:val="single" w:color="D5DCE6" w:sz="1"/>
-              <w:bottom w:val="single" w:color="D5DCE6" w:sz="1"/>
-              <w:right w:val="single" w:color="D5DCE6" w:sz="1"/>
-            </w:tcBorders>
-            <w:shd w:fill="1A54A0" w:val="clear"/>
-            <w:tcMar>
-              <w:top w:type="dxa" w:w="60"/>
-              <w:left w:type="dxa" w:w="110"/>
-              <w:bottom w:type="dxa" w:w="60"/>
-              <w:right w:type="dxa" w:w="110"/>
-            </w:tcMar>
-          </w:tcPr>
-          <w:p>
-            <w:r>
-              <w:rPr>
-                <w:b/>
-                <w:bCs/>
-                <w:color w:val="FFFFFF"/>
-                <w:sz w:val="19"/>
-                <w:szCs w:val="19"/>
-              </w:rPr>
-              <w:t xml:space="preserve">Variable</w:t>
-            </w:r>
-          </w:p>
-        </w:tc>
-        <w:tc>
-          <w:tcPr>
-            <w:tcW w:type="dxa" w:w="4200"/>
-            <w:tcBorders>
-              <w:top w:val="single" w:color="D5DCE6" w:sz="1"/>
-              <w:left w:val="single" w:color="D5DCE6" w:sz="1"/>
-              <w:bottom w:val="single" w:color="D5DCE6" w:sz="1"/>
-              <w:right w:val="single" w:color="D5DCE6" w:sz="1"/>
-            </w:tcBorders>
-            <w:shd w:fill="1A54A0" w:val="clear"/>
-            <w:tcMar>
-              <w:top w:type="dxa" w:w="60"/>
-              <w:left w:type="dxa" w:w="110"/>
-              <w:bottom w:type="dxa" w:w="60"/>
-              <w:right w:type="dxa" w:w="110"/>
-            </w:tcMar>
-          </w:tcPr>
-          <w:p>
-            <w:r>
-              <w:rPr>
-                <w:b/>
-                <w:bCs/>
-                <w:color w:val="FFFFFF"/>
-                <w:sz w:val="19"/>
-                <w:szCs w:val="19"/>
-              </w:rPr>
-              <w:t xml:space="preserve">Purpose</w:t>
-            </w:r>
-          </w:p>
-        </w:tc>
-        <w:tc>
-          <w:tcPr>
-            <w:tcW w:type="dxa" w:w="2160"/>
-            <w:tcBorders>
-              <w:top w:val="single" w:color="D5DCE6" w:sz="1"/>
-              <w:left w:val="single" w:color="D5DCE6" w:sz="1"/>
-              <w:bottom w:val="single" w:color="D5DCE6" w:sz="1"/>
-              <w:right w:val="single" w:color="D5DCE6" w:sz="1"/>
-            </w:tcBorders>
-            <w:shd w:fill="1A54A0" w:val="clear"/>
-            <w:tcMar>
-              <w:top w:type="dxa" w:w="60"/>
-              <w:left w:type="dxa" w:w="110"/>
-              <w:bottom w:type="dxa" w:w="60"/>
-              <w:right w:type="dxa" w:w="110"/>
-            </w:tcMar>
-          </w:tcPr>
-          <w:p>
-            <w:r>
-              <w:rPr>
-                <w:b/>
-                <w:bCs/>
-                <w:color w:val="FFFFFF"/>
-                <w:sz w:val="19"/>
-                <w:szCs w:val="19"/>
-              </w:rPr>
-              <w:t xml:space="preserve">Required</w:t>
-            </w:r>
-          </w:p>
-        </w:tc>
-      </w:tr>
-      <w:tr>
-        <w:tc>
-          <w:tcPr>
-            <w:tcW w:type="dxa" w:w="3000"/>
-            <w:tcBorders>
-              <w:top w:val="single" w:color="D5DCE6" w:sz="1"/>
-              <w:left w:val="single" w:color="D5DCE6" w:sz="1"/>
-              <w:bottom w:val="single" w:color="D5DCE6" w:sz="1"/>
-              <w:right w:val="single" w:color="D5DCE6" w:sz="1"/>
-            </w:tcBorders>
-            <w:shd w:fill="FFFFFF" w:val="clear"/>
-            <w:tcMar>
-              <w:top w:type="dxa" w:w="50"/>
-              <w:left w:type="dxa" w:w="110"/>
-              <w:bottom w:type="dxa" w:w="50"/>
-              <w:right w:type="dxa" w:w="110"/>
-            </w:tcMar>
-            <w:vAlign w:val="center"/>
-          </w:tcPr>
-          <w:p>
-            <w:r>
-              <w:rPr>
-                <w:sz w:val="19"/>
-                <w:szCs w:val="19"/>
-              </w:rPr>
-              <w:t xml:space="preserve">RESEND_API_KEY</w:t>
-            </w:r>
-          </w:p>
-        </w:tc>
-        <w:tc>
-          <w:tcPr>
-            <w:tcW w:type="dxa" w:w="4200"/>
-            <w:tcBorders>
-              <w:top w:val="single" w:color="D5DCE6" w:sz="1"/>
-              <w:left w:val="single" w:color="D5DCE6" w:sz="1"/>
-              <w:bottom w:val="single" w:color="D5DCE6" w:sz="1"/>
-              <w:right w:val="single" w:color="D5DCE6" w:sz="1"/>
-            </w:tcBorders>
-            <w:shd w:fill="FFFFFF" w:val="clear"/>
-            <w:tcMar>
-              <w:top w:type="dxa" w:w="50"/>
-              <w:left w:type="dxa" w:w="110"/>
-              <w:bottom w:type="dxa" w:w="50"/>
-              <w:right w:type="dxa" w:w="110"/>
-            </w:tcMar>
-            <w:vAlign w:val="center"/>
-          </w:tcPr>
-          <w:p>
-            <w:r>
-              <w:rPr>
-                <w:sz w:val="19"/>
-                <w:szCs w:val="19"/>
-              </w:rPr>
-              <w:t xml:space="preserve">Resend API key — enables result emails.</w:t>
-            </w:r>
-          </w:p>
-        </w:tc>
-        <w:tc>
-          <w:tcPr>
-            <w:tcW w:type="dxa" w:w="2160"/>
-            <w:tcBorders>
-              <w:top w:val="single" w:color="D5DCE6" w:sz="1"/>
-              <w:left w:val="single" w:color="D5DCE6" w:sz="1"/>
-              <w:bottom w:val="single" w:color="D5DCE6" w:sz="1"/>
-              <w:right w:val="single" w:color="D5DCE6" w:sz="1"/>
-            </w:tcBorders>
-            <w:shd w:fill="FFFFFF" w:val="clear"/>
-            <w:tcMar>
-              <w:top w:type="dxa" w:w="50"/>
-              <w:left w:type="dxa" w:w="110"/>
-              <w:bottom w:type="dxa" w:w="50"/>
-              <w:right w:type="dxa" w:w="110"/>
-            </w:tcMar>
-            <w:vAlign w:val="center"/>
-          </w:tcPr>
-          <w:p>
-            <w:r>
-              <w:rPr>
-                <w:sz w:val="19"/>
-                <w:szCs w:val="19"/>
-              </w:rPr>
-              <w:t xml:space="preserve">For email</w:t>
-            </w:r>
-          </w:p>
-        </w:tc>
-      </w:tr>
-      <w:tr>
-        <w:tc>
-          <w:tcPr>
-            <w:tcW w:type="dxa" w:w="3000"/>
-            <w:tcBorders>
-              <w:top w:val="single" w:color="D5DCE6" w:sz="1"/>
-              <w:left w:val="single" w:color="D5DCE6" w:sz="1"/>
-              <w:bottom w:val="single" w:color="D5DCE6" w:sz="1"/>
-              <w:right w:val="single" w:color="D5DCE6" w:sz="1"/>
-            </w:tcBorders>
-            <w:shd w:fill="F4F7FB" w:val="clear"/>
-            <w:tcMar>
-              <w:top w:type="dxa" w:w="50"/>
-              <w:left w:type="dxa" w:w="110"/>
-              <w:bottom w:type="dxa" w:w="50"/>
-              <w:right w:type="dxa" w:w="110"/>
-            </w:tcMar>
-            <w:vAlign w:val="center"/>
-          </w:tcPr>
-          <w:p>
-            <w:r>
-              <w:rPr>
-                <w:sz w:val="19"/>
-                <w:szCs w:val="19"/>
-              </w:rPr>
-              <w:t xml:space="preserve">FL_NOTIFY_EMAIL</w:t>
-            </w:r>
-          </w:p>
-        </w:tc>
-        <w:tc>
-          <w:tcPr>
-            <w:tcW w:type="dxa" w:w="4200"/>
-            <w:tcBorders>
-              <w:top w:val="single" w:color="D5DCE6" w:sz="1"/>
-              <w:left w:val="single" w:color="D5DCE6" w:sz="1"/>
-              <w:bottom w:val="single" w:color="D5DCE6" w:sz="1"/>
-              <w:right w:val="single" w:color="D5DCE6" w:sz="1"/>
-            </w:tcBorders>
-            <w:shd w:fill="F4F7FB" w:val="clear"/>
-            <w:tcMar>
-              <w:top w:type="dxa" w:w="50"/>
-              <w:left w:type="dxa" w:w="110"/>
-              <w:bottom w:type="dxa" w:w="50"/>
-              <w:right w:type="dxa" w:w="110"/>
-            </w:tcMar>
-            <w:vAlign w:val="center"/>
-          </w:tcPr>
-          <w:p>
-            <w:r>
-              <w:rPr>
-                <w:sz w:val="19"/>
-                <w:szCs w:val="19"/>
-              </w:rPr>
-              <w:t xml:space="preserve">Inbox that receives a copy of every lead.</w:t>
-            </w:r>
-          </w:p>
-        </w:tc>
-        <w:tc>
-          <w:tcPr>
-            <w:tcW w:type="dxa" w:w="2160"/>
-            <w:tcBorders>
-              <w:top w:val="single" w:color="D5DCE6" w:sz="1"/>
-              <w:left w:val="single" w:color="D5DCE6" w:sz="1"/>
-              <w:bottom w:val="single" w:color="D5DCE6" w:sz="1"/>
-              <w:right w:val="single" w:color="D5DCE6" w:sz="1"/>
-            </w:tcBorders>
-            <w:shd w:fill="F4F7FB" w:val="clear"/>
-            <w:tcMar>
-              <w:top w:type="dxa" w:w="50"/>
-              <w:left w:type="dxa" w:w="110"/>
-              <w:bottom w:type="dxa" w:w="50"/>
-              <w:right w:type="dxa" w:w="110"/>
-            </w:tcMar>
-            <w:vAlign w:val="center"/>
-          </w:tcPr>
-          <w:p>
-            <w:r>
-              <w:rPr>
-                <w:sz w:val="19"/>
-                <w:szCs w:val="19"/>
-              </w:rPr>
-              <w:t xml:space="preserve">For email</w:t>
-            </w:r>
-          </w:p>
-        </w:tc>
-      </w:tr>
-      <w:tr>
-        <w:tc>
-          <w:tcPr>
-            <w:tcW w:type="dxa" w:w="3000"/>
-            <w:tcBorders>
-              <w:top w:val="single" w:color="D5DCE6" w:sz="1"/>
-              <w:left w:val="single" w:color="D5DCE6" w:sz="1"/>
-              <w:bottom w:val="single" w:color="D5DCE6" w:sz="1"/>
-              <w:right w:val="single" w:color="D5DCE6" w:sz="1"/>
-            </w:tcBorders>
-            <w:shd w:fill="FFFFFF" w:val="clear"/>
-            <w:tcMar>
-              <w:top w:type="dxa" w:w="50"/>
-              <w:left w:type="dxa" w:w="110"/>
-              <w:bottom w:type="dxa" w:w="50"/>
-              <w:right w:type="dxa" w:w="110"/>
-            </w:tcMar>
-            <w:vAlign w:val="center"/>
-          </w:tcPr>
-          <w:p>
-            <w:r>
-              <w:rPr>
-                <w:sz w:val="19"/>
-                <w:szCs w:val="19"/>
-              </w:rPr>
-              <w:t xml:space="preserve">EMAIL_FROM</w:t>
-            </w:r>
-          </w:p>
-        </w:tc>
-        <w:tc>
-          <w:tcPr>
-            <w:tcW w:type="dxa" w:w="4200"/>
-            <w:tcBorders>
-              <w:top w:val="single" w:color="D5DCE6" w:sz="1"/>
-              <w:left w:val="single" w:color="D5DCE6" w:sz="1"/>
-              <w:bottom w:val="single" w:color="D5DCE6" w:sz="1"/>
-              <w:right w:val="single" w:color="D5DCE6" w:sz="1"/>
-            </w:tcBorders>
-            <w:shd w:fill="FFFFFF" w:val="clear"/>
-            <w:tcMar>
-              <w:top w:type="dxa" w:w="50"/>
-              <w:left w:type="dxa" w:w="110"/>
-              <w:bottom w:type="dxa" w:w="50"/>
-              <w:right w:type="dxa" w:w="110"/>
-            </w:tcMar>
-            <w:vAlign w:val="center"/>
-          </w:tcPr>
-          <w:p>
-            <w:r>
-              <w:rPr>
-                <w:sz w:val="19"/>
-                <w:szCs w:val="19"/>
-              </w:rPr>
-              <w:t xml:space="preserve">Sender, e.g. FastLocations &lt;noreply@fastlocations.ai&gt;.</w:t>
-            </w:r>
-          </w:p>
-        </w:tc>
-        <w:tc>
-          <w:tcPr>
-            <w:tcW w:type="dxa" w:w="2160"/>
-            <w:tcBorders>
-              <w:top w:val="single" w:color="D5DCE6" w:sz="1"/>
-              <w:left w:val="single" w:color="D5DCE6" w:sz="1"/>
-              <w:bottom w:val="single" w:color="D5DCE6" w:sz="1"/>
-              <w:right w:val="single" w:color="D5DCE6" w:sz="1"/>
-            </w:tcBorders>
-            <w:shd w:fill="FFFFFF" w:val="clear"/>
-            <w:tcMar>
-              <w:top w:type="dxa" w:w="50"/>
-              <w:left w:type="dxa" w:w="110"/>
-              <w:bottom w:type="dxa" w:w="50"/>
-              <w:right w:type="dxa" w:w="110"/>
-            </w:tcMar>
-            <w:vAlign w:val="center"/>
-          </w:tcPr>
-          <w:p>
-            <w:r>
-              <w:rPr>
-                <w:sz w:val="19"/>
-                <w:szCs w:val="19"/>
-              </w:rPr>
-              <w:t xml:space="preserve">Optional</w:t>
-            </w:r>
-          </w:p>
-        </w:tc>
-      </w:tr>
-      <w:tr>
-        <w:tc>
-          <w:tcPr>
-            <w:tcW w:type="dxa" w:w="3000"/>
-            <w:tcBorders>
-              <w:top w:val="single" w:color="D5DCE6" w:sz="1"/>
-              <w:left w:val="single" w:color="D5DCE6" w:sz="1"/>
-              <w:bottom w:val="single" w:color="D5DCE6" w:sz="1"/>
-              <w:right w:val="single" w:color="D5DCE6" w:sz="1"/>
-            </w:tcBorders>
-            <w:shd w:fill="F4F7FB" w:val="clear"/>
-            <w:tcMar>
-              <w:top w:type="dxa" w:w="50"/>
-              <w:left w:type="dxa" w:w="110"/>
-              <w:bottom w:type="dxa" w:w="50"/>
-              <w:right w:type="dxa" w:w="110"/>
-            </w:tcMar>
-            <w:vAlign w:val="center"/>
-          </w:tcPr>
-          <w:p>
-            <w:r>
-              <w:rPr>
-                <w:sz w:val="19"/>
-                <w:szCs w:val="19"/>
-              </w:rPr>
-              <w:t xml:space="preserve">MISE_PYTHON_GITHUB_ATTESTATIONS</w:t>
-            </w:r>
-          </w:p>
-        </w:tc>
-        <w:tc>
-          <w:tcPr>
-            <w:tcW w:type="dxa" w:w="4200"/>
-            <w:tcBorders>
-              <w:top w:val="single" w:color="D5DCE6" w:sz="1"/>
-              <w:left w:val="single" w:color="D5DCE6" w:sz="1"/>
-              <w:bottom w:val="single" w:color="D5DCE6" w:sz="1"/>
-              <w:right w:val="single" w:color="D5DCE6" w:sz="1"/>
-            </w:tcBorders>
-            <w:shd w:fill="F4F7FB" w:val="clear"/>
-            <w:tcMar>
-              <w:top w:type="dxa" w:w="50"/>
-              <w:left w:type="dxa" w:w="110"/>
-              <w:bottom w:type="dxa" w:w="50"/>
-              <w:right w:type="dxa" w:w="110"/>
-            </w:tcMar>
-            <w:vAlign w:val="center"/>
-          </w:tcPr>
-          <w:p>
-            <w:r>
-              <w:rPr>
-                <w:sz w:val="19"/>
-                <w:szCs w:val="19"/>
-              </w:rPr>
-              <w:t xml:space="preserve">Set to false — lets Railway install Python 3.12.</w:t>
-            </w:r>
-          </w:p>
-        </w:tc>
-        <w:tc>
-          <w:tcPr>
-            <w:tcW w:type="dxa" w:w="2160"/>
-            <w:tcBorders>
-              <w:top w:val="single" w:color="D5DCE6" w:sz="1"/>
-              <w:left w:val="single" w:color="D5DCE6" w:sz="1"/>
-              <w:bottom w:val="single" w:color="D5DCE6" w:sz="1"/>
-              <w:right w:val="single" w:color="D5DCE6" w:sz="1"/>
-            </w:tcBorders>
-            <w:shd w:fill="F4F7FB" w:val="clear"/>
-            <w:tcMar>
-              <w:top w:type="dxa" w:w="50"/>
-              <w:left w:type="dxa" w:w="110"/>
-              <w:bottom w:type="dxa" w:w="50"/>
-              <w:right w:type="dxa" w:w="110"/>
-            </w:tcMar>
-            <w:vAlign w:val="center"/>
-          </w:tcPr>
-          <w:p>
-            <w:r>
-              <w:rPr>
-                <w:sz w:val="19"/>
-                <w:szCs w:val="19"/>
-              </w:rPr>
-              <w:t xml:space="preserve">Yes (build)</w:t>
-            </w:r>
-          </w:p>
-        </w:tc>
-      </w:tr>
-    </w:tbl>
-    <w:p>
-      <w:pPr>
-        <w:spacing w:after="120" w:line="276"/>
-      </w:pPr>
-      <w:r>
-        <w:t xml:space="preserve">Email also requires verifying </w:t>
-      </w:r>
-      <w:r>
-        <w:rPr>
-          <w:rFonts w:ascii="Consolas" w:cs="Consolas" w:eastAsia="Consolas" w:hAnsi="Consolas"/>
-          <w:color w:val="39455A"/>
-          <w:sz w:val="19"/>
-          <w:szCs w:val="19"/>
-        </w:rPr>
-        <w:t xml:space="preserve">fastlocations.ai</w:t>
-      </w:r>
-      <w:r>
-        <w:t xml:space="preserve"> in Resend (add the SPF/DKIM DNS records). Until the domain is verified, Resend only delivers to the account owner's own address — the most common reason submitter emails don't arrive.</w:t>
-      </w:r>
-    </w:p>
-    <w:p>
-      <w:pPr>
-        <w:pStyle w:val="Heading2"/>
-        <w:spacing w:after="100" w:before="220"/>
-      </w:pPr>
-      <w:r>
-        <w:t xml:space="preserve">2.7 Diagnostic Endpoints</w:t>
+        <w:t xml:space="preserve">2.6 Endpoints &amp; Email</w:t>
       </w:r>
     </w:p>
     <w:tbl>
@@ -2800,7 +2146,7 @@
                 <w:sz w:val="19"/>
                 <w:szCs w:val="19"/>
               </w:rPr>
-              <w:t xml:space="preserve">GET /health</w:t>
+              <w:t xml:space="preserve">GET /</w:t>
             </w:r>
           </w:p>
         </w:tc>
@@ -2828,7 +2174,7 @@
                 <w:sz w:val="19"/>
                 <w:szCs w:val="19"/>
               </w:rPr>
-              <w:t xml:space="preserve">Data load status (county / EDO / incentive counts).</w:t>
+              <w:t xml:space="preserve">Serves the intake form.</w:t>
             </w:r>
           </w:p>
         </w:tc>
@@ -2860,7 +2206,7 @@
                 <w:sz w:val="19"/>
                 <w:szCs w:val="19"/>
               </w:rPr>
-              <w:t xml:space="preserve">GET /email-status</w:t>
+              <w:t xml:space="preserve">POST /match?top=N</w:t>
             </w:r>
           </w:p>
         </w:tc>
@@ -2888,7 +2234,7 @@
                 <w:sz w:val="19"/>
                 <w:szCs w:val="19"/>
               </w:rPr>
-              <w:t xml:space="preserve">Whether RESEND_API_KEY and FL_NOTIFY_EMAIL are configured.</w:t>
+              <w:t xml:space="preserve">Ranked results + FastLocations Score + coordinates (no email).</w:t>
             </w:r>
           </w:p>
         </w:tc>
@@ -2920,7 +2266,7 @@
                 <w:sz w:val="19"/>
                 <w:szCs w:val="19"/>
               </w:rPr>
-              <w:t xml:space="preserve">POST /match?top=N</w:t>
+              <w:t xml:space="preserve">POST /submit</w:t>
             </w:r>
           </w:p>
         </w:tc>
@@ -2948,7 +2294,127 @@
                 <w:sz w:val="19"/>
                 <w:szCs w:val="19"/>
               </w:rPr>
-              <w:t xml:space="preserve">Ranked results for a ProjectCriteria body; also triggers the email.</w:t>
+              <w:t xml:space="preserve">Re-scores and emails the result to the submitter + FastLocations (Resend).</w:t>
+            </w:r>
+          </w:p>
+        </w:tc>
+      </w:tr>
+      <w:tr>
+        <w:tc>
+          <w:tcPr>
+            <w:tcW w:type="dxa" w:w="2400"/>
+            <w:tcBorders>
+              <w:top w:val="single" w:color="D5DCE6" w:sz="1"/>
+              <w:left w:val="single" w:color="D5DCE6" w:sz="1"/>
+              <w:bottom w:val="single" w:color="D5DCE6" w:sz="1"/>
+              <w:right w:val="single" w:color="D5DCE6" w:sz="1"/>
+            </w:tcBorders>
+            <w:shd w:fill="F4F7FB" w:val="clear"/>
+            <w:tcMar>
+              <w:top w:type="dxa" w:w="50"/>
+              <w:left w:type="dxa" w:w="110"/>
+              <w:bottom w:type="dxa" w:w="50"/>
+              <w:right w:type="dxa" w:w="110"/>
+            </w:tcMar>
+            <w:vAlign w:val="center"/>
+          </w:tcPr>
+          <w:p>
+            <w:r>
+              <w:rPr>
+                <w:rFonts w:ascii="Consolas" w:cs="Consolas" w:eastAsia="Consolas" w:hAnsi="Consolas"/>
+                <w:color w:val="39455A"/>
+                <w:sz w:val="19"/>
+                <w:szCs w:val="19"/>
+              </w:rPr>
+              <w:t xml:space="preserve">GET /places?q=</w:t>
+            </w:r>
+          </w:p>
+        </w:tc>
+        <w:tc>
+          <w:tcPr>
+            <w:tcW w:type="dxa" w:w="6960"/>
+            <w:tcBorders>
+              <w:top w:val="single" w:color="D5DCE6" w:sz="1"/>
+              <w:left w:val="single" w:color="D5DCE6" w:sz="1"/>
+              <w:bottom w:val="single" w:color="D5DCE6" w:sz="1"/>
+              <w:right w:val="single" w:color="D5DCE6" w:sz="1"/>
+            </w:tcBorders>
+            <w:shd w:fill="F4F7FB" w:val="clear"/>
+            <w:tcMar>
+              <w:top w:type="dxa" w:w="50"/>
+              <w:left w:type="dxa" w:w="110"/>
+              <w:bottom w:type="dxa" w:w="50"/>
+              <w:right w:type="dxa" w:w="110"/>
+            </w:tcMar>
+            <w:vAlign w:val="center"/>
+          </w:tcPr>
+          <w:p>
+            <w:r>
+              <w:rPr>
+                <w:sz w:val="19"/>
+                <w:szCs w:val="19"/>
+              </w:rPr>
+              <w:t xml:space="preserve">Autocomplete suggestions for the market-proximity field.</w:t>
+            </w:r>
+          </w:p>
+        </w:tc>
+      </w:tr>
+      <w:tr>
+        <w:tc>
+          <w:tcPr>
+            <w:tcW w:type="dxa" w:w="2400"/>
+            <w:tcBorders>
+              <w:top w:val="single" w:color="D5DCE6" w:sz="1"/>
+              <w:left w:val="single" w:color="D5DCE6" w:sz="1"/>
+              <w:bottom w:val="single" w:color="D5DCE6" w:sz="1"/>
+              <w:right w:val="single" w:color="D5DCE6" w:sz="1"/>
+            </w:tcBorders>
+            <w:shd w:fill="FFFFFF" w:val="clear"/>
+            <w:tcMar>
+              <w:top w:type="dxa" w:w="50"/>
+              <w:left w:type="dxa" w:w="110"/>
+              <w:bottom w:type="dxa" w:w="50"/>
+              <w:right w:type="dxa" w:w="110"/>
+            </w:tcMar>
+            <w:vAlign w:val="center"/>
+          </w:tcPr>
+          <w:p>
+            <w:r>
+              <w:rPr>
+                <w:rFonts w:ascii="Consolas" w:cs="Consolas" w:eastAsia="Consolas" w:hAnsi="Consolas"/>
+                <w:color w:val="39455A"/>
+                <w:sz w:val="19"/>
+                <w:szCs w:val="19"/>
+              </w:rPr>
+              <w:t xml:space="preserve">GET /health  /email-status</w:t>
+            </w:r>
+          </w:p>
+        </w:tc>
+        <w:tc>
+          <w:tcPr>
+            <w:tcW w:type="dxa" w:w="6960"/>
+            <w:tcBorders>
+              <w:top w:val="single" w:color="D5DCE6" w:sz="1"/>
+              <w:left w:val="single" w:color="D5DCE6" w:sz="1"/>
+              <w:bottom w:val="single" w:color="D5DCE6" w:sz="1"/>
+              <w:right w:val="single" w:color="D5DCE6" w:sz="1"/>
+            </w:tcBorders>
+            <w:shd w:fill="FFFFFF" w:val="clear"/>
+            <w:tcMar>
+              <w:top w:type="dxa" w:w="50"/>
+              <w:left w:type="dxa" w:w="110"/>
+              <w:bottom w:type="dxa" w:w="50"/>
+              <w:right w:type="dxa" w:w="110"/>
+            </w:tcMar>
+            <w:vAlign w:val="center"/>
+          </w:tcPr>
+          <w:p>
+            <w:r>
+              <w:rPr>
+                <w:sz w:val="19"/>
+                <w:szCs w:val="19"/>
+              </w:rPr>
+              <w:t xml:space="preserve">Data load status; whether Resend env vars are configured.</w:t>
             </w:r>
           </w:p>
         </w:tc>
@@ -2956,11 +2422,81 @@
     </w:tbl>
     <w:p>
       <w:pPr>
+        <w:spacing w:after="120" w:line="276"/>
+      </w:pPr>
+      <w:r>
+        <w:t xml:space="preserve">Email requires Railway variables </w:t>
+      </w:r>
+      <w:r>
+        <w:rPr>
+          <w:rFonts w:ascii="Consolas" w:cs="Consolas" w:eastAsia="Consolas" w:hAnsi="Consolas"/>
+          <w:color w:val="39455A"/>
+          <w:sz w:val="19"/>
+          <w:szCs w:val="19"/>
+        </w:rPr>
+        <w:t xml:space="preserve">RESEND_API_KEY</w:t>
+      </w:r>
+      <w:r>
+        <w:t xml:space="preserve">, </w:t>
+      </w:r>
+      <w:r>
+        <w:rPr>
+          <w:rFonts w:ascii="Consolas" w:cs="Consolas" w:eastAsia="Consolas" w:hAnsi="Consolas"/>
+          <w:color w:val="39455A"/>
+          <w:sz w:val="19"/>
+          <w:szCs w:val="19"/>
+        </w:rPr>
+        <w:t xml:space="preserve">FL_NOTIFY_EMAIL</w:t>
+      </w:r>
+      <w:r>
+        <w:t xml:space="preserve">, </w:t>
+      </w:r>
+      <w:r>
+        <w:rPr>
+          <w:rFonts w:ascii="Consolas" w:cs="Consolas" w:eastAsia="Consolas" w:hAnsi="Consolas"/>
+          <w:color w:val="39455A"/>
+          <w:sz w:val="19"/>
+          <w:szCs w:val="19"/>
+        </w:rPr>
+        <w:t xml:space="preserve">EMAIL_FROM</w:t>
+      </w:r>
+      <w:r>
+        <w:t xml:space="preserve">, plus verifying fastlocations.ai in Resend (otherwise only your own address receives mail). The build also needs </w:t>
+      </w:r>
+      <w:r>
+        <w:rPr>
+          <w:rFonts w:ascii="Consolas" w:cs="Consolas" w:eastAsia="Consolas" w:hAnsi="Consolas"/>
+          <w:color w:val="39455A"/>
+          <w:sz w:val="19"/>
+          <w:szCs w:val="19"/>
+        </w:rPr>
+        <w:t xml:space="preserve">MISE_PYTHON_GITHUB_ATTESTATIONS=false</w:t>
+      </w:r>
+      <w:r>
+        <w:t xml:space="preserve">.</w:t>
+      </w:r>
+    </w:p>
+    <w:p>
+      <w:r>
+        <w:br w:type="page"/>
+      </w:r>
+    </w:p>
+    <w:p>
+      <w:pPr>
+        <w:pStyle w:val="Heading1"/>
+        <w:spacing w:after="140" w:before="280"/>
+      </w:pPr>
+      <w:r>
+        <w:t xml:space="preserve">3. Scoring Methodology (the FastLocations Score)</w:t>
+      </w:r>
+    </w:p>
+    <w:p>
+      <w:pPr>
         <w:pStyle w:val="Heading2"/>
         <w:spacing w:after="100" w:before="220"/>
       </w:pPr>
       <w:r>
-        <w:t xml:space="preserve">2.8 Known Constraints</w:t>
+        <w:t xml:space="preserve">3.1 Principles</w:t>
       </w:r>
     </w:p>
     <w:p>
@@ -2973,7 +2509,14 @@
         <w:spacing w:after="60"/>
       </w:pPr>
       <w:r>
-        <w:t xml:space="preserve">Frontend JavaScript must be external and ASCII-only (host page-processor limitation).</w:t>
+        <w:rPr>
+          <w:b/>
+          <w:bCs/>
+        </w:rPr>
+        <w:t xml:space="preserve">Deterministic. </w:t>
+      </w:r>
+      <w:r>
+        <w:t xml:space="preserve">Identical inputs always produce identical scores.</w:t>
       </w:r>
     </w:p>
     <w:p>
@@ -2986,7 +2529,14 @@
         <w:spacing w:after="60"/>
       </w:pPr>
       <w:r>
-        <w:t xml:space="preserve">Market-proximity geocoding is local (bundled us_places.json) so it works from Railway without external calls.</w:t>
+        <w:rPr>
+          <w:b/>
+          <w:bCs/>
+        </w:rPr>
+        <w:t xml:space="preserve">Facts from data, never the model. </w:t>
+      </w:r>
+      <w:r>
+        <w:t xml:space="preserve">AI only writes the rationale after ranking.</w:t>
       </w:r>
     </w:p>
     <w:p>
@@ -2999,95 +2549,6 @@
         <w:spacing w:after="60"/>
       </w:pPr>
       <w:r>
-        <w:t xml:space="preserve">Raw data files exceed GitHub limits and are git-ignored; only precomputed files deploy.</w:t>
-      </w:r>
-    </w:p>
-    <w:p>
-      <w:pPr>
-        <w:pStyle w:val="ListParagraph"/>
-        <w:numPr>
-          <w:ilvl w:val="0"/>
-          <w:numId w:val="2"/>
-        </w:numPr>
-        <w:spacing w:after="60"/>
-      </w:pPr>
-      <w:r>
-        <w:t xml:space="preserve">Canadian data is limited to population, infrastructure, and provincial incentives (no US-style workforce/cost/safety metrics).</w:t>
-      </w:r>
-    </w:p>
-    <w:p>
-      <w:r>
-        <w:br w:type="page"/>
-      </w:r>
-    </w:p>
-    <w:p>
-      <w:pPr>
-        <w:pStyle w:val="Heading1"/>
-        <w:spacing w:after="140" w:before="280"/>
-      </w:pPr>
-      <w:r>
-        <w:t xml:space="preserve">3. Scoring Guidelines &amp; Methodology</w:t>
-      </w:r>
-    </w:p>
-    <w:p>
-      <w:pPr>
-        <w:pStyle w:val="Heading2"/>
-        <w:spacing w:after="100" w:before="220"/>
-      </w:pPr>
-      <w:r>
-        <w:t xml:space="preserve">3.1 Principles</w:t>
-      </w:r>
-    </w:p>
-    <w:p>
-      <w:pPr>
-        <w:pStyle w:val="ListParagraph"/>
-        <w:numPr>
-          <w:ilvl w:val="0"/>
-          <w:numId w:val="2"/>
-        </w:numPr>
-        <w:spacing w:after="60"/>
-      </w:pPr>
-      <w:r>
-        <w:rPr>
-          <w:b/>
-          <w:bCs/>
-        </w:rPr>
-        <w:t xml:space="preserve">Deterministic. </w:t>
-      </w:r>
-      <w:r>
-        <w:t xml:space="preserve">Every score is computed from data with a fixed formula; identical inputs always produce identical outputs.</w:t>
-      </w:r>
-    </w:p>
-    <w:p>
-      <w:pPr>
-        <w:pStyle w:val="ListParagraph"/>
-        <w:numPr>
-          <w:ilvl w:val="0"/>
-          <w:numId w:val="2"/>
-        </w:numPr>
-        <w:spacing w:after="60"/>
-      </w:pPr>
-      <w:r>
-        <w:rPr>
-          <w:b/>
-          <w:bCs/>
-        </w:rPr>
-        <w:t xml:space="preserve">Facts from data, never the model. </w:t>
-      </w:r>
-      <w:r>
-        <w:t xml:space="preserve">The AI layer only writes the rationale after ranking; it never invents or ranks.</w:t>
-      </w:r>
-    </w:p>
-    <w:p>
-      <w:pPr>
-        <w:pStyle w:val="ListParagraph"/>
-        <w:numPr>
-          <w:ilvl w:val="0"/>
-          <w:numId w:val="2"/>
-        </w:numPr>
-        <w:spacing w:after="60"/>
-      </w:pPr>
-      <w:r>
         <w:rPr>
           <w:b/>
           <w:bCs/>
@@ -3095,7 +2556,7 @@
         <w:t xml:space="preserve">Gaps never penalize. </w:t>
       </w:r>
       <w:r>
-        <w:t xml:space="preserve">Missing data for a dimension yields </w:t>
+        <w:t xml:space="preserve">Missing data -&gt; </w:t>
       </w:r>
       <w:r>
         <w:rPr>
@@ -3107,7 +2568,7 @@
         <w:t xml:space="preserve">null</w:t>
       </w:r>
       <w:r>
-        <w:t xml:space="preserve">; weights are renormalized over the dimensions that do have data.</w:t>
+        <w:t xml:space="preserve">; weights renormalize over the dimensions that have data.</w:t>
       </w:r>
     </w:p>
     <w:p>
@@ -3127,7 +2588,7 @@
         <w:t xml:space="preserve">Customer-routable only. </w:t>
       </w:r>
       <w:r>
-        <w:t xml:space="preserve">Only counties/CDs served by an EDO customer are ranked, so every result has a lead destination.</w:t>
+        <w:t xml:space="preserve">Only counties/CDs served by an EDO customer are ranked.</w:t>
       </w:r>
     </w:p>
     <w:p>
@@ -3144,7 +2605,7 @@
         <w:spacing w:after="120" w:line="276"/>
       </w:pPr>
       <w:r>
-        <w:t xml:space="preserve">1) Parse criteria  →  2) Apply hard filters  →  3) Compute a 0–100 sub-score per dimension per candidate  →  4) Weighted total (renormalized over non-null dimensions)  →  5) Preferred-region bonus  →  6) Roll the county/CD up to its serving EDO  →  7) Write the rationale  →  8) Email the result.</w:t>
+        <w:t xml:space="preserve">Parse criteria -&gt; apply hard filters -&gt; 0–100 sub-score per dimension (percentile rank across the filtered set) -&gt; weighted total = FastLocations Score (renormalized over non-null dimensions) -&gt; preferred-region bonus -&gt; roll up to the serving EDO -&gt; rationale -&gt; locator map -&gt; optional email.</w:t>
       </w:r>
     </w:p>
     <w:p>
@@ -3153,7 +2614,7 @@
         <w:spacing w:after="100" w:before="220"/>
       </w:pPr>
       <w:r>
-        <w:t xml:space="preserve">3.3 Hard Filters (applied before scoring)</w:t>
+        <w:t xml:space="preserve">3.3 Hard Filters (before scoring)</w:t>
       </w:r>
     </w:p>
     <w:p>
@@ -3166,14 +2627,7 @@
         <w:spacing w:after="60"/>
       </w:pPr>
       <w:r>
-        <w:rPr>
-          <w:b/>
-          <w:bCs/>
-        </w:rPr>
-        <w:t xml:space="preserve">Required states/provinces </w:t>
-      </w:r>
-      <w:r>
-        <w:t xml:space="preserve">— only these are scored. Excluded — removed. (Preferred is a bonus, not a filter.)</w:t>
+        <w:t xml:space="preserve">Required / excluded states (preferred is a bonus, not a filter); demographic thresholds (min population / labor force); port / airport requirements.</w:t>
       </w:r>
     </w:p>
     <w:p>
@@ -3190,70 +2644,10 @@
           <w:b/>
           <w:bCs/>
         </w:rPr>
-        <w:t xml:space="preserve">Demographic thresholds </w:t>
-      </w:r>
-      <w:r>
-        <w:t xml:space="preserve">— minimum population / labor force, applied only where the datum exists.</w:t>
-      </w:r>
-    </w:p>
-    <w:p>
-      <w:pPr>
-        <w:pStyle w:val="ListParagraph"/>
-        <w:numPr>
-          <w:ilvl w:val="0"/>
-          <w:numId w:val="2"/>
-        </w:numPr>
-        <w:spacing w:after="60"/>
-      </w:pPr>
-      <w:r>
-        <w:rPr>
-          <w:b/>
-          <w:bCs/>
-        </w:rPr>
-        <w:t xml:space="preserve">Infrastructure requirements </w:t>
-      </w:r>
-      <w:r>
-        <w:t xml:space="preserve">— port access, commercial airport presence.</w:t>
-      </w:r>
-    </w:p>
-    <w:p>
-      <w:pPr>
-        <w:pStyle w:val="ListParagraph"/>
-        <w:numPr>
-          <w:ilvl w:val="0"/>
-          <w:numId w:val="2"/>
-        </w:numPr>
-        <w:spacing w:after="60"/>
-      </w:pPr>
-      <w:r>
-        <w:rPr>
-          <w:b/>
-          <w:bCs/>
-        </w:rPr>
         <w:t xml:space="preserve">Market proximity </w:t>
       </w:r>
       <w:r>
-        <w:t xml:space="preserve">— geocode the named place, keep candidates whose county centroid is within the radius (true distance, not state lines).</w:t>
-      </w:r>
-    </w:p>
-    <w:p>
-      <w:pPr>
-        <w:pStyle w:val="ListParagraph"/>
-        <w:numPr>
-          <w:ilvl w:val="0"/>
-          <w:numId w:val="2"/>
-        </w:numPr>
-        <w:spacing w:after="60"/>
-      </w:pPr>
-      <w:r>
-        <w:rPr>
-          <w:b/>
-          <w:bCs/>
-        </w:rPr>
-        <w:t xml:space="preserve">Customer EDO </w:t>
-      </w:r>
-      <w:r>
-        <w:t xml:space="preserve">— candidate must be served by an organization in the customer list.</w:t>
+        <w:t xml:space="preserve">— geocodes the named place from a bundled 64k-place index (offline, no external call) and keeps counties whose centroid is within the radius (true distance).</w:t>
       </w:r>
     </w:p>
     <w:p>
@@ -3262,7 +2656,7 @@
         <w:spacing w:after="100" w:before="220"/>
       </w:pPr>
       <w:r>
-        <w:t xml:space="preserve">3.4 The Eight Dimensions</w:t>
+        <w:t xml:space="preserve">3.4 The Ten Dimensions</w:t>
       </w:r>
     </w:p>
     <w:p>
@@ -3270,7 +2664,7 @@
         <w:spacing w:after="120" w:line="276"/>
       </w:pPr>
       <w:r>
-        <w:t xml:space="preserve">Each dimension is the average of its metrics' percentile ranks across the filtered candidate set. Higher is always better; cost-like and risk-like metrics are inverted (e.g., lower crime ranks higher).</w:t>
+        <w:t xml:space="preserve">Each dimension is the average of its metrics' percentile ranks across the filtered candidates; cost- and risk-like metrics are inverted (lower is better).</w:t>
       </w:r>
     </w:p>
     <w:tbl>
@@ -3286,8 +2680,8 @@
         </w:tblBorders>
       </w:tblPr>
       <w:tblGrid>
-        <w:gridCol w:w="1700"/>
-        <w:gridCol w:w="5300"/>
+        <w:gridCol w:w="1750"/>
+        <w:gridCol w:w="5250"/>
         <w:gridCol w:w="2360"/>
       </w:tblGrid>
       <w:tr>
@@ -3296,7 +2690,7 @@
         </w:trPr>
         <w:tc>
           <w:tcPr>
-            <w:tcW w:type="dxa" w:w="1700"/>
+            <w:tcW w:type="dxa" w:w="1750"/>
             <w:tcBorders>
               <w:top w:val="single" w:color="D5DCE6" w:sz="1"/>
               <w:left w:val="single" w:color="D5DCE6" w:sz="1"/>
@@ -3326,7 +2720,7 @@
         </w:tc>
         <w:tc>
           <w:tcPr>
-            <w:tcW w:type="dxa" w:w="5300"/>
+            <w:tcW w:type="dxa" w:w="5250"/>
             <w:tcBorders>
               <w:top w:val="single" w:color="D5DCE6" w:sz="1"/>
               <w:left w:val="single" w:color="D5DCE6" w:sz="1"/>
@@ -3388,7 +2782,7 @@
       <w:tr>
         <w:tc>
           <w:tcPr>
-            <w:tcW w:type="dxa" w:w="1700"/>
+            <w:tcW w:type="dxa" w:w="1750"/>
             <w:tcBorders>
               <w:top w:val="single" w:color="D5DCE6" w:sz="1"/>
               <w:left w:val="single" w:color="D5DCE6" w:sz="1"/>
@@ -3416,29 +2810,29 @@
         </w:tc>
         <w:tc>
           <w:tcPr>
-            <w:tcW w:type="dxa" w:w="5300"/>
-            <w:tcBorders>
-              <w:top w:val="single" w:color="D5DCE6" w:sz="1"/>
-              <w:left w:val="single" w:color="D5DCE6" w:sz="1"/>
-              <w:bottom w:val="single" w:color="D5DCE6" w:sz="1"/>
-              <w:right w:val="single" w:color="D5DCE6" w:sz="1"/>
-            </w:tcBorders>
-            <w:shd w:fill="FFFFFF" w:val="clear"/>
-            <w:tcMar>
-              <w:top w:type="dxa" w:w="50"/>
-              <w:left w:type="dxa" w:w="110"/>
-              <w:bottom w:type="dxa" w:w="50"/>
-              <w:right w:type="dxa" w:w="110"/>
-            </w:tcMar>
-            <w:vAlign w:val="center"/>
-          </w:tcPr>
-          <w:p>
-            <w:r>
-              <w:rPr>
-                <w:sz w:val="19"/>
-                <w:szCs w:val="19"/>
-              </w:rPr>
-              <w:t xml:space="preserve">Labor availability (unemployment), labor-pool adequacy vs. headcount, prime working-age share, Critical Thinking score, Social Deprivation Index</w:t>
+            <w:tcW w:type="dxa" w:w="5250"/>
+            <w:tcBorders>
+              <w:top w:val="single" w:color="D5DCE6" w:sz="1"/>
+              <w:left w:val="single" w:color="D5DCE6" w:sz="1"/>
+              <w:bottom w:val="single" w:color="D5DCE6" w:sz="1"/>
+              <w:right w:val="single" w:color="D5DCE6" w:sz="1"/>
+            </w:tcBorders>
+            <w:shd w:fill="FFFFFF" w:val="clear"/>
+            <w:tcMar>
+              <w:top w:type="dxa" w:w="50"/>
+              <w:left w:type="dxa" w:w="110"/>
+              <w:bottom w:type="dxa" w:w="50"/>
+              <w:right w:type="dxa" w:w="110"/>
+            </w:tcMar>
+            <w:vAlign w:val="center"/>
+          </w:tcPr>
+          <w:p>
+            <w:r>
+              <w:rPr>
+                <w:sz w:val="19"/>
+                <w:szCs w:val="19"/>
+              </w:rPr>
+              <w:t xml:space="preserve">Labor availability (low unemployment), labor-pool adequacy vs. headcount, prime working-age share, Critical Thinking score</w:t>
             </w:r>
           </w:p>
         </w:tc>
@@ -3474,57 +2868,57 @@
       <w:tr>
         <w:tc>
           <w:tcPr>
-            <w:tcW w:type="dxa" w:w="1700"/>
-            <w:tcBorders>
-              <w:top w:val="single" w:color="D5DCE6" w:sz="1"/>
-              <w:left w:val="single" w:color="D5DCE6" w:sz="1"/>
-              <w:bottom w:val="single" w:color="D5DCE6" w:sz="1"/>
-              <w:right w:val="single" w:color="D5DCE6" w:sz="1"/>
-            </w:tcBorders>
-            <w:shd w:fill="F4F7FB" w:val="clear"/>
-            <w:tcMar>
-              <w:top w:type="dxa" w:w="50"/>
-              <w:left w:type="dxa" w:w="110"/>
-              <w:bottom w:type="dxa" w:w="50"/>
-              <w:right w:type="dxa" w:w="110"/>
-            </w:tcMar>
-            <w:vAlign w:val="center"/>
-          </w:tcPr>
-          <w:p>
-            <w:r>
-              <w:rPr>
-                <w:sz w:val="19"/>
-                <w:szCs w:val="19"/>
-              </w:rPr>
-              <w:t xml:space="preserve">Demographics</w:t>
-            </w:r>
-          </w:p>
-        </w:tc>
-        <w:tc>
-          <w:tcPr>
-            <w:tcW w:type="dxa" w:w="5300"/>
-            <w:tcBorders>
-              <w:top w:val="single" w:color="D5DCE6" w:sz="1"/>
-              <w:left w:val="single" w:color="D5DCE6" w:sz="1"/>
-              <w:bottom w:val="single" w:color="D5DCE6" w:sz="1"/>
-              <w:right w:val="single" w:color="D5DCE6" w:sz="1"/>
-            </w:tcBorders>
-            <w:shd w:fill="F4F7FB" w:val="clear"/>
-            <w:tcMar>
-              <w:top w:type="dxa" w:w="50"/>
-              <w:left w:type="dxa" w:w="110"/>
-              <w:bottom w:type="dxa" w:w="50"/>
-              <w:right w:type="dxa" w:w="110"/>
-            </w:tcMar>
-            <w:vAlign w:val="center"/>
-          </w:tcPr>
-          <w:p>
-            <w:r>
-              <w:rPr>
-                <w:sz w:val="19"/>
-                <w:szCs w:val="19"/>
-              </w:rPr>
-              <w:t xml:space="preserve">Population, labor force, educational attainment, growth, poverty, household poverty, infant mortality</w:t>
+            <w:tcW w:type="dxa" w:w="1750"/>
+            <w:tcBorders>
+              <w:top w:val="single" w:color="D5DCE6" w:sz="1"/>
+              <w:left w:val="single" w:color="D5DCE6" w:sz="1"/>
+              <w:bottom w:val="single" w:color="D5DCE6" w:sz="1"/>
+              <w:right w:val="single" w:color="D5DCE6" w:sz="1"/>
+            </w:tcBorders>
+            <w:shd w:fill="F4F7FB" w:val="clear"/>
+            <w:tcMar>
+              <w:top w:type="dxa" w:w="50"/>
+              <w:left w:type="dxa" w:w="110"/>
+              <w:bottom w:type="dxa" w:w="50"/>
+              <w:right w:type="dxa" w:w="110"/>
+            </w:tcMar>
+            <w:vAlign w:val="center"/>
+          </w:tcPr>
+          <w:p>
+            <w:r>
+              <w:rPr>
+                <w:sz w:val="19"/>
+                <w:szCs w:val="19"/>
+              </w:rPr>
+              <w:t xml:space="preserve">Cost</w:t>
+            </w:r>
+          </w:p>
+        </w:tc>
+        <w:tc>
+          <w:tcPr>
+            <w:tcW w:type="dxa" w:w="5250"/>
+            <w:tcBorders>
+              <w:top w:val="single" w:color="D5DCE6" w:sz="1"/>
+              <w:left w:val="single" w:color="D5DCE6" w:sz="1"/>
+              <w:bottom w:val="single" w:color="D5DCE6" w:sz="1"/>
+              <w:right w:val="single" w:color="D5DCE6" w:sz="1"/>
+            </w:tcBorders>
+            <w:shd w:fill="F4F7FB" w:val="clear"/>
+            <w:tcMar>
+              <w:top w:type="dxa" w:w="50"/>
+              <w:left w:type="dxa" w:w="110"/>
+              <w:bottom w:type="dxa" w:w="50"/>
+              <w:right w:type="dxa" w:w="110"/>
+            </w:tcMar>
+            <w:vAlign w:val="center"/>
+          </w:tcPr>
+          <w:p>
+            <w:r>
+              <w:rPr>
+                <w:sz w:val="19"/>
+                <w:szCs w:val="19"/>
+              </w:rPr>
+              <w:t xml:space="preserve">Labor cost (median income), cost of living (wealth index)</w:t>
             </w:r>
           </w:p>
         </w:tc>
@@ -3552,7 +2946,7 @@
                 <w:sz w:val="19"/>
                 <w:szCs w:val="19"/>
               </w:rPr>
-              <w:t xml:space="preserve">Higher / inverted</w:t>
+              <w:t xml:space="preserve">Inverted</w:t>
             </w:r>
           </w:p>
         </w:tc>
@@ -3560,57 +2954,57 @@
       <w:tr>
         <w:tc>
           <w:tcPr>
-            <w:tcW w:type="dxa" w:w="1700"/>
-            <w:tcBorders>
-              <w:top w:val="single" w:color="D5DCE6" w:sz="1"/>
-              <w:left w:val="single" w:color="D5DCE6" w:sz="1"/>
-              <w:bottom w:val="single" w:color="D5DCE6" w:sz="1"/>
-              <w:right w:val="single" w:color="D5DCE6" w:sz="1"/>
-            </w:tcBorders>
-            <w:shd w:fill="FFFFFF" w:val="clear"/>
-            <w:tcMar>
-              <w:top w:type="dxa" w:w="50"/>
-              <w:left w:type="dxa" w:w="110"/>
-              <w:bottom w:type="dxa" w:w="50"/>
-              <w:right w:type="dxa" w:w="110"/>
-            </w:tcMar>
-            <w:vAlign w:val="center"/>
-          </w:tcPr>
-          <w:p>
-            <w:r>
-              <w:rPr>
-                <w:sz w:val="19"/>
-                <w:szCs w:val="19"/>
-              </w:rPr>
-              <w:t xml:space="preserve">Logistics</w:t>
-            </w:r>
-          </w:p>
-        </w:tc>
-        <w:tc>
-          <w:tcPr>
-            <w:tcW w:type="dxa" w:w="5300"/>
-            <w:tcBorders>
-              <w:top w:val="single" w:color="D5DCE6" w:sz="1"/>
-              <w:left w:val="single" w:color="D5DCE6" w:sz="1"/>
-              <w:bottom w:val="single" w:color="D5DCE6" w:sz="1"/>
-              <w:right w:val="single" w:color="D5DCE6" w:sz="1"/>
-            </w:tcBorders>
-            <w:shd w:fill="FFFFFF" w:val="clear"/>
-            <w:tcMar>
-              <w:top w:type="dxa" w:w="50"/>
-              <w:left w:type="dxa" w:w="110"/>
-              <w:bottom w:type="dxa" w:w="50"/>
-              <w:right w:type="dxa" w:w="110"/>
-            </w:tcMar>
-            <w:vAlign w:val="center"/>
-          </w:tcPr>
-          <w:p>
-            <w:r>
-              <w:rPr>
-                <w:sz w:val="19"/>
-                <w:szCs w:val="19"/>
-              </w:rPr>
-              <w:t xml:space="preserve">Airport capacity (class-weighted), enplanements, port tonnage, mean commute time</w:t>
+            <w:tcW w:type="dxa" w:w="1750"/>
+            <w:tcBorders>
+              <w:top w:val="single" w:color="D5DCE6" w:sz="1"/>
+              <w:left w:val="single" w:color="D5DCE6" w:sz="1"/>
+              <w:bottom w:val="single" w:color="D5DCE6" w:sz="1"/>
+              <w:right w:val="single" w:color="D5DCE6" w:sz="1"/>
+            </w:tcBorders>
+            <w:shd w:fill="FFFFFF" w:val="clear"/>
+            <w:tcMar>
+              <w:top w:type="dxa" w:w="50"/>
+              <w:left w:type="dxa" w:w="110"/>
+              <w:bottom w:type="dxa" w:w="50"/>
+              <w:right w:type="dxa" w:w="110"/>
+            </w:tcMar>
+            <w:vAlign w:val="center"/>
+          </w:tcPr>
+          <w:p>
+            <w:r>
+              <w:rPr>
+                <w:sz w:val="19"/>
+                <w:szCs w:val="19"/>
+              </w:rPr>
+              <w:t xml:space="preserve">Real estate</w:t>
+            </w:r>
+          </w:p>
+        </w:tc>
+        <w:tc>
+          <w:tcPr>
+            <w:tcW w:type="dxa" w:w="5250"/>
+            <w:tcBorders>
+              <w:top w:val="single" w:color="D5DCE6" w:sz="1"/>
+              <w:left w:val="single" w:color="D5DCE6" w:sz="1"/>
+              <w:bottom w:val="single" w:color="D5DCE6" w:sz="1"/>
+              <w:right w:val="single" w:color="D5DCE6" w:sz="1"/>
+            </w:tcBorders>
+            <w:shd w:fill="FFFFFF" w:val="clear"/>
+            <w:tcMar>
+              <w:top w:type="dxa" w:w="50"/>
+              <w:left w:type="dxa" w:w="110"/>
+              <w:bottom w:type="dxa" w:w="50"/>
+              <w:right w:type="dxa" w:w="110"/>
+            </w:tcMar>
+            <w:vAlign w:val="center"/>
+          </w:tcPr>
+          <w:p>
+            <w:r>
+              <w:rPr>
+                <w:sz w:val="19"/>
+                <w:szCs w:val="19"/>
+              </w:rPr>
+              <w:t xml:space="preserve">Effective property-tax rate</w:t>
             </w:r>
           </w:p>
         </w:tc>
@@ -3638,7 +3032,7 @@
                 <w:sz w:val="19"/>
                 <w:szCs w:val="19"/>
               </w:rPr>
-              <w:t xml:space="preserve">Higher / inverted</w:t>
+              <w:t xml:space="preserve">Inverted</w:t>
             </w:r>
           </w:p>
         </w:tc>
@@ -3646,7 +3040,7 @@
       <w:tr>
         <w:tc>
           <w:tcPr>
-            <w:tcW w:type="dxa" w:w="1700"/>
+            <w:tcW w:type="dxa" w:w="1750"/>
             <w:tcBorders>
               <w:top w:val="single" w:color="D5DCE6" w:sz="1"/>
               <w:left w:val="single" w:color="D5DCE6" w:sz="1"/>
@@ -3674,7 +3068,7 @@
         </w:tc>
         <w:tc>
           <w:tcPr>
-            <w:tcW w:type="dxa" w:w="5300"/>
+            <w:tcW w:type="dxa" w:w="5250"/>
             <w:tcBorders>
               <w:top w:val="single" w:color="D5DCE6" w:sz="1"/>
               <w:left w:val="single" w:color="D5DCE6" w:sz="1"/>
@@ -3732,57 +3126,57 @@
       <w:tr>
         <w:tc>
           <w:tcPr>
-            <w:tcW w:type="dxa" w:w="1700"/>
-            <w:tcBorders>
-              <w:top w:val="single" w:color="D5DCE6" w:sz="1"/>
-              <w:left w:val="single" w:color="D5DCE6" w:sz="1"/>
-              <w:bottom w:val="single" w:color="D5DCE6" w:sz="1"/>
-              <w:right w:val="single" w:color="D5DCE6" w:sz="1"/>
-            </w:tcBorders>
-            <w:shd w:fill="FFFFFF" w:val="clear"/>
-            <w:tcMar>
-              <w:top w:type="dxa" w:w="50"/>
-              <w:left w:type="dxa" w:w="110"/>
-              <w:bottom w:type="dxa" w:w="50"/>
-              <w:right w:type="dxa" w:w="110"/>
-            </w:tcMar>
-            <w:vAlign w:val="center"/>
-          </w:tcPr>
-          <w:p>
-            <w:r>
-              <w:rPr>
-                <w:sz w:val="19"/>
-                <w:szCs w:val="19"/>
-              </w:rPr>
-              <w:t xml:space="preserve">Cost</w:t>
-            </w:r>
-          </w:p>
-        </w:tc>
-        <w:tc>
-          <w:tcPr>
-            <w:tcW w:type="dxa" w:w="5300"/>
-            <w:tcBorders>
-              <w:top w:val="single" w:color="D5DCE6" w:sz="1"/>
-              <w:left w:val="single" w:color="D5DCE6" w:sz="1"/>
-              <w:bottom w:val="single" w:color="D5DCE6" w:sz="1"/>
-              <w:right w:val="single" w:color="D5DCE6" w:sz="1"/>
-            </w:tcBorders>
-            <w:shd w:fill="FFFFFF" w:val="clear"/>
-            <w:tcMar>
-              <w:top w:type="dxa" w:w="50"/>
-              <w:left w:type="dxa" w:w="110"/>
-              <w:bottom w:type="dxa" w:w="50"/>
-              <w:right w:type="dxa" w:w="110"/>
-            </w:tcMar>
-            <w:vAlign w:val="center"/>
-          </w:tcPr>
-          <w:p>
-            <w:r>
-              <w:rPr>
-                <w:sz w:val="19"/>
-                <w:szCs w:val="19"/>
-              </w:rPr>
-              <w:t xml:space="preserve">Labor cost (median income), cost of living (wealth index)</w:t>
+            <w:tcW w:type="dxa" w:w="1750"/>
+            <w:tcBorders>
+              <w:top w:val="single" w:color="D5DCE6" w:sz="1"/>
+              <w:left w:val="single" w:color="D5DCE6" w:sz="1"/>
+              <w:bottom w:val="single" w:color="D5DCE6" w:sz="1"/>
+              <w:right w:val="single" w:color="D5DCE6" w:sz="1"/>
+            </w:tcBorders>
+            <w:shd w:fill="FFFFFF" w:val="clear"/>
+            <w:tcMar>
+              <w:top w:type="dxa" w:w="50"/>
+              <w:left w:type="dxa" w:w="110"/>
+              <w:bottom w:type="dxa" w:w="50"/>
+              <w:right w:type="dxa" w:w="110"/>
+            </w:tcMar>
+            <w:vAlign w:val="center"/>
+          </w:tcPr>
+          <w:p>
+            <w:r>
+              <w:rPr>
+                <w:sz w:val="19"/>
+                <w:szCs w:val="19"/>
+              </w:rPr>
+              <w:t xml:space="preserve">Infrastructure</w:t>
+            </w:r>
+          </w:p>
+        </w:tc>
+        <w:tc>
+          <w:tcPr>
+            <w:tcW w:type="dxa" w:w="5250"/>
+            <w:tcBorders>
+              <w:top w:val="single" w:color="D5DCE6" w:sz="1"/>
+              <w:left w:val="single" w:color="D5DCE6" w:sz="1"/>
+              <w:bottom w:val="single" w:color="D5DCE6" w:sz="1"/>
+              <w:right w:val="single" w:color="D5DCE6" w:sz="1"/>
+            </w:tcBorders>
+            <w:shd w:fill="FFFFFF" w:val="clear"/>
+            <w:tcMar>
+              <w:top w:type="dxa" w:w="50"/>
+              <w:left w:type="dxa" w:w="110"/>
+              <w:bottom w:type="dxa" w:w="50"/>
+              <w:right w:type="dxa" w:w="110"/>
+            </w:tcMar>
+            <w:vAlign w:val="center"/>
+          </w:tcPr>
+          <w:p>
+            <w:r>
+              <w:rPr>
+                <w:sz w:val="19"/>
+                <w:szCs w:val="19"/>
+              </w:rPr>
+              <w:t xml:space="preserve">ASCE Infrastructure Report Card state GPA (broadcast to counties)</w:t>
             </w:r>
           </w:p>
         </w:tc>
@@ -3810,7 +3204,7 @@
                 <w:sz w:val="19"/>
                 <w:szCs w:val="19"/>
               </w:rPr>
-              <w:t xml:space="preserve">Inverted</w:t>
+              <w:t xml:space="preserve">Higher</w:t>
             </w:r>
           </w:p>
         </w:tc>
@@ -3818,57 +3212,57 @@
       <w:tr>
         <w:tc>
           <w:tcPr>
-            <w:tcW w:type="dxa" w:w="1700"/>
-            <w:tcBorders>
-              <w:top w:val="single" w:color="D5DCE6" w:sz="1"/>
-              <w:left w:val="single" w:color="D5DCE6" w:sz="1"/>
-              <w:bottom w:val="single" w:color="D5DCE6" w:sz="1"/>
-              <w:right w:val="single" w:color="D5DCE6" w:sz="1"/>
-            </w:tcBorders>
-            <w:shd w:fill="F4F7FB" w:val="clear"/>
-            <w:tcMar>
-              <w:top w:type="dxa" w:w="50"/>
-              <w:left w:type="dxa" w:w="110"/>
-              <w:bottom w:type="dxa" w:w="50"/>
-              <w:right w:type="dxa" w:w="110"/>
-            </w:tcMar>
-            <w:vAlign w:val="center"/>
-          </w:tcPr>
-          <w:p>
-            <w:r>
-              <w:rPr>
-                <w:sz w:val="19"/>
-                <w:szCs w:val="19"/>
-              </w:rPr>
-              <w:t xml:space="preserve">Safety</w:t>
-            </w:r>
-          </w:p>
-        </w:tc>
-        <w:tc>
-          <w:tcPr>
-            <w:tcW w:type="dxa" w:w="5300"/>
-            <w:tcBorders>
-              <w:top w:val="single" w:color="D5DCE6" w:sz="1"/>
-              <w:left w:val="single" w:color="D5DCE6" w:sz="1"/>
-              <w:bottom w:val="single" w:color="D5DCE6" w:sz="1"/>
-              <w:right w:val="single" w:color="D5DCE6" w:sz="1"/>
-            </w:tcBorders>
-            <w:shd w:fill="F4F7FB" w:val="clear"/>
-            <w:tcMar>
-              <w:top w:type="dxa" w:w="50"/>
-              <w:left w:type="dxa" w:w="110"/>
-              <w:bottom w:type="dxa" w:w="50"/>
-              <w:right w:type="dxa" w:w="110"/>
-            </w:tcMar>
-            <w:vAlign w:val="center"/>
-          </w:tcPr>
-          <w:p>
-            <w:r>
-              <w:rPr>
-                <w:sz w:val="19"/>
-                <w:szCs w:val="19"/>
-              </w:rPr>
-              <w:t xml:space="preserve">Crime rate</w:t>
+            <w:tcW w:type="dxa" w:w="1750"/>
+            <w:tcBorders>
+              <w:top w:val="single" w:color="D5DCE6" w:sz="1"/>
+              <w:left w:val="single" w:color="D5DCE6" w:sz="1"/>
+              <w:bottom w:val="single" w:color="D5DCE6" w:sz="1"/>
+              <w:right w:val="single" w:color="D5DCE6" w:sz="1"/>
+            </w:tcBorders>
+            <w:shd w:fill="F4F7FB" w:val="clear"/>
+            <w:tcMar>
+              <w:top w:type="dxa" w:w="50"/>
+              <w:left w:type="dxa" w:w="110"/>
+              <w:bottom w:type="dxa" w:w="50"/>
+              <w:right w:type="dxa" w:w="110"/>
+            </w:tcMar>
+            <w:vAlign w:val="center"/>
+          </w:tcPr>
+          <w:p>
+            <w:r>
+              <w:rPr>
+                <w:sz w:val="19"/>
+                <w:szCs w:val="19"/>
+              </w:rPr>
+              <w:t xml:space="preserve">Livability</w:t>
+            </w:r>
+          </w:p>
+        </w:tc>
+        <w:tc>
+          <w:tcPr>
+            <w:tcW w:type="dxa" w:w="5250"/>
+            <w:tcBorders>
+              <w:top w:val="single" w:color="D5DCE6" w:sz="1"/>
+              <w:left w:val="single" w:color="D5DCE6" w:sz="1"/>
+              <w:bottom w:val="single" w:color="D5DCE6" w:sz="1"/>
+              <w:right w:val="single" w:color="D5DCE6" w:sz="1"/>
+            </w:tcBorders>
+            <w:shd w:fill="F4F7FB" w:val="clear"/>
+            <w:tcMar>
+              <w:top w:type="dxa" w:w="50"/>
+              <w:left w:type="dxa" w:w="110"/>
+              <w:bottom w:type="dxa" w:w="50"/>
+              <w:right w:type="dxa" w:w="110"/>
+            </w:tcMar>
+            <w:vAlign w:val="center"/>
+          </w:tcPr>
+          <w:p>
+            <w:r>
+              <w:rPr>
+                <w:sz w:val="19"/>
+                <w:szCs w:val="19"/>
+              </w:rPr>
+              <w:t xml:space="preserve">County Health Rankings: premature death, poor/fair health, poor physical &amp; mental health days, life expectancy</w:t>
             </w:r>
           </w:p>
         </w:tc>
@@ -3896,7 +3290,7 @@
                 <w:sz w:val="19"/>
                 <w:szCs w:val="19"/>
               </w:rPr>
-              <w:t xml:space="preserve">Inverted</w:t>
+              <w:t xml:space="preserve">Higher / inverted</w:t>
             </w:r>
           </w:p>
         </w:tc>
@@ -3904,57 +3298,57 @@
       <w:tr>
         <w:tc>
           <w:tcPr>
-            <w:tcW w:type="dxa" w:w="1700"/>
-            <w:tcBorders>
-              <w:top w:val="single" w:color="D5DCE6" w:sz="1"/>
-              <w:left w:val="single" w:color="D5DCE6" w:sz="1"/>
-              <w:bottom w:val="single" w:color="D5DCE6" w:sz="1"/>
-              <w:right w:val="single" w:color="D5DCE6" w:sz="1"/>
-            </w:tcBorders>
-            <w:shd w:fill="FFFFFF" w:val="clear"/>
-            <w:tcMar>
-              <w:top w:type="dxa" w:w="50"/>
-              <w:left w:type="dxa" w:w="110"/>
-              <w:bottom w:type="dxa" w:w="50"/>
-              <w:right w:type="dxa" w:w="110"/>
-            </w:tcMar>
-            <w:vAlign w:val="center"/>
-          </w:tcPr>
-          <w:p>
-            <w:r>
-              <w:rPr>
-                <w:sz w:val="19"/>
-                <w:szCs w:val="19"/>
-              </w:rPr>
-              <w:t xml:space="preserve">Real estate</w:t>
-            </w:r>
-          </w:p>
-        </w:tc>
-        <w:tc>
-          <w:tcPr>
-            <w:tcW w:type="dxa" w:w="5300"/>
-            <w:tcBorders>
-              <w:top w:val="single" w:color="D5DCE6" w:sz="1"/>
-              <w:left w:val="single" w:color="D5DCE6" w:sz="1"/>
-              <w:bottom w:val="single" w:color="D5DCE6" w:sz="1"/>
-              <w:right w:val="single" w:color="D5DCE6" w:sz="1"/>
-            </w:tcBorders>
-            <w:shd w:fill="FFFFFF" w:val="clear"/>
-            <w:tcMar>
-              <w:top w:type="dxa" w:w="50"/>
-              <w:left w:type="dxa" w:w="110"/>
-              <w:bottom w:type="dxa" w:w="50"/>
-              <w:right w:type="dxa" w:w="110"/>
-            </w:tcMar>
-            <w:vAlign w:val="center"/>
-          </w:tcPr>
-          <w:p>
-            <w:r>
-              <w:rPr>
-                <w:sz w:val="19"/>
-                <w:szCs w:val="19"/>
-              </w:rPr>
-              <w:t xml:space="preserve">Effective property-tax rate</w:t>
+            <w:tcW w:type="dxa" w:w="1750"/>
+            <w:tcBorders>
+              <w:top w:val="single" w:color="D5DCE6" w:sz="1"/>
+              <w:left w:val="single" w:color="D5DCE6" w:sz="1"/>
+              <w:bottom w:val="single" w:color="D5DCE6" w:sz="1"/>
+              <w:right w:val="single" w:color="D5DCE6" w:sz="1"/>
+            </w:tcBorders>
+            <w:shd w:fill="FFFFFF" w:val="clear"/>
+            <w:tcMar>
+              <w:top w:type="dxa" w:w="50"/>
+              <w:left w:type="dxa" w:w="110"/>
+              <w:bottom w:type="dxa" w:w="50"/>
+              <w:right w:type="dxa" w:w="110"/>
+            </w:tcMar>
+            <w:vAlign w:val="center"/>
+          </w:tcPr>
+          <w:p>
+            <w:r>
+              <w:rPr>
+                <w:sz w:val="19"/>
+                <w:szCs w:val="19"/>
+              </w:rPr>
+              <w:t xml:space="preserve">Market size</w:t>
+            </w:r>
+          </w:p>
+        </w:tc>
+        <w:tc>
+          <w:tcPr>
+            <w:tcW w:type="dxa" w:w="5250"/>
+            <w:tcBorders>
+              <w:top w:val="single" w:color="D5DCE6" w:sz="1"/>
+              <w:left w:val="single" w:color="D5DCE6" w:sz="1"/>
+              <w:bottom w:val="single" w:color="D5DCE6" w:sz="1"/>
+              <w:right w:val="single" w:color="D5DCE6" w:sz="1"/>
+            </w:tcBorders>
+            <w:shd w:fill="FFFFFF" w:val="clear"/>
+            <w:tcMar>
+              <w:top w:type="dxa" w:w="50"/>
+              <w:left w:type="dxa" w:w="110"/>
+              <w:bottom w:type="dxa" w:w="50"/>
+              <w:right w:type="dxa" w:w="110"/>
+            </w:tcMar>
+            <w:vAlign w:val="center"/>
+          </w:tcPr>
+          <w:p>
+            <w:r>
+              <w:rPr>
+                <w:sz w:val="19"/>
+                <w:szCs w:val="19"/>
+              </w:rPr>
+              <w:t xml:space="preserve">Population (scale of the market)</w:t>
             </w:r>
           </w:p>
         </w:tc>
@@ -3982,7 +3376,7 @@
                 <w:sz w:val="19"/>
                 <w:szCs w:val="19"/>
               </w:rPr>
-              <w:t xml:space="preserve">Inverted</w:t>
+              <w:t xml:space="preserve">Higher</w:t>
             </w:r>
           </w:p>
         </w:tc>
@@ -3990,57 +3384,57 @@
       <w:tr>
         <w:tc>
           <w:tcPr>
-            <w:tcW w:type="dxa" w:w="1700"/>
-            <w:tcBorders>
-              <w:top w:val="single" w:color="D5DCE6" w:sz="1"/>
-              <w:left w:val="single" w:color="D5DCE6" w:sz="1"/>
-              <w:bottom w:val="single" w:color="D5DCE6" w:sz="1"/>
-              <w:right w:val="single" w:color="D5DCE6" w:sz="1"/>
-            </w:tcBorders>
-            <w:shd w:fill="F4F7FB" w:val="clear"/>
-            <w:tcMar>
-              <w:top w:type="dxa" w:w="50"/>
-              <w:left w:type="dxa" w:w="110"/>
-              <w:bottom w:type="dxa" w:w="50"/>
-              <w:right w:type="dxa" w:w="110"/>
-            </w:tcMar>
-            <w:vAlign w:val="center"/>
-          </w:tcPr>
-          <w:p>
-            <w:r>
-              <w:rPr>
-                <w:sz w:val="19"/>
-                <w:szCs w:val="19"/>
-              </w:rPr>
-              <w:t xml:space="preserve">Infrastructure</w:t>
-            </w:r>
-          </w:p>
-        </w:tc>
-        <w:tc>
-          <w:tcPr>
-            <w:tcW w:type="dxa" w:w="5300"/>
-            <w:tcBorders>
-              <w:top w:val="single" w:color="D5DCE6" w:sz="1"/>
-              <w:left w:val="single" w:color="D5DCE6" w:sz="1"/>
-              <w:bottom w:val="single" w:color="D5DCE6" w:sz="1"/>
-              <w:right w:val="single" w:color="D5DCE6" w:sz="1"/>
-            </w:tcBorders>
-            <w:shd w:fill="F4F7FB" w:val="clear"/>
-            <w:tcMar>
-              <w:top w:type="dxa" w:w="50"/>
-              <w:left w:type="dxa" w:w="110"/>
-              <w:bottom w:type="dxa" w:w="50"/>
-              <w:right w:type="dxa" w:w="110"/>
-            </w:tcMar>
-            <w:vAlign w:val="center"/>
-          </w:tcPr>
-          <w:p>
-            <w:r>
-              <w:rPr>
-                <w:sz w:val="19"/>
-                <w:szCs w:val="19"/>
-              </w:rPr>
-              <w:t xml:space="preserve">Power / utilities (pending county-level data)</w:t>
+            <w:tcW w:type="dxa" w:w="1750"/>
+            <w:tcBorders>
+              <w:top w:val="single" w:color="D5DCE6" w:sz="1"/>
+              <w:left w:val="single" w:color="D5DCE6" w:sz="1"/>
+              <w:bottom w:val="single" w:color="D5DCE6" w:sz="1"/>
+              <w:right w:val="single" w:color="D5DCE6" w:sz="1"/>
+            </w:tcBorders>
+            <w:shd w:fill="F4F7FB" w:val="clear"/>
+            <w:tcMar>
+              <w:top w:type="dxa" w:w="50"/>
+              <w:left w:type="dxa" w:w="110"/>
+              <w:bottom w:type="dxa" w:w="50"/>
+              <w:right w:type="dxa" w:w="110"/>
+            </w:tcMar>
+            <w:vAlign w:val="center"/>
+          </w:tcPr>
+          <w:p>
+            <w:r>
+              <w:rPr>
+                <w:sz w:val="19"/>
+                <w:szCs w:val="19"/>
+              </w:rPr>
+              <w:t xml:space="preserve">Safety</w:t>
+            </w:r>
+          </w:p>
+        </w:tc>
+        <w:tc>
+          <w:tcPr>
+            <w:tcW w:type="dxa" w:w="5250"/>
+            <w:tcBorders>
+              <w:top w:val="single" w:color="D5DCE6" w:sz="1"/>
+              <w:left w:val="single" w:color="D5DCE6" w:sz="1"/>
+              <w:bottom w:val="single" w:color="D5DCE6" w:sz="1"/>
+              <w:right w:val="single" w:color="D5DCE6" w:sz="1"/>
+            </w:tcBorders>
+            <w:shd w:fill="F4F7FB" w:val="clear"/>
+            <w:tcMar>
+              <w:top w:type="dxa" w:w="50"/>
+              <w:left w:type="dxa" w:w="110"/>
+              <w:bottom w:type="dxa" w:w="50"/>
+              <w:right w:type="dxa" w:w="110"/>
+            </w:tcMar>
+            <w:vAlign w:val="center"/>
+          </w:tcPr>
+          <w:p>
+            <w:r>
+              <w:rPr>
+                <w:sz w:val="19"/>
+                <w:szCs w:val="19"/>
+              </w:rPr>
+              <w:t xml:space="preserve">Crime rate</w:t>
             </w:r>
           </w:p>
         </w:tc>
@@ -4068,7 +3462,179 @@
                 <w:sz w:val="19"/>
                 <w:szCs w:val="19"/>
               </w:rPr>
-              <w:t xml:space="preserve">—</w:t>
+              <w:t xml:space="preserve">Inverted</w:t>
+            </w:r>
+          </w:p>
+        </w:tc>
+      </w:tr>
+      <w:tr>
+        <w:tc>
+          <w:tcPr>
+            <w:tcW w:type="dxa" w:w="1750"/>
+            <w:tcBorders>
+              <w:top w:val="single" w:color="D5DCE6" w:sz="1"/>
+              <w:left w:val="single" w:color="D5DCE6" w:sz="1"/>
+              <w:bottom w:val="single" w:color="D5DCE6" w:sz="1"/>
+              <w:right w:val="single" w:color="D5DCE6" w:sz="1"/>
+            </w:tcBorders>
+            <w:shd w:fill="FFFFFF" w:val="clear"/>
+            <w:tcMar>
+              <w:top w:type="dxa" w:w="50"/>
+              <w:left w:type="dxa" w:w="110"/>
+              <w:bottom w:type="dxa" w:w="50"/>
+              <w:right w:type="dxa" w:w="110"/>
+            </w:tcMar>
+            <w:vAlign w:val="center"/>
+          </w:tcPr>
+          <w:p>
+            <w:r>
+              <w:rPr>
+                <w:sz w:val="19"/>
+                <w:szCs w:val="19"/>
+              </w:rPr>
+              <w:t xml:space="preserve">Demographics</w:t>
+            </w:r>
+          </w:p>
+        </w:tc>
+        <w:tc>
+          <w:tcPr>
+            <w:tcW w:type="dxa" w:w="5250"/>
+            <w:tcBorders>
+              <w:top w:val="single" w:color="D5DCE6" w:sz="1"/>
+              <w:left w:val="single" w:color="D5DCE6" w:sz="1"/>
+              <w:bottom w:val="single" w:color="D5DCE6" w:sz="1"/>
+              <w:right w:val="single" w:color="D5DCE6" w:sz="1"/>
+            </w:tcBorders>
+            <w:shd w:fill="FFFFFF" w:val="clear"/>
+            <w:tcMar>
+              <w:top w:type="dxa" w:w="50"/>
+              <w:left w:type="dxa" w:w="110"/>
+              <w:bottom w:type="dxa" w:w="50"/>
+              <w:right w:type="dxa" w:w="110"/>
+            </w:tcMar>
+            <w:vAlign w:val="center"/>
+          </w:tcPr>
+          <w:p>
+            <w:r>
+              <w:rPr>
+                <w:sz w:val="19"/>
+                <w:szCs w:val="19"/>
+              </w:rPr>
+              <w:t xml:space="preserve">Population, labor force, educational attainment, growth</w:t>
+            </w:r>
+          </w:p>
+        </w:tc>
+        <w:tc>
+          <w:tcPr>
+            <w:tcW w:type="dxa" w:w="2360"/>
+            <w:tcBorders>
+              <w:top w:val="single" w:color="D5DCE6" w:sz="1"/>
+              <w:left w:val="single" w:color="D5DCE6" w:sz="1"/>
+              <w:bottom w:val="single" w:color="D5DCE6" w:sz="1"/>
+              <w:right w:val="single" w:color="D5DCE6" w:sz="1"/>
+            </w:tcBorders>
+            <w:shd w:fill="FFFFFF" w:val="clear"/>
+            <w:tcMar>
+              <w:top w:type="dxa" w:w="50"/>
+              <w:left w:type="dxa" w:w="110"/>
+              <w:bottom w:type="dxa" w:w="50"/>
+              <w:right w:type="dxa" w:w="110"/>
+            </w:tcMar>
+            <w:vAlign w:val="center"/>
+          </w:tcPr>
+          <w:p>
+            <w:r>
+              <w:rPr>
+                <w:sz w:val="19"/>
+                <w:szCs w:val="19"/>
+              </w:rPr>
+              <w:t xml:space="preserve">Higher</w:t>
+            </w:r>
+          </w:p>
+        </w:tc>
+      </w:tr>
+      <w:tr>
+        <w:tc>
+          <w:tcPr>
+            <w:tcW w:type="dxa" w:w="1750"/>
+            <w:tcBorders>
+              <w:top w:val="single" w:color="D5DCE6" w:sz="1"/>
+              <w:left w:val="single" w:color="D5DCE6" w:sz="1"/>
+              <w:bottom w:val="single" w:color="D5DCE6" w:sz="1"/>
+              <w:right w:val="single" w:color="D5DCE6" w:sz="1"/>
+            </w:tcBorders>
+            <w:shd w:fill="F4F7FB" w:val="clear"/>
+            <w:tcMar>
+              <w:top w:type="dxa" w:w="50"/>
+              <w:left w:type="dxa" w:w="110"/>
+              <w:bottom w:type="dxa" w:w="50"/>
+              <w:right w:type="dxa" w:w="110"/>
+            </w:tcMar>
+            <w:vAlign w:val="center"/>
+          </w:tcPr>
+          <w:p>
+            <w:r>
+              <w:rPr>
+                <w:sz w:val="19"/>
+                <w:szCs w:val="19"/>
+              </w:rPr>
+              <w:t xml:space="preserve">Logistics</w:t>
+            </w:r>
+          </w:p>
+        </w:tc>
+        <w:tc>
+          <w:tcPr>
+            <w:tcW w:type="dxa" w:w="5250"/>
+            <w:tcBorders>
+              <w:top w:val="single" w:color="D5DCE6" w:sz="1"/>
+              <w:left w:val="single" w:color="D5DCE6" w:sz="1"/>
+              <w:bottom w:val="single" w:color="D5DCE6" w:sz="1"/>
+              <w:right w:val="single" w:color="D5DCE6" w:sz="1"/>
+            </w:tcBorders>
+            <w:shd w:fill="F4F7FB" w:val="clear"/>
+            <w:tcMar>
+              <w:top w:type="dxa" w:w="50"/>
+              <w:left w:type="dxa" w:w="110"/>
+              <w:bottom w:type="dxa" w:w="50"/>
+              <w:right w:type="dxa" w:w="110"/>
+            </w:tcMar>
+            <w:vAlign w:val="center"/>
+          </w:tcPr>
+          <w:p>
+            <w:r>
+              <w:rPr>
+                <w:sz w:val="19"/>
+                <w:szCs w:val="19"/>
+              </w:rPr>
+              <w:t xml:space="preserve">Airport capacity &amp; enplanements, port tonnage, commute time</w:t>
+            </w:r>
+          </w:p>
+        </w:tc>
+        <w:tc>
+          <w:tcPr>
+            <w:tcW w:type="dxa" w:w="2360"/>
+            <w:tcBorders>
+              <w:top w:val="single" w:color="D5DCE6" w:sz="1"/>
+              <w:left w:val="single" w:color="D5DCE6" w:sz="1"/>
+              <w:bottom w:val="single" w:color="D5DCE6" w:sz="1"/>
+              <w:right w:val="single" w:color="D5DCE6" w:sz="1"/>
+            </w:tcBorders>
+            <w:shd w:fill="F4F7FB" w:val="clear"/>
+            <w:tcMar>
+              <w:top w:type="dxa" w:w="50"/>
+              <w:left w:type="dxa" w:w="110"/>
+              <w:bottom w:type="dxa" w:w="50"/>
+              <w:right w:type="dxa" w:w="110"/>
+            </w:tcMar>
+            <w:vAlign w:val="center"/>
+          </w:tcPr>
+          <w:p>
+            <w:r>
+              <w:rPr>
+                <w:sz w:val="19"/>
+                <w:szCs w:val="19"/>
+              </w:rPr>
+              <w:t xml:space="preserve">Higher / inverted</w:t>
             </w:r>
           </w:p>
         </w:tc>
@@ -4080,7 +3646,7 @@
         <w:spacing w:after="100" w:before="220"/>
       </w:pPr>
       <w:r>
-        <w:t xml:space="preserve">3.5 Normalization &amp; Weighting</w:t>
+        <w:t xml:space="preserve">3.5 Normalization, Weighting &amp; De-correlation</w:t>
       </w:r>
     </w:p>
     <w:p>
@@ -4093,7 +3659,18 @@
         <w:spacing w:after="60"/>
       </w:pPr>
       <w:r>
-        <w:t xml:space="preserve">Each raw metric is converted to a 0–100 percentile rank across the candidate set, so dimensions are comparable regardless of units.</w:t>
+        <w:t xml:space="preserve">Each raw metric -&gt; 0–100 percentile rank; a dimension's sub-score is the average of its metric percentiles; the FastLocations Score is the weighted sum, renormalized over non-null dimensions, plus a preferred-region bonus.</w:t>
+      </w:r>
+    </w:p>
+    <w:p>
+      <w:pPr>
+        <w:spacing w:after="120" w:line="276"/>
+      </w:pPr>
+      <w:r>
+        <w:t xml:space="preserve">Default weights (the form's sliders, normalized to 100%): </w:t>
+      </w:r>
+      <w:r>
+        <w:t xml:space="preserve">Workforce 18, Cost 18, Real estate 13, Incentives 10, Infrastructure 8, Livability 8, Market size 7, Safety 6, Demographics 6, Logistics 6.</w:t>
       </w:r>
     </w:p>
     <w:p>
@@ -4106,45 +3683,14 @@
         <w:spacing w:after="60"/>
       </w:pPr>
       <w:r>
-        <w:t xml:space="preserve">A dimension's sub-score is the average of its available metric percentiles.</w:t>
-      </w:r>
-    </w:p>
-    <w:p>
-      <w:pPr>
-        <w:pStyle w:val="ListParagraph"/>
-        <w:numPr>
-          <w:ilvl w:val="0"/>
-          <w:numId w:val="2"/>
-        </w:numPr>
-        <w:spacing w:after="60"/>
-      </w:pPr>
-      <w:r>
-        <w:t xml:space="preserve">The final score is the weighted sum of sub-scores using the eight weights from the form's </w:t>
-      </w:r>
-      <w:r>
         <w:rPr>
-          <w:rFonts w:ascii="Consolas" w:cs="Consolas" w:eastAsia="Consolas" w:hAnsi="Consolas"/>
-          <w:color w:val="39455A"/>
-          <w:sz w:val="19"/>
-          <w:szCs w:val="19"/>
+          <w:b/>
+          <w:bCs/>
         </w:rPr>
-        <w:t xml:space="preserve">What Matters Most</w:t>
-      </w:r>
-      <w:r>
-        <w:t xml:space="preserve"> sliders (normalized to 100%). Weights are renormalized over only the non-null dimensions.</w:t>
-      </w:r>
-    </w:p>
-    <w:p>
-      <w:pPr>
-        <w:pStyle w:val="ListParagraph"/>
-        <w:numPr>
-          <w:ilvl w:val="0"/>
-          <w:numId w:val="2"/>
-        </w:numPr>
-        <w:spacing w:after="60"/>
-      </w:pPr>
-      <w:r>
-        <w:t xml:space="preserve">Candidates in a Preferred region receive a fixed bonus added to the final score.</w:t>
+        <w:t xml:space="preserve">De-correlation: </w:t>
+      </w:r>
+      <w:r>
+        <w:t xml:space="preserve">wealth is intentionally not double-counted. Income appears only in Cost (and counts against expensive places); Social Deprivation Index, household poverty, and infant mortality are present in the data but excluded from scoring because Livability already captures community health. This prevents one affluent county from sweeping multiple dimensions on the same underlying signal.</w:t>
       </w:r>
     </w:p>
     <w:p>
@@ -4153,7 +3699,7 @@
         <w:spacing w:after="100" w:before="220"/>
       </w:pPr>
       <w:r>
-        <w:t xml:space="preserve">3.6 Dual-Spine: US &amp; Canada</w:t>
+        <w:t xml:space="preserve">3.6 Dual-Spine (US &amp; Canada)</w:t>
       </w:r>
     </w:p>
     <w:p>
@@ -4161,7 +3707,7 @@
         <w:spacing w:after="120" w:line="276"/>
       </w:pPr>
       <w:r>
-        <w:t xml:space="preserve">US candidates are counties keyed by 5-digit FIPS; Canadian candidates are Census Divisions keyed by CDUID. The country selector picks one spine. Canadian candidates score on population, infrastructure, and provincial incentives; US-only metrics (workforce quality, cost, safety, property tax) read as </w:t>
+        <w:t xml:space="preserve">US candidates are counties (5-digit FIPS); Canadian candidates are Census Divisions (CDUID). The country selector picks one spine. Canadian candidates score on population, infrastructure, and provincial incentives; US-only metrics (workforce quality, cost, safety, property tax, livability) read </w:t>
       </w:r>
       <w:r>
         <w:rPr>
@@ -4173,7 +3719,7 @@
         <w:t xml:space="preserve">null</w:t>
       </w:r>
       <w:r>
-        <w:t xml:space="preserve"> for Canada and are renormalized out.</w:t>
+        <w:t xml:space="preserve"> and renormalize out. The locator map is US-only (counties have centroids).</w:t>
       </w:r>
     </w:p>
     <w:p>
@@ -4198,8 +3744,8 @@
         </w:tblBorders>
       </w:tblPr>
       <w:tblGrid>
-        <w:gridCol w:w="2200"/>
-        <w:gridCol w:w="4760"/>
+        <w:gridCol w:w="2300"/>
+        <w:gridCol w:w="4660"/>
         <w:gridCol w:w="2400"/>
       </w:tblGrid>
       <w:tr>
@@ -4208,7 +3754,7 @@
         </w:trPr>
         <w:tc>
           <w:tcPr>
-            <w:tcW w:type="dxa" w:w="2200"/>
+            <w:tcW w:type="dxa" w:w="2300"/>
             <w:tcBorders>
               <w:top w:val="single" w:color="D5DCE6" w:sz="1"/>
               <w:left w:val="single" w:color="D5DCE6" w:sz="1"/>
@@ -4238,7 +3784,7 @@
         </w:tc>
         <w:tc>
           <w:tcPr>
-            <w:tcW w:type="dxa" w:w="4760"/>
+            <w:tcW w:type="dxa" w:w="4660"/>
             <w:tcBorders>
               <w:top w:val="single" w:color="D5DCE6" w:sz="1"/>
               <w:left w:val="single" w:color="D5DCE6" w:sz="1"/>
@@ -4300,7 +3846,7 @@
       <w:tr>
         <w:tc>
           <w:tcPr>
-            <w:tcW w:type="dxa" w:w="2200"/>
+            <w:tcW w:type="dxa" w:w="2300"/>
             <w:tcBorders>
               <w:top w:val="single" w:color="D5DCE6" w:sz="1"/>
               <w:left w:val="single" w:color="D5DCE6" w:sz="1"/>
@@ -4328,7 +3874,7 @@
         </w:tc>
         <w:tc>
           <w:tcPr>
-            <w:tcW w:type="dxa" w:w="4760"/>
+            <w:tcW w:type="dxa" w:w="4660"/>
             <w:tcBorders>
               <w:top w:val="single" w:color="D5DCE6" w:sz="1"/>
               <w:left w:val="single" w:color="D5DCE6" w:sz="1"/>
@@ -4386,7 +3932,7 @@
       <w:tr>
         <w:tc>
           <w:tcPr>
-            <w:tcW w:type="dxa" w:w="2200"/>
+            <w:tcW w:type="dxa" w:w="2300"/>
             <w:tcBorders>
               <w:top w:val="single" w:color="D5DCE6" w:sz="1"/>
               <w:left w:val="single" w:color="D5DCE6" w:sz="1"/>
@@ -4414,29 +3960,29 @@
         </w:tc>
         <w:tc>
           <w:tcPr>
-            <w:tcW w:type="dxa" w:w="4760"/>
-            <w:tcBorders>
-              <w:top w:val="single" w:color="D5DCE6" w:sz="1"/>
-              <w:left w:val="single" w:color="D5DCE6" w:sz="1"/>
-              <w:bottom w:val="single" w:color="D5DCE6" w:sz="1"/>
-              <w:right w:val="single" w:color="D5DCE6" w:sz="1"/>
-            </w:tcBorders>
-            <w:shd w:fill="F4F7FB" w:val="clear"/>
-            <w:tcMar>
-              <w:top w:type="dxa" w:w="50"/>
-              <w:left w:type="dxa" w:w="110"/>
-              <w:bottom w:type="dxa" w:w="50"/>
-              <w:right w:type="dxa" w:w="110"/>
-            </w:tcMar>
-            <w:vAlign w:val="center"/>
-          </w:tcPr>
-          <w:p>
-            <w:r>
-              <w:rPr>
-                <w:sz w:val="19"/>
-                <w:szCs w:val="19"/>
-              </w:rPr>
-              <w:t xml:space="preserve">County crime rate per 100k</w:t>
+            <w:tcW w:type="dxa" w:w="4660"/>
+            <w:tcBorders>
+              <w:top w:val="single" w:color="D5DCE6" w:sz="1"/>
+              <w:left w:val="single" w:color="D5DCE6" w:sz="1"/>
+              <w:bottom w:val="single" w:color="D5DCE6" w:sz="1"/>
+              <w:right w:val="single" w:color="D5DCE6" w:sz="1"/>
+            </w:tcBorders>
+            <w:shd w:fill="F4F7FB" w:val="clear"/>
+            <w:tcMar>
+              <w:top w:type="dxa" w:w="50"/>
+              <w:left w:type="dxa" w:w="110"/>
+              <w:bottom w:type="dxa" w:w="50"/>
+              <w:right w:type="dxa" w:w="110"/>
+            </w:tcMar>
+            <w:vAlign w:val="center"/>
+          </w:tcPr>
+          <w:p>
+            <w:r>
+              <w:rPr>
+                <w:sz w:val="19"/>
+                <w:szCs w:val="19"/>
+              </w:rPr>
+              <w:t xml:space="preserve">County crime dataset</w:t>
             </w:r>
           </w:p>
         </w:tc>
@@ -4472,57 +4018,57 @@
       <w:tr>
         <w:tc>
           <w:tcPr>
-            <w:tcW w:type="dxa" w:w="2200"/>
-            <w:tcBorders>
-              <w:top w:val="single" w:color="D5DCE6" w:sz="1"/>
-              <w:left w:val="single" w:color="D5DCE6" w:sz="1"/>
-              <w:bottom w:val="single" w:color="D5DCE6" w:sz="1"/>
-              <w:right w:val="single" w:color="D5DCE6" w:sz="1"/>
-            </w:tcBorders>
-            <w:shd w:fill="FFFFFF" w:val="clear"/>
-            <w:tcMar>
-              <w:top w:type="dxa" w:w="50"/>
-              <w:left w:type="dxa" w:w="110"/>
-              <w:bottom w:type="dxa" w:w="50"/>
-              <w:right w:type="dxa" w:w="110"/>
-            </w:tcMar>
-            <w:vAlign w:val="center"/>
-          </w:tcPr>
-          <w:p>
-            <w:r>
-              <w:rPr>
-                <w:sz w:val="19"/>
-                <w:szCs w:val="19"/>
-              </w:rPr>
-              <w:t xml:space="preserve">Poverty / commute</w:t>
-            </w:r>
-          </w:p>
-        </w:tc>
-        <w:tc>
-          <w:tcPr>
-            <w:tcW w:type="dxa" w:w="4760"/>
-            <w:tcBorders>
-              <w:top w:val="single" w:color="D5DCE6" w:sz="1"/>
-              <w:left w:val="single" w:color="D5DCE6" w:sz="1"/>
-              <w:bottom w:val="single" w:color="D5DCE6" w:sz="1"/>
-              <w:right w:val="single" w:color="D5DCE6" w:sz="1"/>
-            </w:tcBorders>
-            <w:shd w:fill="FFFFFF" w:val="clear"/>
-            <w:tcMar>
-              <w:top w:type="dxa" w:w="50"/>
-              <w:left w:type="dxa" w:w="110"/>
-              <w:bottom w:type="dxa" w:w="50"/>
-              <w:right w:type="dxa" w:w="110"/>
-            </w:tcMar>
-            <w:vAlign w:val="center"/>
-          </w:tcPr>
-          <w:p>
-            <w:r>
-              <w:rPr>
-                <w:sz w:val="19"/>
-                <w:szCs w:val="19"/>
-              </w:rPr>
-              <w:t xml:space="preserve">US Census ACS (B17020 / B08303)</w:t>
+            <w:tcW w:type="dxa" w:w="2300"/>
+            <w:tcBorders>
+              <w:top w:val="single" w:color="D5DCE6" w:sz="1"/>
+              <w:left w:val="single" w:color="D5DCE6" w:sz="1"/>
+              <w:bottom w:val="single" w:color="D5DCE6" w:sz="1"/>
+              <w:right w:val="single" w:color="D5DCE6" w:sz="1"/>
+            </w:tcBorders>
+            <w:shd w:fill="FFFFFF" w:val="clear"/>
+            <w:tcMar>
+              <w:top w:type="dxa" w:w="50"/>
+              <w:left w:type="dxa" w:w="110"/>
+              <w:bottom w:type="dxa" w:w="50"/>
+              <w:right w:type="dxa" w:w="110"/>
+            </w:tcMar>
+            <w:vAlign w:val="center"/>
+          </w:tcPr>
+          <w:p>
+            <w:r>
+              <w:rPr>
+                <w:sz w:val="19"/>
+                <w:szCs w:val="19"/>
+              </w:rPr>
+              <w:t xml:space="preserve">Commute</w:t>
+            </w:r>
+          </w:p>
+        </w:tc>
+        <w:tc>
+          <w:tcPr>
+            <w:tcW w:type="dxa" w:w="4660"/>
+            <w:tcBorders>
+              <w:top w:val="single" w:color="D5DCE6" w:sz="1"/>
+              <w:left w:val="single" w:color="D5DCE6" w:sz="1"/>
+              <w:bottom w:val="single" w:color="D5DCE6" w:sz="1"/>
+              <w:right w:val="single" w:color="D5DCE6" w:sz="1"/>
+            </w:tcBorders>
+            <w:shd w:fill="FFFFFF" w:val="clear"/>
+            <w:tcMar>
+              <w:top w:type="dxa" w:w="50"/>
+              <w:left w:type="dxa" w:w="110"/>
+              <w:bottom w:type="dxa" w:w="50"/>
+              <w:right w:type="dxa" w:w="110"/>
+            </w:tcMar>
+            <w:vAlign w:val="center"/>
+          </w:tcPr>
+          <w:p>
+            <w:r>
+              <w:rPr>
+                <w:sz w:val="19"/>
+                <w:szCs w:val="19"/>
+              </w:rPr>
+              <w:t xml:space="preserve">US Census ACS (B08303)</w:t>
             </w:r>
           </w:p>
         </w:tc>
@@ -4550,7 +4096,7 @@
                 <w:sz w:val="19"/>
                 <w:szCs w:val="19"/>
               </w:rPr>
-              <w:t xml:space="preserve">County FIPS (GEOID)</w:t>
+              <w:t xml:space="preserve">County FIPS</w:t>
             </w:r>
           </w:p>
         </w:tc>
@@ -4558,7 +4104,7 @@
       <w:tr>
         <w:tc>
           <w:tcPr>
-            <w:tcW w:type="dxa" w:w="2200"/>
+            <w:tcW w:type="dxa" w:w="2300"/>
             <w:tcBorders>
               <w:top w:val="single" w:color="D5DCE6" w:sz="1"/>
               <w:left w:val="single" w:color="D5DCE6" w:sz="1"/>
@@ -4586,7 +4132,7 @@
         </w:tc>
         <w:tc>
           <w:tcPr>
-            <w:tcW w:type="dxa" w:w="4760"/>
+            <w:tcW w:type="dxa" w:w="4660"/>
             <w:tcBorders>
               <w:top w:val="single" w:color="D5DCE6" w:sz="1"/>
               <w:left w:val="single" w:color="D5DCE6" w:sz="1"/>
@@ -4644,57 +4190,57 @@
       <w:tr>
         <w:tc>
           <w:tcPr>
-            <w:tcW w:type="dxa" w:w="2200"/>
-            <w:tcBorders>
-              <w:top w:val="single" w:color="D5DCE6" w:sz="1"/>
-              <w:left w:val="single" w:color="D5DCE6" w:sz="1"/>
-              <w:bottom w:val="single" w:color="D5DCE6" w:sz="1"/>
-              <w:right w:val="single" w:color="D5DCE6" w:sz="1"/>
-            </w:tcBorders>
-            <w:shd w:fill="FFFFFF" w:val="clear"/>
-            <w:tcMar>
-              <w:top w:type="dxa" w:w="50"/>
-              <w:left w:type="dxa" w:w="110"/>
-              <w:bottom w:type="dxa" w:w="50"/>
-              <w:right w:type="dxa" w:w="110"/>
-            </w:tcMar>
-            <w:vAlign w:val="center"/>
-          </w:tcPr>
-          <w:p>
-            <w:r>
-              <w:rPr>
-                <w:sz w:val="19"/>
-                <w:szCs w:val="19"/>
-              </w:rPr>
-              <w:t xml:space="preserve">Critical Thinking, SDI, infant mortality, household poverty</w:t>
-            </w:r>
-          </w:p>
-        </w:tc>
-        <w:tc>
-          <w:tcPr>
-            <w:tcW w:type="dxa" w:w="4760"/>
-            <w:tcBorders>
-              <w:top w:val="single" w:color="D5DCE6" w:sz="1"/>
-              <w:left w:val="single" w:color="D5DCE6" w:sz="1"/>
-              <w:bottom w:val="single" w:color="D5DCE6" w:sz="1"/>
-              <w:right w:val="single" w:color="D5DCE6" w:sz="1"/>
-            </w:tcBorders>
-            <w:shd w:fill="FFFFFF" w:val="clear"/>
-            <w:tcMar>
-              <w:top w:type="dxa" w:w="50"/>
-              <w:left w:type="dxa" w:w="110"/>
-              <w:bottom w:type="dxa" w:w="50"/>
-              <w:right w:type="dxa" w:w="110"/>
-            </w:tcMar>
-            <w:vAlign w:val="center"/>
-          </w:tcPr>
-          <w:p>
-            <w:r>
-              <w:rPr>
-                <w:sz w:val="19"/>
-                <w:szCs w:val="19"/>
-              </w:rPr>
-              <w:t xml:space="preserve">Uploaded analytic datasets</w:t>
+            <w:tcW w:type="dxa" w:w="2300"/>
+            <w:tcBorders>
+              <w:top w:val="single" w:color="D5DCE6" w:sz="1"/>
+              <w:left w:val="single" w:color="D5DCE6" w:sz="1"/>
+              <w:bottom w:val="single" w:color="D5DCE6" w:sz="1"/>
+              <w:right w:val="single" w:color="D5DCE6" w:sz="1"/>
+            </w:tcBorders>
+            <w:shd w:fill="FFFFFF" w:val="clear"/>
+            <w:tcMar>
+              <w:top w:type="dxa" w:w="50"/>
+              <w:left w:type="dxa" w:w="110"/>
+              <w:bottom w:type="dxa" w:w="50"/>
+              <w:right w:type="dxa" w:w="110"/>
+            </w:tcMar>
+            <w:vAlign w:val="center"/>
+          </w:tcPr>
+          <w:p>
+            <w:r>
+              <w:rPr>
+                <w:sz w:val="19"/>
+                <w:szCs w:val="19"/>
+              </w:rPr>
+              <w:t xml:space="preserve">Critical Thinking</w:t>
+            </w:r>
+          </w:p>
+        </w:tc>
+        <w:tc>
+          <w:tcPr>
+            <w:tcW w:type="dxa" w:w="4660"/>
+            <w:tcBorders>
+              <w:top w:val="single" w:color="D5DCE6" w:sz="1"/>
+              <w:left w:val="single" w:color="D5DCE6" w:sz="1"/>
+              <w:bottom w:val="single" w:color="D5DCE6" w:sz="1"/>
+              <w:right w:val="single" w:color="D5DCE6" w:sz="1"/>
+            </w:tcBorders>
+            <w:shd w:fill="FFFFFF" w:val="clear"/>
+            <w:tcMar>
+              <w:top w:type="dxa" w:w="50"/>
+              <w:left w:type="dxa" w:w="110"/>
+              <w:bottom w:type="dxa" w:w="50"/>
+              <w:right w:type="dxa" w:w="110"/>
+            </w:tcMar>
+            <w:vAlign w:val="center"/>
+          </w:tcPr>
+          <w:p>
+            <w:r>
+              <w:rPr>
+                <w:sz w:val="19"/>
+                <w:szCs w:val="19"/>
+              </w:rPr>
+              <w:t xml:space="preserve">Analytic dataset</w:t>
             </w:r>
           </w:p>
         </w:tc>
@@ -4730,57 +4276,57 @@
       <w:tr>
         <w:tc>
           <w:tcPr>
-            <w:tcW w:type="dxa" w:w="2200"/>
-            <w:tcBorders>
-              <w:top w:val="single" w:color="D5DCE6" w:sz="1"/>
-              <w:left w:val="single" w:color="D5DCE6" w:sz="1"/>
-              <w:bottom w:val="single" w:color="D5DCE6" w:sz="1"/>
-              <w:right w:val="single" w:color="D5DCE6" w:sz="1"/>
-            </w:tcBorders>
-            <w:shd w:fill="F4F7FB" w:val="clear"/>
-            <w:tcMar>
-              <w:top w:type="dxa" w:w="50"/>
-              <w:left w:type="dxa" w:w="110"/>
-              <w:bottom w:type="dxa" w:w="50"/>
-              <w:right w:type="dxa" w:w="110"/>
-            </w:tcMar>
-            <w:vAlign w:val="center"/>
-          </w:tcPr>
-          <w:p>
-            <w:r>
-              <w:rPr>
-                <w:sz w:val="19"/>
-                <w:szCs w:val="19"/>
-              </w:rPr>
-              <w:t xml:space="preserve">County centroids / places</w:t>
-            </w:r>
-          </w:p>
-        </w:tc>
-        <w:tc>
-          <w:tcPr>
-            <w:tcW w:type="dxa" w:w="4760"/>
-            <w:tcBorders>
-              <w:top w:val="single" w:color="D5DCE6" w:sz="1"/>
-              <w:left w:val="single" w:color="D5DCE6" w:sz="1"/>
-              <w:bottom w:val="single" w:color="D5DCE6" w:sz="1"/>
-              <w:right w:val="single" w:color="D5DCE6" w:sz="1"/>
-            </w:tcBorders>
-            <w:shd w:fill="F4F7FB" w:val="clear"/>
-            <w:tcMar>
-              <w:top w:type="dxa" w:w="50"/>
-              <w:left w:type="dxa" w:w="110"/>
-              <w:bottom w:type="dxa" w:w="50"/>
-              <w:right w:type="dxa" w:w="110"/>
-            </w:tcMar>
-            <w:vAlign w:val="center"/>
-          </w:tcPr>
-          <w:p>
-            <w:r>
-              <w:rPr>
-                <w:sz w:val="19"/>
-                <w:szCs w:val="19"/>
-              </w:rPr>
-              <w:t xml:space="preserve">US Census Gazetteer</w:t>
+            <w:tcW w:type="dxa" w:w="2300"/>
+            <w:tcBorders>
+              <w:top w:val="single" w:color="D5DCE6" w:sz="1"/>
+              <w:left w:val="single" w:color="D5DCE6" w:sz="1"/>
+              <w:bottom w:val="single" w:color="D5DCE6" w:sz="1"/>
+              <w:right w:val="single" w:color="D5DCE6" w:sz="1"/>
+            </w:tcBorders>
+            <w:shd w:fill="F4F7FB" w:val="clear"/>
+            <w:tcMar>
+              <w:top w:type="dxa" w:w="50"/>
+              <w:left w:type="dxa" w:w="110"/>
+              <w:bottom w:type="dxa" w:w="50"/>
+              <w:right w:type="dxa" w:w="110"/>
+            </w:tcMar>
+            <w:vAlign w:val="center"/>
+          </w:tcPr>
+          <w:p>
+            <w:r>
+              <w:rPr>
+                <w:sz w:val="19"/>
+                <w:szCs w:val="19"/>
+              </w:rPr>
+              <w:t xml:space="preserve">Livability / health outcomes</w:t>
+            </w:r>
+          </w:p>
+        </w:tc>
+        <w:tc>
+          <w:tcPr>
+            <w:tcW w:type="dxa" w:w="4660"/>
+            <w:tcBorders>
+              <w:top w:val="single" w:color="D5DCE6" w:sz="1"/>
+              <w:left w:val="single" w:color="D5DCE6" w:sz="1"/>
+              <w:bottom w:val="single" w:color="D5DCE6" w:sz="1"/>
+              <w:right w:val="single" w:color="D5DCE6" w:sz="1"/>
+            </w:tcBorders>
+            <w:shd w:fill="F4F7FB" w:val="clear"/>
+            <w:tcMar>
+              <w:top w:type="dxa" w:w="50"/>
+              <w:left w:type="dxa" w:w="110"/>
+              <w:bottom w:type="dxa" w:w="50"/>
+              <w:right w:type="dxa" w:w="110"/>
+            </w:tcMar>
+            <w:vAlign w:val="center"/>
+          </w:tcPr>
+          <w:p>
+            <w:r>
+              <w:rPr>
+                <w:sz w:val="19"/>
+                <w:szCs w:val="19"/>
+              </w:rPr>
+              <w:t xml:space="preserve">County Health Rankings, 2025</w:t>
             </w:r>
           </w:p>
         </w:tc>
@@ -4808,7 +4354,7 @@
                 <w:sz w:val="19"/>
                 <w:szCs w:val="19"/>
               </w:rPr>
-              <w:t xml:space="preserve">FIPS / place name</w:t>
+              <w:t xml:space="preserve">County FIPS</w:t>
             </w:r>
           </w:p>
         </w:tc>
@@ -4816,57 +4362,57 @@
       <w:tr>
         <w:tc>
           <w:tcPr>
-            <w:tcW w:type="dxa" w:w="2200"/>
-            <w:tcBorders>
-              <w:top w:val="single" w:color="D5DCE6" w:sz="1"/>
-              <w:left w:val="single" w:color="D5DCE6" w:sz="1"/>
-              <w:bottom w:val="single" w:color="D5DCE6" w:sz="1"/>
-              <w:right w:val="single" w:color="D5DCE6" w:sz="1"/>
-            </w:tcBorders>
-            <w:shd w:fill="FFFFFF" w:val="clear"/>
-            <w:tcMar>
-              <w:top w:type="dxa" w:w="50"/>
-              <w:left w:type="dxa" w:w="110"/>
-              <w:bottom w:type="dxa" w:w="50"/>
-              <w:right w:type="dxa" w:w="110"/>
-            </w:tcMar>
-            <w:vAlign w:val="center"/>
-          </w:tcPr>
-          <w:p>
-            <w:r>
-              <w:rPr>
-                <w:sz w:val="19"/>
-                <w:szCs w:val="19"/>
-              </w:rPr>
-              <w:t xml:space="preserve">Incentives</w:t>
-            </w:r>
-          </w:p>
-        </w:tc>
-        <w:tc>
-          <w:tcPr>
-            <w:tcW w:type="dxa" w:w="4760"/>
-            <w:tcBorders>
-              <w:top w:val="single" w:color="D5DCE6" w:sz="1"/>
-              <w:left w:val="single" w:color="D5DCE6" w:sz="1"/>
-              <w:bottom w:val="single" w:color="D5DCE6" w:sz="1"/>
-              <w:right w:val="single" w:color="D5DCE6" w:sz="1"/>
-            </w:tcBorders>
-            <w:shd w:fill="FFFFFF" w:val="clear"/>
-            <w:tcMar>
-              <w:top w:type="dxa" w:w="50"/>
-              <w:left w:type="dxa" w:w="110"/>
-              <w:bottom w:type="dxa" w:w="50"/>
-              <w:right w:type="dxa" w:w="110"/>
-            </w:tcMar>
-            <w:vAlign w:val="center"/>
-          </w:tcPr>
-          <w:p>
-            <w:r>
-              <w:rPr>
-                <w:sz w:val="19"/>
-                <w:szCs w:val="19"/>
-              </w:rPr>
-              <w:t xml:space="preserve">State &amp; provincial program catalog</w:t>
+            <w:tcW w:type="dxa" w:w="2300"/>
+            <w:tcBorders>
+              <w:top w:val="single" w:color="D5DCE6" w:sz="1"/>
+              <w:left w:val="single" w:color="D5DCE6" w:sz="1"/>
+              <w:bottom w:val="single" w:color="D5DCE6" w:sz="1"/>
+              <w:right w:val="single" w:color="D5DCE6" w:sz="1"/>
+            </w:tcBorders>
+            <w:shd w:fill="FFFFFF" w:val="clear"/>
+            <w:tcMar>
+              <w:top w:type="dxa" w:w="50"/>
+              <w:left w:type="dxa" w:w="110"/>
+              <w:bottom w:type="dxa" w:w="50"/>
+              <w:right w:type="dxa" w:w="110"/>
+            </w:tcMar>
+            <w:vAlign w:val="center"/>
+          </w:tcPr>
+          <w:p>
+            <w:r>
+              <w:rPr>
+                <w:sz w:val="19"/>
+                <w:szCs w:val="19"/>
+              </w:rPr>
+              <w:t xml:space="preserve">Infrastructure</w:t>
+            </w:r>
+          </w:p>
+        </w:tc>
+        <w:tc>
+          <w:tcPr>
+            <w:tcW w:type="dxa" w:w="4660"/>
+            <w:tcBorders>
+              <w:top w:val="single" w:color="D5DCE6" w:sz="1"/>
+              <w:left w:val="single" w:color="D5DCE6" w:sz="1"/>
+              <w:bottom w:val="single" w:color="D5DCE6" w:sz="1"/>
+              <w:right w:val="single" w:color="D5DCE6" w:sz="1"/>
+            </w:tcBorders>
+            <w:shd w:fill="FFFFFF" w:val="clear"/>
+            <w:tcMar>
+              <w:top w:type="dxa" w:w="50"/>
+              <w:left w:type="dxa" w:w="110"/>
+              <w:bottom w:type="dxa" w:w="50"/>
+              <w:right w:type="dxa" w:w="110"/>
+            </w:tcMar>
+            <w:vAlign w:val="center"/>
+          </w:tcPr>
+          <w:p>
+            <w:r>
+              <w:rPr>
+                <w:sz w:val="19"/>
+                <w:szCs w:val="19"/>
+              </w:rPr>
+              <w:t xml:space="preserve">ASCE Infrastructure Report Card (state GPA)</w:t>
             </w:r>
           </w:p>
         </w:tc>
@@ -4894,7 +4440,7 @@
                 <w:sz w:val="19"/>
                 <w:szCs w:val="19"/>
               </w:rPr>
-              <w:t xml:space="preserve">State / province</w:t>
+              <w:t xml:space="preserve">State</w:t>
             </w:r>
           </w:p>
         </w:tc>
@@ -4902,57 +4448,57 @@
       <w:tr>
         <w:tc>
           <w:tcPr>
-            <w:tcW w:type="dxa" w:w="2200"/>
-            <w:tcBorders>
-              <w:top w:val="single" w:color="D5DCE6" w:sz="1"/>
-              <w:left w:val="single" w:color="D5DCE6" w:sz="1"/>
-              <w:bottom w:val="single" w:color="D5DCE6" w:sz="1"/>
-              <w:right w:val="single" w:color="D5DCE6" w:sz="1"/>
-            </w:tcBorders>
-            <w:shd w:fill="F4F7FB" w:val="clear"/>
-            <w:tcMar>
-              <w:top w:type="dxa" w:w="50"/>
-              <w:left w:type="dxa" w:w="110"/>
-              <w:bottom w:type="dxa" w:w="50"/>
-              <w:right w:type="dxa" w:w="110"/>
-            </w:tcMar>
-            <w:vAlign w:val="center"/>
-          </w:tcPr>
-          <w:p>
-            <w:r>
-              <w:rPr>
-                <w:sz w:val="19"/>
-                <w:szCs w:val="19"/>
-              </w:rPr>
-              <w:t xml:space="preserve">Canadian demographics / infra</w:t>
-            </w:r>
-          </w:p>
-        </w:tc>
-        <w:tc>
-          <w:tcPr>
-            <w:tcW w:type="dxa" w:w="4760"/>
-            <w:tcBorders>
-              <w:top w:val="single" w:color="D5DCE6" w:sz="1"/>
-              <w:left w:val="single" w:color="D5DCE6" w:sz="1"/>
-              <w:bottom w:val="single" w:color="D5DCE6" w:sz="1"/>
-              <w:right w:val="single" w:color="D5DCE6" w:sz="1"/>
-            </w:tcBorders>
-            <w:shd w:fill="F4F7FB" w:val="clear"/>
-            <w:tcMar>
-              <w:top w:type="dxa" w:w="50"/>
-              <w:left w:type="dxa" w:w="110"/>
-              <w:bottom w:type="dxa" w:w="50"/>
-              <w:right w:type="dxa" w:w="110"/>
-            </w:tcMar>
-            <w:vAlign w:val="center"/>
-          </w:tcPr>
-          <w:p>
-            <w:r>
-              <w:rPr>
-                <w:sz w:val="19"/>
-                <w:szCs w:val="19"/>
-              </w:rPr>
-              <w:t xml:space="preserve">StatCan Census + infrastructure layers</w:t>
+            <w:tcW w:type="dxa" w:w="2300"/>
+            <w:tcBorders>
+              <w:top w:val="single" w:color="D5DCE6" w:sz="1"/>
+              <w:left w:val="single" w:color="D5DCE6" w:sz="1"/>
+              <w:bottom w:val="single" w:color="D5DCE6" w:sz="1"/>
+              <w:right w:val="single" w:color="D5DCE6" w:sz="1"/>
+            </w:tcBorders>
+            <w:shd w:fill="F4F7FB" w:val="clear"/>
+            <w:tcMar>
+              <w:top w:type="dxa" w:w="50"/>
+              <w:left w:type="dxa" w:w="110"/>
+              <w:bottom w:type="dxa" w:w="50"/>
+              <w:right w:type="dxa" w:w="110"/>
+            </w:tcMar>
+            <w:vAlign w:val="center"/>
+          </w:tcPr>
+          <w:p>
+            <w:r>
+              <w:rPr>
+                <w:sz w:val="19"/>
+                <w:szCs w:val="19"/>
+              </w:rPr>
+              <w:t xml:space="preserve">County centroids / place geocoding</w:t>
+            </w:r>
+          </w:p>
+        </w:tc>
+        <w:tc>
+          <w:tcPr>
+            <w:tcW w:type="dxa" w:w="4660"/>
+            <w:tcBorders>
+              <w:top w:val="single" w:color="D5DCE6" w:sz="1"/>
+              <w:left w:val="single" w:color="D5DCE6" w:sz="1"/>
+              <w:bottom w:val="single" w:color="D5DCE6" w:sz="1"/>
+              <w:right w:val="single" w:color="D5DCE6" w:sz="1"/>
+            </w:tcBorders>
+            <w:shd w:fill="F4F7FB" w:val="clear"/>
+            <w:tcMar>
+              <w:top w:type="dxa" w:w="50"/>
+              <w:left w:type="dxa" w:w="110"/>
+              <w:bottom w:type="dxa" w:w="50"/>
+              <w:right w:type="dxa" w:w="110"/>
+            </w:tcMar>
+            <w:vAlign w:val="center"/>
+          </w:tcPr>
+          <w:p>
+            <w:r>
+              <w:rPr>
+                <w:sz w:val="19"/>
+                <w:szCs w:val="19"/>
+              </w:rPr>
+              <w:t xml:space="preserve">US Census Gazetteer</w:t>
             </w:r>
           </w:p>
         </w:tc>
@@ -4980,7 +4526,7 @@
                 <w:sz w:val="19"/>
                 <w:szCs w:val="19"/>
               </w:rPr>
-              <w:t xml:space="preserve">CDUID</w:t>
+              <w:t xml:space="preserve">FIPS / place name</w:t>
             </w:r>
           </w:p>
         </w:tc>
@@ -4988,7 +4534,179 @@
       <w:tr>
         <w:tc>
           <w:tcPr>
-            <w:tcW w:type="dxa" w:w="2200"/>
+            <w:tcW w:type="dxa" w:w="2300"/>
+            <w:tcBorders>
+              <w:top w:val="single" w:color="D5DCE6" w:sz="1"/>
+              <w:left w:val="single" w:color="D5DCE6" w:sz="1"/>
+              <w:bottom w:val="single" w:color="D5DCE6" w:sz="1"/>
+              <w:right w:val="single" w:color="D5DCE6" w:sz="1"/>
+            </w:tcBorders>
+            <w:shd w:fill="FFFFFF" w:val="clear"/>
+            <w:tcMar>
+              <w:top w:type="dxa" w:w="50"/>
+              <w:left w:type="dxa" w:w="110"/>
+              <w:bottom w:type="dxa" w:w="50"/>
+              <w:right w:type="dxa" w:w="110"/>
+            </w:tcMar>
+            <w:vAlign w:val="center"/>
+          </w:tcPr>
+          <w:p>
+            <w:r>
+              <w:rPr>
+                <w:sz w:val="19"/>
+                <w:szCs w:val="19"/>
+              </w:rPr>
+              <w:t xml:space="preserve">Incentives</w:t>
+            </w:r>
+          </w:p>
+        </w:tc>
+        <w:tc>
+          <w:tcPr>
+            <w:tcW w:type="dxa" w:w="4660"/>
+            <w:tcBorders>
+              <w:top w:val="single" w:color="D5DCE6" w:sz="1"/>
+              <w:left w:val="single" w:color="D5DCE6" w:sz="1"/>
+              <w:bottom w:val="single" w:color="D5DCE6" w:sz="1"/>
+              <w:right w:val="single" w:color="D5DCE6" w:sz="1"/>
+            </w:tcBorders>
+            <w:shd w:fill="FFFFFF" w:val="clear"/>
+            <w:tcMar>
+              <w:top w:type="dxa" w:w="50"/>
+              <w:left w:type="dxa" w:w="110"/>
+              <w:bottom w:type="dxa" w:w="50"/>
+              <w:right w:type="dxa" w:w="110"/>
+            </w:tcMar>
+            <w:vAlign w:val="center"/>
+          </w:tcPr>
+          <w:p>
+            <w:r>
+              <w:rPr>
+                <w:sz w:val="19"/>
+                <w:szCs w:val="19"/>
+              </w:rPr>
+              <w:t xml:space="preserve">State &amp; provincial program catalog</w:t>
+            </w:r>
+          </w:p>
+        </w:tc>
+        <w:tc>
+          <w:tcPr>
+            <w:tcW w:type="dxa" w:w="2400"/>
+            <w:tcBorders>
+              <w:top w:val="single" w:color="D5DCE6" w:sz="1"/>
+              <w:left w:val="single" w:color="D5DCE6" w:sz="1"/>
+              <w:bottom w:val="single" w:color="D5DCE6" w:sz="1"/>
+              <w:right w:val="single" w:color="D5DCE6" w:sz="1"/>
+            </w:tcBorders>
+            <w:shd w:fill="FFFFFF" w:val="clear"/>
+            <w:tcMar>
+              <w:top w:type="dxa" w:w="50"/>
+              <w:left w:type="dxa" w:w="110"/>
+              <w:bottom w:type="dxa" w:w="50"/>
+              <w:right w:type="dxa" w:w="110"/>
+            </w:tcMar>
+            <w:vAlign w:val="center"/>
+          </w:tcPr>
+          <w:p>
+            <w:r>
+              <w:rPr>
+                <w:sz w:val="19"/>
+                <w:szCs w:val="19"/>
+              </w:rPr>
+              <w:t xml:space="preserve">State / province</w:t>
+            </w:r>
+          </w:p>
+        </w:tc>
+      </w:tr>
+      <w:tr>
+        <w:tc>
+          <w:tcPr>
+            <w:tcW w:type="dxa" w:w="2300"/>
+            <w:tcBorders>
+              <w:top w:val="single" w:color="D5DCE6" w:sz="1"/>
+              <w:left w:val="single" w:color="D5DCE6" w:sz="1"/>
+              <w:bottom w:val="single" w:color="D5DCE6" w:sz="1"/>
+              <w:right w:val="single" w:color="D5DCE6" w:sz="1"/>
+            </w:tcBorders>
+            <w:shd w:fill="F4F7FB" w:val="clear"/>
+            <w:tcMar>
+              <w:top w:type="dxa" w:w="50"/>
+              <w:left w:type="dxa" w:w="110"/>
+              <w:bottom w:type="dxa" w:w="50"/>
+              <w:right w:type="dxa" w:w="110"/>
+            </w:tcMar>
+            <w:vAlign w:val="center"/>
+          </w:tcPr>
+          <w:p>
+            <w:r>
+              <w:rPr>
+                <w:sz w:val="19"/>
+                <w:szCs w:val="19"/>
+              </w:rPr>
+              <w:t xml:space="preserve">Canada demographics / infrastructure</w:t>
+            </w:r>
+          </w:p>
+        </w:tc>
+        <w:tc>
+          <w:tcPr>
+            <w:tcW w:type="dxa" w:w="4660"/>
+            <w:tcBorders>
+              <w:top w:val="single" w:color="D5DCE6" w:sz="1"/>
+              <w:left w:val="single" w:color="D5DCE6" w:sz="1"/>
+              <w:bottom w:val="single" w:color="D5DCE6" w:sz="1"/>
+              <w:right w:val="single" w:color="D5DCE6" w:sz="1"/>
+            </w:tcBorders>
+            <w:shd w:fill="F4F7FB" w:val="clear"/>
+            <w:tcMar>
+              <w:top w:type="dxa" w:w="50"/>
+              <w:left w:type="dxa" w:w="110"/>
+              <w:bottom w:type="dxa" w:w="50"/>
+              <w:right w:type="dxa" w:w="110"/>
+            </w:tcMar>
+            <w:vAlign w:val="center"/>
+          </w:tcPr>
+          <w:p>
+            <w:r>
+              <w:rPr>
+                <w:sz w:val="19"/>
+                <w:szCs w:val="19"/>
+              </w:rPr>
+              <w:t xml:space="preserve">StatCan Census + layers</w:t>
+            </w:r>
+          </w:p>
+        </w:tc>
+        <w:tc>
+          <w:tcPr>
+            <w:tcW w:type="dxa" w:w="2400"/>
+            <w:tcBorders>
+              <w:top w:val="single" w:color="D5DCE6" w:sz="1"/>
+              <w:left w:val="single" w:color="D5DCE6" w:sz="1"/>
+              <w:bottom w:val="single" w:color="D5DCE6" w:sz="1"/>
+              <w:right w:val="single" w:color="D5DCE6" w:sz="1"/>
+            </w:tcBorders>
+            <w:shd w:fill="F4F7FB" w:val="clear"/>
+            <w:tcMar>
+              <w:top w:type="dxa" w:w="50"/>
+              <w:left w:type="dxa" w:w="110"/>
+              <w:bottom w:type="dxa" w:w="50"/>
+              <w:right w:type="dxa" w:w="110"/>
+            </w:tcMar>
+            <w:vAlign w:val="center"/>
+          </w:tcPr>
+          <w:p>
+            <w:r>
+              <w:rPr>
+                <w:sz w:val="19"/>
+                <w:szCs w:val="19"/>
+              </w:rPr>
+              <w:t xml:space="preserve">CDUID</w:t>
+            </w:r>
+          </w:p>
+        </w:tc>
+      </w:tr>
+      <w:tr>
+        <w:tc>
+          <w:tcPr>
+            <w:tcW w:type="dxa" w:w="2300"/>
             <w:tcBorders>
               <w:top w:val="single" w:color="D5DCE6" w:sz="1"/>
               <w:left w:val="single" w:color="D5DCE6" w:sz="1"/>
@@ -5016,7 +4734,7 @@
         </w:tc>
         <w:tc>
           <w:tcPr>
-            <w:tcW w:type="dxa" w:w="4760"/>
+            <w:tcW w:type="dxa" w:w="4660"/>
             <w:tcBorders>
               <w:top w:val="single" w:color="D5DCE6" w:sz="1"/>
               <w:left w:val="single" w:color="D5DCE6" w:sz="1"/>
@@ -5095,10 +4813,22 @@
           <w:b/>
           <w:bCs/>
         </w:rPr>
-        <w:t xml:space="preserve">Infrastructure (power) </w:t>
-      </w:r>
-      <w:r>
-        <w:t xml:space="preserve">is not yet county-tagged — that dimension currently scores null.</w:t>
+        <w:t xml:space="preserve">ASCE grades: </w:t>
+      </w:r>
+      <w:r>
+        <w:t xml:space="preserve">TX, CA, FL are verified from ASCE; the remaining states are a best-effort set in </w:t>
+      </w:r>
+      <w:r>
+        <w:rPr>
+          <w:rFonts w:ascii="Consolas" w:cs="Consolas" w:eastAsia="Consolas" w:hAnsi="Consolas"/>
+          <w:color w:val="39455A"/>
+          <w:sz w:val="19"/>
+          <w:szCs w:val="19"/>
+        </w:rPr>
+        <w:t xml:space="preserve">state_infrastructure_grades.json</w:t>
+      </w:r>
+      <w:r>
+        <w:t xml:space="preserve"> — verify and edit.</w:t>
       </w:r>
     </w:p>
     <w:p>
@@ -5135,10 +4865,10 @@
           <w:b/>
           <w:bCs/>
         </w:rPr>
-        <w:t xml:space="preserve">Member counties </w:t>
-      </w:r>
-      <w:r>
-        <w:t xml:space="preserve">for regional/utility EDOs are largely tagged to their home county pending full enumeration.</w:t>
+        <w:t xml:space="preserve">Market proximity &amp; the map are US-only </w:t>
+      </w:r>
+      <w:r>
+        <w:t xml:space="preserve">(county centroids); Canadian proximity needs StatCan CD centroids.</w:t>
       </w:r>
     </w:p>
     <w:p>
@@ -5155,10 +4885,10 @@
           <w:b/>
           <w:bCs/>
         </w:rPr>
-        <w:t xml:space="preserve">Infant mortality </w:t>
-      </w:r>
-      <w:r>
-        <w:t xml:space="preserve">is averaged across the source's race breakdown into a single community-health indicator.</w:t>
+        <w:t xml:space="preserve">Member counties </w:t>
+      </w:r>
+      <w:r>
+        <w:t xml:space="preserve">for regional/utility EDOs are largely tagged to their home county pending full enumeration.</w:t>
       </w:r>
     </w:p>
     <w:p>
@@ -5178,7 +4908,7 @@
         <w:t xml:space="preserve">Rationale </w:t>
       </w:r>
       <w:r>
-        <w:t xml:space="preserve">is currently generated by a deterministic template; an optional LLM-written version can replace it without changing the ranking.</w:t>
+        <w:t xml:space="preserve">is template-generated; an optional LLM-written version can replace it without changing the ranking.</w:t>
       </w:r>
     </w:p>
     <w:sectPr>
@@ -5638,23 +5368,5 @@
       <w:szCs w:val="25"/>
     </w:rPr>
   </w:style>
-  <w:style w:type="paragraph" w:styleId="Heading3">
-    <w:name w:val="Heading 3"/>
-    <w:basedOn w:val="Normal"/>
-    <w:next w:val="Normal"/>
-    <w:qFormat/>
-    <w:pPr>
-      <w:spacing w:after="80" w:before="160"/>
-      <w:outlineLvl w:val="2"/>
-    </w:pPr>
-    <w:rPr>
-      <w:rFonts w:ascii="Calibri" w:cs="Calibri" w:eastAsia="Calibri" w:hAnsi="Calibri"/>
-      <w:b/>
-      <w:bCs/>
-      <w:color w:val="3A4658"/>
-      <w:sz w:val="22"/>
-      <w:szCs w:val="22"/>
-    </w:rPr>
-  </w:style>
 </w:styles>
 </file>
</xml_diff>

<commit_message>
Technical guide 2.2: document the tiered cost ranking
Section 3.3 gains the one exception to national percentile ranking: cost
is ranked within four market-size tiers by regional catchment, with the
tier bounds, the ~50 average per tier, the single Canadian tier, the
COST_TIERS / TIERED_DIMS knobs, and the measured before/after that
justified adopting it - including that it does not lift the dearest
coastal metros, which is a weighting question. The design-principles
bullet notes the exception, and the Cost row in 3.9 now lists the actual
metrics (household income, BEA employer earnings, wealth index, wage
headroom) and points at 3.3.

Co-Authored-By: Claude Fable 5.1 <noreply@anthropic.com>
</commit_message>
<xml_diff>
--- a/FastLocations_Technical_and_Scoring_Guide.docx
+++ b/FastLocations_Technical_and_Scoring_Guide.docx
@@ -125,13 +125,13 @@
         <w:rPr>
           <w:color w:val="6B7787"/>
         </w:rPr>
-        <w:t xml:space="preserve">Version 2.1  </w:t>
+        <w:t xml:space="preserve">Version 2.2  </w:t>
       </w:r>
       <w:r>
         <w:rPr>
           <w:color w:val="6B7787"/>
         </w:rPr>
-        <w:t xml:space="preserve">· Generated 2026-07-06, updated 2026-09-06 (DAI dimension)</w:t>
+        <w:t xml:space="preserve">· Generated 2026-07-06, updated 2026-09-06 (DAI dimension; cost ranked within market-size tiers)</w:t>
       </w:r>
     </w:p>
     <w:p>
@@ -873,7 +873,7 @@
         <w:t xml:space="preserve">Absolute, nationally anchored. </w:t>
       </w:r>
       <w:r>
-        <w:t xml:space="preserve">Every metric is percentile-ranked against the WHOLE selected-country set - not just the candidates that pass the query's filters. So a FastLocations Score means the same thing in a nationwide search and a single-state search: it is the county's standing against the country, not against whatever survived the filter.</w:t>
+        <w:t xml:space="preserve">Every metric is percentile-ranked against the WHOLE selected-country set (cost against markets of its own size, see 3.3) - not just the candidates that pass the query's filters. So a FastLocations Score means the same thing in a nationwide search and a single-state search: it is the county's standing against the country, not against whatever survived the filter.</w:t>
       </w:r>
     </w:p>
     <w:p>
@@ -1144,6 +1144,22 @@
       </w:r>
       <w:r>
         <w:t xml:space="preserve"> for a candidate are skipped and the average renormalises over the rest.</w:t>
+      </w:r>
+    </w:p>
+    <w:p>
+      <w:pPr>
+        <w:spacing w:after="120" w:line="276"/>
+      </w:pPr>
+      <w:r>
+        <w:t xml:space="preserve">One exception: the Cost dimension is percentile-ranked within four market-size tiers rather than against the whole country. The tiers are by regional catchment, the same reach measure the reliability damping uses: under 100,000; 100,000 to 500,000; 500,000 to 2 million; and 2 million or more (about 600, 1,300, 1,000 and 200 US counties respectively). A cost sub-score therefore means "how expensive is this market for one of its size", and every tier averages about 50, so no size class is systematically cheap or dear. Canada is a single tier: its catchments are an order of magnitude smaller and tiers would leave two or three census divisions ranking against each other. The tiers and the set of tiered dimensions are COST_TIERS and TIERED_DIMS in scorer.py.</w:t>
+      </w:r>
+    </w:p>
+    <w:p>
+      <w:pPr>
+        <w:spacing w:after="120" w:line="276"/>
+      </w:pPr>
+      <w:r>
+        <w:t xml:space="preserve">Why: ranked nationally, every large metro sat in the bottom decile on cost simply because wages rise with market size (Seattle 1, Santa Clara 0, Phoenix 10, San Diego 5, Las Vegas 25), and with cost, real estate and safety carrying 28% of the default weight that stack cost the big western markets 7 to 11 points of weighted total - the gap between rank 200 and the top 10. Measured before adopting in 2.2: Phoenix 10 to 49, Las Vegas 25 to 72, Riverside 22 to 63, San Diego 5 to 31; the losers are small Midwest counties that had been credited for cheapness against the whole country. It does not lift the dearest coastal metros (Seattle 1 to 12, Santa Clara 0 to 3), which are the most expensive markets even among big ones - that is a weighting question (the R&amp;D preset runs cost at 5), not a ranking one. Real estate was measured too and stays national.</w:t>
       </w:r>
     </w:p>
     <w:p>
@@ -2668,7 +2684,7 @@
                 <w:sz w:val="18"/>
                 <w:szCs w:val="18"/>
               </w:rPr>
-              <w:t xml:space="preserve">US: median household income + wealth/cost-of-living index.  CA: median household income.</w:t>
+              <w:t xml:space="preserve">US: median household income + BEA employer earnings + wealth/cost-of-living index, plus wage headroom against the project's target wage when one is given; ranked within market-size tiers (see 3.3).  CA: median household income.</w:t>
             </w:r>
           </w:p>
         </w:tc>

</xml_diff>

<commit_message>
Technical guide 2.4: the metro labor market
- 3.3: new part on cost and safety reading the metro labor market - why
  (outer counties got the metro's people at their own prices; BEA
  earnings per resident tracks job location), the rules (metro employer
  wages, half-metro income, cost of living and crime, county-level real
  estate), and the measured effect, including what it does not fix.
- 3.5 / 3.9: land price counts x0.5 for office projects; the cost,
  safety and real estate rows say how metro blending applies.
- 6: the cheap-outer-counties limitation becomes "neighbouring metros" -
  own-metro counties near a big one (LaPorte, Riverside) still borrow its
  catchment; tightening the catchment is the next lever.
- Version line and test count (50).

Co-Authored-By: Claude Opus 5 <noreply@anthropic.com>
</commit_message>
<xml_diff>
--- a/FastLocations_Technical_and_Scoring_Guide.docx
+++ b/FastLocations_Technical_and_Scoring_Guide.docx
@@ -125,13 +125,13 @@
         <w:rPr>
           <w:color w:val="6B7787"/>
         </w:rPr>
-        <w:t xml:space="preserve">Version 2.3  </w:t>
+        <w:t xml:space="preserve">Version 2.4  </w:t>
       </w:r>
       <w:r>
         <w:rPr>
           <w:color w:val="6B7787"/>
         </w:rPr>
-        <w:t xml:space="preserve">· Generated 2026-07-06, updated 2026-09-10 (DAI folded into Workforce; Top 5 spread across regions)</w:t>
+        <w:t xml:space="preserve">· Generated 2026-07-06, updated 2026-09-10 (DAI folded into Workforce; Top 5 spread across regions; cost and safety read the metro labor market)</w:t>
       </w:r>
     </w:p>
     <w:p>
@@ -810,7 +810,7 @@
         <w:t xml:space="preserve">python test_scorer.py</w:t>
       </w:r>
       <w:r>
-        <w:t xml:space="preserve"> runs 48 invariant checks (determinism within and across processes, score bounds, tie handling, national anchoring, filters, staffability, right-to-work, coverage bonus, Canadian null handling, the DAI score's fixed share of Workforce, the regional spread of the Top 5, and more). Run it after any change to the engine.</w:t>
+        <w:t xml:space="preserve"> runs 50 invariant checks (determinism within and across processes, score bounds, tie handling, national anchoring, filters, staffability, right-to-work, coverage bonus, Canadian null handling, the DAI score's fixed share of Workforce, the regional spread of the Top 5, metro labor-market blending, and more). Run it after any change to the engine.</w:t>
       </w:r>
     </w:p>
     <w:p>
@@ -1180,6 +1180,89 @@
       </w:pPr>
       <w:r>
         <w:t xml:space="preserve">Why: ranked nationally, every large metro sat in the bottom decile on cost simply because wages rise with market size (Seattle 1, Santa Clara 0, Phoenix 10, San Diego 5, Las Vegas 25), and with cost, real estate and safety carrying 28% of the default weight that stack cost the big western markets 7 to 11 points of weighted total - the gap between rank 200 and the top 10. Measured before adopting in 2.2: Phoenix 10 to 49, Las Vegas 25 to 72, Riverside 22 to 63, San Diego 5 to 31; the losers are small Midwest counties that had been credited for cheapness against the whole country. It does not lift the dearest coastal metros (Seattle 1 to 12, Santa Clara 0 to 3), which are the most expensive markets even among big ones - that is a weighting question (the R&amp;D preset runs cost at 5), not a ranking one. Real estate was measured too and stays national.</w:t>
+      </w:r>
+    </w:p>
+    <w:p>
+      <w:pPr>
+        <w:spacing w:after="120" w:line="276"/>
+      </w:pPr>
+      <w:r>
+        <w:rPr>
+          <w:b/>
+          <w:bCs/>
+        </w:rPr>
+        <w:t xml:space="preserve">The metro labor market. </w:t>
+      </w:r>
+      <w:r>
+        <w:t xml:space="preserve">Market size already reaches across the metro (the regional catchment), but cost and safety used to be read from the county alone, so a cheap, low-crime county on a big metro's edge got the metro's people at its own prices. Henry and Paulding outranked Fulton in Atlanta, and Alexandria and Arlington, inside the DC metro, ranked #3 and #5 on an Office search. Wages are set by the labor market, which is the metro, and BEA earnings by place of work per resident is misleading inside one: it measures where the jobs sit, not what they pay (Paulding $12k, Fulton $128k, one labor market). So within a multi-county MSA (Census CBSA delineation, fips_to_msa.json):</w:t>
+      </w:r>
+    </w:p>
+    <w:p>
+      <w:pPr>
+        <w:pStyle w:val="ListParagraph"/>
+        <w:numPr>
+          <w:ilvl w:val="0"/>
+          <w:numId w:val="2"/>
+        </w:numPr>
+        <w:spacing w:after="60"/>
+      </w:pPr>
+      <w:r>
+        <w:rPr>
+          <w:b/>
+          <w:bCs/>
+        </w:rPr>
+        <w:t xml:space="preserve">Employer wages </w:t>
+      </w:r>
+      <w:r>
+        <w:t xml:space="preserve">use the metro's value - its total earnings over its residents - for every county in it.</w:t>
+      </w:r>
+    </w:p>
+    <w:p>
+      <w:pPr>
+        <w:pStyle w:val="ListParagraph"/>
+        <w:numPr>
+          <w:ilvl w:val="0"/>
+          <w:numId w:val="2"/>
+        </w:numPr>
+        <w:spacing w:after="60"/>
+      </w:pPr>
+      <w:r>
+        <w:rPr>
+          <w:b/>
+          <w:bCs/>
+        </w:rPr>
+        <w:t xml:space="preserve">Resident income, cost of living and crime </w:t>
+      </w:r>
+      <w:r>
+        <w:t xml:space="preserve">are half the metro's population-weighted value and half the county's own (METRO_BLEND = 0.5), so an outer county still gets credit for being cheaper or safer than its core, but is no longer judged as if it were rural.</w:t>
+      </w:r>
+    </w:p>
+    <w:p>
+      <w:pPr>
+        <w:pStyle w:val="ListParagraph"/>
+        <w:numPr>
+          <w:ilvl w:val="0"/>
+          <w:numId w:val="2"/>
+        </w:numPr>
+        <w:spacing w:after="60"/>
+      </w:pPr>
+      <w:r>
+        <w:rPr>
+          <w:b/>
+          <w:bCs/>
+        </w:rPr>
+        <w:t xml:space="preserve">Real estate </w:t>
+      </w:r>
+      <w:r>
+        <w:t xml:space="preserve">stays county-level: the land price and tax rate are the site's own, a genuine local advantage. Counties outside a multi-county MSA, and Canada (whose crime index is already CMA-level), are unchanged.</w:t>
+      </w:r>
+    </w:p>
+    <w:p>
+      <w:pPr>
+        <w:spacing w:after="120" w:line="276"/>
+      </w:pPr>
+      <w:r>
+        <w:t xml:space="preserve">Measured when adopted in 2.4 (rank among counties with a customer EDO, default weights and all seven presets): Henry County, GA fell from #6 to #27 on the default search while Fulton rose from #36 to #16 (#50 to #19 on Office); Mecklenburg, NC moved from between #31 and #62 to between #13 and #21; on Office, Alexandria fell from #3 to #17 and Arlington from #5 to #12. Canada did not move. Counties that are their own Census metro but sit within reach of a big one - LaPorte, IN (Michigan City-La Porte, near Chicago), Riverside, CA (near Los Angeles), Northampton, PA - are not affected, because their lift comes from the catchment in market size, not from cost (see 6). The Southeast's share of the Top 5 rose (35% on scores alone, from 30%), as its metro cores - Orlando, Charlotte, Atlanta - replaced its outer counties.</w:t>
       </w:r>
     </w:p>
     <w:p>
@@ -1651,7 +1734,7 @@
                 <w:sz w:val="18"/>
                 <w:szCs w:val="18"/>
               </w:rPr>
-              <w:t xml:space="preserve">Land purchase price outweighs the annual property-tax rate within Real estate.</w:t>
+              <w:t xml:space="preserve">Land purchase price outweighs the annual property-tax rate within Real estate - except for office projects, where it counts x0.5 (USE_METRIC_WEIGHTS): an office leases or buys built space, so the per-acre raw-land price says little about its cost and the property tax that leases pass through carries the score.</w:t>
             </w:r>
           </w:p>
         </w:tc>
@@ -2732,7 +2815,7 @@
                 <w:sz w:val="18"/>
                 <w:szCs w:val="18"/>
               </w:rPr>
-              <w:t xml:space="preserve">US: median household income + BEA employer earnings + wealth/cost-of-living index, plus wage headroom against the project's target wage when one is given; ranked within market-size tiers (see 3.3).  CA: median household income.</w:t>
+              <w:t xml:space="preserve">US: median household income + BEA employer earnings + wealth/cost-of-living index, plus wage headroom against the project's target wage when one is given; ranked within market-size tiers, and within a multi-county MSA employer wages are the metro's and income and cost of living half the metro's (see 3.3).  CA: median household income.</w:t>
             </w:r>
           </w:p>
         </w:tc>
@@ -2846,7 +2929,7 @@
                 <w:sz w:val="18"/>
                 <w:szCs w:val="18"/>
               </w:rPr>
-              <w:t xml:space="preserve">US: land purchase price (x2, USDA farm real estate per acre as a raw-land proxy) + effective property-tax rate.  CA: median dwelling value.</w:t>
+              <w:t xml:space="preserve">US: land purchase price (x2, or x0.5 for office projects; USDA farm real estate per acre as a raw-land proxy) + effective property-tax rate. County-level, never metro-blended.  CA: median dwelling value.</w:t>
             </w:r>
           </w:p>
         </w:tc>
@@ -3530,7 +3613,7 @@
                 <w:sz w:val="18"/>
                 <w:szCs w:val="18"/>
               </w:rPr>
-              <w:t xml:space="preserve">US: crime rate.  CA: StatCan Crime Severity Index (CMA-precise where mapped, else provincial).</w:t>
+              <w:t xml:space="preserve">US: crime rate, half the metro's within a multi-county MSA (see 3.3).  CA: StatCan Crime Severity Index (CMA-precise where mapped, else provincial).</w:t>
             </w:r>
           </w:p>
         </w:tc>
@@ -6940,10 +7023,10 @@
           <w:b/>
           <w:bCs/>
         </w:rPr>
-        <w:t xml:space="preserve">Cheap outer counties. </w:t>
-      </w:r>
-      <w:r>
-        <w:t xml:space="preserve">Market size and staffing use the regional catchment while cost, real estate and safety are county-level, so a low-cost county on a big metro's edge (Henry, GA; LaPorte, IN) can top even an Office search. Blending county and metro values for those dimensions, and making real estate use-type aware, is on the roadmap.</w:t>
+        <w:t xml:space="preserve">Neighbouring metros. </w:t>
+      </w:r>
+      <w:r>
+        <w:t xml:space="preserve">Cost and safety now read the metro labor market (3.3), which settled outer counties inside an MSA. A county that is its own metro but sits within reach of a big one (LaPorte, IN near Chicago; Riverside, CA near Los Angeles) still earns much of the big metro's population in market size while keeping its own costs, and can top even an Office search. Tightening the catchment's distance decay, or crediting only the county's own metro, is the next lever.</w:t>
       </w:r>
     </w:p>
     <w:sectPr>

</xml_diff>

<commit_message>
Technical guide 2.5: cost tiers and damping by metro population
- 3.3: the tiers are by market population (the county's metro, or its
  own outside one) with updated tier counts; new part "Which market a
  county belongs to" on why the catchment let small metros borrow a big
  one's size, what replaced it, the rejected alternatives and the
  measured effect.
- 3.6 / 3.8: damping formula uses market_pop; the worked example says
  "a metro of 900,000 people".
- 3.9: market size still uses the catchment; tiers and damping don't.
- 6: the neighbouring-metros limitation is resolved; replaced by the
  Office preset's 30% weight on cost, real estate and safety.
- Version line and test count (51).

Co-Authored-By: Claude Opus 5 <noreply@anthropic.com>
</commit_message>
<xml_diff>
--- a/FastLocations_Technical_and_Scoring_Guide.docx
+++ b/FastLocations_Technical_and_Scoring_Guide.docx
@@ -125,13 +125,13 @@
         <w:rPr>
           <w:color w:val="6B7787"/>
         </w:rPr>
-        <w:t xml:space="preserve">Version 2.4  </w:t>
+        <w:t xml:space="preserve">Version 2.5  </w:t>
       </w:r>
       <w:r>
         <w:rPr>
           <w:color w:val="6B7787"/>
         </w:rPr>
-        <w:t xml:space="preserve">· Generated 2026-07-06, updated 2026-09-10 (DAI folded into Workforce; Top 5 spread across regions; cost and safety read the metro labor market)</w:t>
+        <w:t xml:space="preserve">· Generated 2026-07-06, updated 2026-09-10 (DAI folded into Workforce; Top 5 spread across regions; cost and safety read the metro labor market; cost tiers and damping use the metro, not the catchment)</w:t>
       </w:r>
     </w:p>
     <w:p>
@@ -810,7 +810,7 @@
         <w:t xml:space="preserve">python test_scorer.py</w:t>
       </w:r>
       <w:r>
-        <w:t xml:space="preserve"> runs 50 invariant checks (determinism within and across processes, score bounds, tie handling, national anchoring, filters, staffability, right-to-work, coverage bonus, Canadian null handling, the DAI score's fixed share of Workforce, the regional spread of the Top 5, metro labor-market blending, and more). Run it after any change to the engine.</w:t>
+        <w:t xml:space="preserve"> runs 51 invariant checks (determinism within and across processes, score bounds, tie handling, national anchoring, filters, staffability, right-to-work, coverage bonus, Canadian null handling, the DAI score's fixed share of Workforce, the regional spread of the Top 5, metro labor-market blending, metro-based cost tiers and damping, and more). Run it after any change to the engine.</w:t>
       </w:r>
     </w:p>
     <w:p>
@@ -1171,7 +1171,7 @@
         <w:spacing w:after="120" w:line="276"/>
       </w:pPr>
       <w:r>
-        <w:t xml:space="preserve">One exception: the Cost dimension is percentile-ranked within four market-size tiers rather than against the whole country. The tiers are by regional catchment, the same reach measure the reliability damping uses: under 100,000; 100,000 to 500,000; 500,000 to 2 million; and 2 million or more (about 600, 1,300, 1,000 and 200 US counties respectively). A cost sub-score therefore means "how expensive is this market for one of its size", and every tier averages about 50, so no size class is systematically cheap or dear. Canada is a single tier: its catchments are an order of magnitude smaller and tiers would leave two or three census divisions ranking against each other. The tiers and the set of tiered dimensions are COST_TIERS and TIERED_DIMS in scorer.py.</w:t>
+        <w:t xml:space="preserve">One exception: the Cost dimension is percentile-ranked within four market-size tiers rather than against the whole country. The tiers are by market population - the population of the county's Census metro, or the county's own outside a metro, the same measure the reliability damping uses (see 3.6): under 100,000; 100,000 to 500,000; 500,000 to 2 million; and 2 million or more (about 1,970, 550, 310 and 320 US counties respectively; the first is essentially every county outside a metro). A cost sub-score therefore means "how expensive is this market for one of its size", and every tier averages about 50, so no size class is systematically cheap or dear. Canada is a single tier: its catchments are an order of magnitude smaller and tiers would leave two or three census divisions ranking against each other. The tiers and the set of tiered dimensions are COST_TIERS and TIERED_DIMS in scorer.py.</w:t>
       </w:r>
     </w:p>
     <w:p>
@@ -1262,7 +1262,38 @@
         <w:spacing w:after="120" w:line="276"/>
       </w:pPr>
       <w:r>
-        <w:t xml:space="preserve">Measured when adopted in 2.4 (rank among counties with a customer EDO, default weights and all seven presets): Henry County, GA fell from #6 to #27 on the default search while Fulton rose from #36 to #16 (#50 to #19 on Office); Mecklenburg, NC moved from between #31 and #62 to between #13 and #21; on Office, Alexandria fell from #3 to #17 and Arlington from #5 to #12. Canada did not move. Counties that are their own Census metro but sit within reach of a big one - LaPorte, IN (Michigan City-La Porte, near Chicago), Riverside, CA (near Los Angeles), Northampton, PA - are not affected, because their lift comes from the catchment in market size, not from cost (see 6). The Southeast's share of the Top 5 rose (35% on scores alone, from 30%), as its metro cores - Orlando, Charlotte, Atlanta - replaced its outer counties.</w:t>
+        <w:t xml:space="preserve">Measured when adopted in 2.4 (rank among counties with a customer EDO, default weights and all seven presets): Henry County, GA fell from #6 to #27 on the default search while Fulton rose from #36 to #16 (#50 to #19 on Office); Mecklenburg, NC moved from between #31 and #62 to between #13 and #21; on Office, Alexandria fell from #3 to #17 and Arlington from #5 to #12. Canada did not move. Counties that are their own Census metro but sit within reach of a big one were not affected by this; their lift came through the catchment, and is dealt with next. The Southeast's share of the Top 5 rose (35% on scores alone, from 30%), as its metro cores - Orlando, Charlotte, Atlanta - replaced its outer counties.</w:t>
+      </w:r>
+    </w:p>
+    <w:p>
+      <w:pPr>
+        <w:spacing w:after="120" w:line="276"/>
+      </w:pPr>
+      <w:r>
+        <w:rPr>
+          <w:b/>
+          <w:bCs/>
+        </w:rPr>
+        <w:t xml:space="preserve">Which market a county belongs to. </w:t>
+      </w:r>
+      <w:r>
+        <w:t xml:space="preserve">The cost tiers and the reliability damping (3.6) both ask how big a county's market is. Until 2.5 they used the regional catchment - everyone within 110 km, distance-decayed, whatever metro they live in - so a small county near a big metro borrowed that metro's size. LaPorte, IN is its own Census metro (Michigan City-La Porte, 110,000 people) about 60 miles from Chicago, but its 2.1 million catchment had its costs ranked against Chicago-sized markets, where it looked very cheap, and its score barely damped; it was the #7 default result. Bloomington, IN (Monroe) was #5 and the Lehigh Valley (Northampton, PA) #12 the same way.</w:t>
+      </w:r>
+    </w:p>
+    <w:p>
+      <w:pPr>
+        <w:spacing w:after="120" w:line="276"/>
+      </w:pPr>
+      <w:r>
+        <w:t xml:space="preserve">As of 2.5 both use market_pop(): the population of the county's Census metro (MSA), or the county's own outside a metro. That is the Census commuting-based definition of a labor market, and as a fixed definition it does not push metros across a tier line when a distance setting changes - tightening the catchment's decay instead was tried and did (Austin and Charlotte fell 40-plus places for reasons unrelated to borrowing). The catchment still measures reach where distance is the point: the market_size dimension (customers within 110 km are real customers) and the labor-draw thresholds. Canada keeps its catchment for all three.</w:t>
+      </w:r>
+    </w:p>
+    <w:p>
+      <w:pPr>
+        <w:spacing w:after="120" w:line="276"/>
+      </w:pPr>
+      <w:r>
+        <w:t xml:space="preserve">Measured when adopted: LaPorte fell from #7 to #182 on the default search, Bloomington from #5 to #33 and Northampton from #12 to #37, while metro cores rose - Cincinnati (Hamilton, OH) #97 to #13, Arapahoe, CO (Denver) #11 to #5 - and Maricopa stayed #1. Canada did not move. The Northeast lost its one default Top-5 slot, which Northampton had held on the borrowed catchment; its gap is customer-EDO coverage (3.11).</w:t>
       </w:r>
     </w:p>
     <w:p>
@@ -1820,7 +1851,7 @@
         <w:spacing w:after="120" w:line="276"/>
       </w:pPr>
       <w:r>
-        <w:t xml:space="preserve">Percentile metrics are noisy in thin markets, and a tiny county can rarely host a project. Each candidate's total is shrunk toward the national centre (50) by a reliability factor based on its MARKET reach - the regional catchment population - not just its own county headcount, so a small county inside a large metro (e.g. Arlington, VA in the DC metro) is treated as a reliable, deep market:</w:t>
+        <w:t xml:space="preserve">Percentile metrics are noisy in thin markets, and a tiny county can rarely host a project. Each candidate's total is shrunk toward the national centre (50) by a reliability factor based on its MARKET - the population of its Census metro, or its own outside a metro (market_pop) - not just its own county headcount, so a small county inside a large metro (e.g. Arlington, VA in the DC metro) is treated as a reliable, deep market:</w:t>
       </w:r>
     </w:p>
     <w:tbl>
@@ -1863,7 +1894,7 @@
                 <w:sz w:val="19"/>
                 <w:szCs w:val="19"/>
               </w:rPr>
-              <w:t xml:space="preserve">rel = catchment / (catchment + 100,000)</w:t>
+              <w:t xml:space="preserve">rel = market_pop / (market_pop + 100,000)</w:t>
             </w:r>
           </w:p>
           <w:p>
@@ -1888,7 +1919,7 @@
         <w:spacing w:after="120" w:line="276"/>
       </w:pPr>
       <w:r>
-        <w:t xml:space="preserve">Genuinely isolated small markets (catchment ~ own population) are pulled toward the middle; metro-embedded counties keep their score.</w:t>
+        <w:t xml:space="preserve">Counties outside any metro, and small metros, are pulled toward the middle; metro-embedded counties keep their score. Until 2.5 this used the distance catchment, which let a small metro near a big one borrow its size (see 3.3). Canada still uses its catchment.</w:t>
       </w:r>
     </w:p>
     <w:p>
@@ -2421,7 +2452,7 @@
                 <w:sz w:val="19"/>
                 <w:szCs w:val="19"/>
               </w:rPr>
-              <w:t xml:space="preserve">rel      = catchment / (catchment + 100000)</w:t>
+              <w:t xml:space="preserve">rel      = market_pop / (market_pop + 100000)     (metro population)</w:t>
             </w:r>
           </w:p>
           <w:p>
@@ -3385,7 +3416,7 @@
                 <w:sz w:val="18"/>
                 <w:szCs w:val="18"/>
               </w:rPr>
-              <w:t xml:space="preserve">Regional catchment population - people reachable within ~110 km (US) / 250 km (CA), distance-decayed.  *Canada floors this weight at 0.20.</w:t>
+              <w:t xml:space="preserve">Regional catchment population - people reachable within ~110 km (US) / 250 km (CA), distance-decayed. The cost tiers and damping use the metro population instead (3.3, 3.6).  *Canada floors this weight at 0.20.</w:t>
             </w:r>
           </w:p>
         </w:tc>
@@ -6841,7 +6872,7 @@
         <w:spacing w:after="120" w:line="276"/>
       </w:pPr>
       <w:r>
-        <w:t xml:space="preserve">Suppose a county scores 82 on Cost, 74 on Workforce, 60 on Infrastructure, and so on; the rest average in by weight to a total near 63. It sits in a 900,000-catchment metro, so </w:t>
+        <w:t xml:space="preserve">Suppose a county scores 82 on Cost, 74 on Workforce, 60 on Infrastructure, and so on; the rest average in by weight to a total near 63. It sits in a metro of 900,000 people, so </w:t>
       </w:r>
       <w:r>
         <w:rPr>
@@ -7023,10 +7054,10 @@
           <w:b/>
           <w:bCs/>
         </w:rPr>
-        <w:t xml:space="preserve">Neighbouring metros. </w:t>
-      </w:r>
-      <w:r>
-        <w:t xml:space="preserve">Cost and safety now read the metro labor market (3.3), which settled outer counties inside an MSA. A county that is its own metro but sits within reach of a big one (LaPorte, IN near Chicago; Riverside, CA near Los Angeles) still earns much of the big metro's population in market size while keeping its own costs, and can top even an Office search. Tightening the catchment's distance decay, or crediting only the county's own metro, is the next lever.</w:t>
+        <w:t xml:space="preserve">Office weighting. </w:t>
+      </w:r>
+      <w:r>
+        <w:t xml:space="preserve">The Office preset still gives cost, real estate and safety 30% of the weight, so affordable logistics counties (Wood, OH; Platte, MO) can reach an Office Top 5 ahead of talent-dense cores. That is a question of the preset's weights, not of how any county is measured.</w:t>
       </w:r>
     </w:p>
     <w:sectPr>

</xml_diff>

<commit_message>
Technical guide 2.6: the Office preset is led by talent
- 3.9: new note on the Office preset's weights, why (30% cheapness put
  logistics counties in the Office Top 5) and the measured effect.
- 6: the Office-weighting limitation is removed.
- Version line and test count (52).

Co-Authored-By: Claude Opus 5 <noreply@anthropic.com>
</commit_message>
<xml_diff>
--- a/FastLocations_Technical_and_Scoring_Guide.docx
+++ b/FastLocations_Technical_and_Scoring_Guide.docx
@@ -125,13 +125,13 @@
         <w:rPr>
           <w:color w:val="6B7787"/>
         </w:rPr>
-        <w:t xml:space="preserve">Version 2.5  </w:t>
+        <w:t xml:space="preserve">Version 2.6  </w:t>
       </w:r>
       <w:r>
         <w:rPr>
           <w:color w:val="6B7787"/>
         </w:rPr>
-        <w:t xml:space="preserve">· Generated 2026-07-06, updated 2026-09-10 (DAI folded into Workforce; Top 5 spread across regions; cost and safety read the metro labor market; cost tiers and damping use the metro, not the catchment)</w:t>
+        <w:t xml:space="preserve">· Generated 2026-07-06, updated 2026-09-10 (DAI folded into Workforce; Top 5 spread across regions; cost and safety read the metro labor market; cost tiers and damping use the metro, not the catchment; Office preset led by talent)</w:t>
       </w:r>
     </w:p>
     <w:p>
@@ -810,7 +810,7 @@
         <w:t xml:space="preserve">python test_scorer.py</w:t>
       </w:r>
       <w:r>
-        <w:t xml:space="preserve"> runs 51 invariant checks (determinism within and across processes, score bounds, tie handling, national anchoring, filters, staffability, right-to-work, coverage bonus, Canadian null handling, the DAI score's fixed share of Workforce, the regional spread of the Top 5, metro labor-market blending, metro-based cost tiers and damping, and more). Run it after any change to the engine.</w:t>
+        <w:t xml:space="preserve"> runs 52 invariant checks (determinism within and across processes, score bounds, tie handling, national anchoring, filters, staffability, right-to-work, coverage bonus, Canadian null handling, the DAI score's fixed share of Workforce, the regional spread of the Top 5, metro labor-market blending, metro-based cost tiers and damping, the Office preset's talent weighting, and more). Run it after any change to the engine.</w:t>
       </w:r>
     </w:p>
     <w:p>
@@ -2506,6 +2506,21 @@
       </w:pPr>
       <w:r>
         <w:t xml:space="preserve">Default weights shown (they sum to 100); the form's sliders and use-type presets override them. Each dimension is scored differently for the US and Canadian spines because the available data differs.</w:t>
+      </w:r>
+    </w:p>
+    <w:p>
+      <w:pPr>
+        <w:spacing w:after="120" w:line="276"/>
+      </w:pPr>
+      <w:r>
+        <w:rPr>
+          <w:b/>
+          <w:bCs/>
+        </w:rPr>
+        <w:t xml:space="preserve">The Office preset </w:t>
+      </w:r>
+      <w:r>
+        <w:t xml:space="preserve">is led by talent: workforce 26, demographics (education) 12 and innovation (knowledge economy) 10, with market size 14 and livability 10 for scale and staff attraction; cost 8, real estate 4, safety 4, logistics 6, incentives 4 and infrastructure 2. Until 2.6 it gave cost, real estate and safety 30% against 32% for talent, which put affordable logistics counties in the Office Top 5. Measured when adopted: the Office Top 5 went from Maricopa, AZ; Seminole, FL; King, WA; Wood, OH; Platte, MO to Seminole, FL (Lake Mary); King, WA; Arapahoe, CO (Denver Tech Center); Johnson, KS (Overland Park); Suffolk, MA (Boston), with Dane, WI, Collin, TX and Williamson, TN in the top 10. King rose from #8 to #2, Suffolk #35 to #18 and Travis, TX #62 to #31; Wood, OH fell from #17 to #28. test_scorer.py holds the preset to talent at least twice cheapness, and cheapness at no more than 20.</w:t>
       </w:r>
     </w:p>
     <w:tbl>
@@ -7038,26 +7053,6 @@
       </w:r>
       <w:r>
         <w:t xml:space="preserve">Only counties with a customer EDO can be Primary matches and the EDO bonuses are large, so regions with thin coverage are under-represented regardless of weights. The regional rule (3.11) offsets this; check_regional_balance.py tracks it.</w:t>
-      </w:r>
-    </w:p>
-    <w:p>
-      <w:pPr>
-        <w:pStyle w:val="ListParagraph"/>
-        <w:numPr>
-          <w:ilvl w:val="0"/>
-          <w:numId w:val="2"/>
-        </w:numPr>
-        <w:spacing w:after="60"/>
-      </w:pPr>
-      <w:r>
-        <w:rPr>
-          <w:b/>
-          <w:bCs/>
-        </w:rPr>
-        <w:t xml:space="preserve">Office weighting. </w:t>
-      </w:r>
-      <w:r>
-        <w:t xml:space="preserve">The Office preset still gives cost, real estate and safety 30% of the weight, so affordable logistics counties (Wood, OH; Platte, MO) can reach an Office Top 5 ahead of talent-dense cores. That is a question of the preset's weights, not of how any county is measured.</w:t>
       </w:r>
     </w:p>
     <w:sectPr>

</xml_diff>